<commit_message>
all pages done — dashboard, upload, anomalies with mock data
</commit_message>
<xml_diff>
--- a/documents/The Complete Step-by-Step Implementation logic.docx
+++ b/documents/The Complete Step-by-Step Implementation logic.docx
@@ -130,7 +130,21 @@
         <w:rPr>
           <w:rFonts w:ascii="Aptos" w:hAnsi="Aptos"/>
         </w:rPr>
-        <w:t xml:space="preserve"> — Each file is one screen of your app. Right now they're empty shells, but this is the correct structure. We'll fill them one by one.</w:t>
+        <w:t xml:space="preserve"> — Each file is one screen of your app. Right </w:t>
+      </w:r>
+      <w:proofErr w:type="gramStart"/>
+      <w:r>
+        <w:rPr>
+          <w:rFonts w:ascii="Aptos" w:hAnsi="Aptos"/>
+        </w:rPr>
+        <w:t>now</w:t>
+      </w:r>
+      <w:proofErr w:type="gramEnd"/>
+      <w:r>
+        <w:rPr>
+          <w:rFonts w:ascii="Aptos" w:hAnsi="Aptos"/>
+        </w:rPr>
+        <w:t xml:space="preserve"> they're empty shells, but this is the correct structure. We'll fill them one by one.</w:t>
       </w:r>
     </w:p>
     <w:p>
@@ -167,6 +181,7 @@
         <w:t xml:space="preserve">See how "Anomalies" is highlighted in bright blue? That's the active route detection working — </w:t>
       </w:r>
       <w:proofErr w:type="spellStart"/>
+      <w:proofErr w:type="gramStart"/>
       <w:r>
         <w:rPr>
           <w:rFonts w:ascii="Aptos" w:hAnsi="Aptos"/>
@@ -178,7 +193,14 @@
         <w:rPr>
           <w:rFonts w:ascii="Aptos" w:hAnsi="Aptos"/>
         </w:rPr>
-        <w:t>() checks the current URL and highlights the matching nav item automatically. Click Dashboard and Upload CSV — watch the highlight move!</w:t>
+        <w:t>(</w:t>
+      </w:r>
+      <w:proofErr w:type="gramEnd"/>
+      <w:r>
+        <w:rPr>
+          <w:rFonts w:ascii="Aptos" w:hAnsi="Aptos"/>
+        </w:rPr>
+        <w:t>) checks the current URL and highlights the matching nav item automatically. Click Dashboard and Upload CSV — watch the highlight move!</w:t>
       </w:r>
     </w:p>
     <w:p>
@@ -272,6 +294,7 @@
         </w:rPr>
       </w:pPr>
       <w:proofErr w:type="spellStart"/>
+      <w:proofErr w:type="gramStart"/>
       <w:r>
         <w:rPr>
           <w:rFonts w:ascii="Aptos" w:hAnsi="Aptos"/>
@@ -283,8 +306,51 @@
         <w:rPr>
           <w:rFonts w:ascii="Aptos" w:hAnsi="Aptos"/>
         </w:rPr>
-        <w:t>() — gives you the current URL path. So if you're on /upload, it returns { pathname: '/upload' }</w:t>
-      </w:r>
+        <w:t>(</w:t>
+      </w:r>
+      <w:proofErr w:type="gramEnd"/>
+      <w:r>
+        <w:rPr>
+          <w:rFonts w:ascii="Aptos" w:hAnsi="Aptos"/>
+        </w:rPr>
+        <w:t xml:space="preserve">) — gives you the current URL path. </w:t>
+      </w:r>
+      <w:proofErr w:type="gramStart"/>
+      <w:r>
+        <w:rPr>
+          <w:rFonts w:ascii="Aptos" w:hAnsi="Aptos"/>
+        </w:rPr>
+        <w:t>So</w:t>
+      </w:r>
+      <w:proofErr w:type="gramEnd"/>
+      <w:r>
+        <w:rPr>
+          <w:rFonts w:ascii="Aptos" w:hAnsi="Aptos"/>
+        </w:rPr>
+        <w:t xml:space="preserve"> if you're on /upload, it returns </w:t>
+      </w:r>
+      <w:proofErr w:type="gramStart"/>
+      <w:r>
+        <w:rPr>
+          <w:rFonts w:ascii="Aptos" w:hAnsi="Aptos"/>
+        </w:rPr>
+        <w:t>{ pathname</w:t>
+      </w:r>
+      <w:proofErr w:type="gramEnd"/>
+      <w:r>
+        <w:rPr>
+          <w:rFonts w:ascii="Aptos" w:hAnsi="Aptos"/>
+        </w:rPr>
+        <w:t>: '/upload</w:t>
+      </w:r>
+      <w:proofErr w:type="gramStart"/>
+      <w:r>
+        <w:rPr>
+          <w:rFonts w:ascii="Aptos" w:hAnsi="Aptos"/>
+        </w:rPr>
+        <w:t>' }</w:t>
+      </w:r>
+      <w:proofErr w:type="gramEnd"/>
     </w:p>
     <w:p>
       <w:pPr>
@@ -317,7 +383,49 @@
         <w:rPr>
           <w:rFonts w:ascii="Aptos" w:hAnsi="Aptos"/>
         </w:rPr>
-        <w:t>The ternary ? 'bg-blue-600' : 'hover:bg-blue-800' — if current path matches this item's path, show bright blue. Otherwise show dim</w:t>
+        <w:t xml:space="preserve">The </w:t>
+      </w:r>
+      <w:proofErr w:type="gramStart"/>
+      <w:r>
+        <w:rPr>
+          <w:rFonts w:ascii="Aptos" w:hAnsi="Aptos"/>
+        </w:rPr>
+        <w:t>ternary ?</w:t>
+      </w:r>
+      <w:proofErr w:type="gramEnd"/>
+      <w:r>
+        <w:rPr>
+          <w:rFonts w:ascii="Aptos" w:hAnsi="Aptos"/>
+        </w:rPr>
+        <w:t xml:space="preserve"> '</w:t>
+      </w:r>
+      <w:proofErr w:type="gramStart"/>
+      <w:r>
+        <w:rPr>
+          <w:rFonts w:ascii="Aptos" w:hAnsi="Aptos"/>
+        </w:rPr>
+        <w:t>bg</w:t>
+      </w:r>
+      <w:proofErr w:type="gramEnd"/>
+      <w:r>
+        <w:rPr>
+          <w:rFonts w:ascii="Aptos" w:hAnsi="Aptos"/>
+        </w:rPr>
+        <w:t>-blue-600</w:t>
+      </w:r>
+      <w:proofErr w:type="gramStart"/>
+      <w:r>
+        <w:rPr>
+          <w:rFonts w:ascii="Aptos" w:hAnsi="Aptos"/>
+        </w:rPr>
+        <w:t>' :</w:t>
+      </w:r>
+      <w:proofErr w:type="gramEnd"/>
+      <w:r>
+        <w:rPr>
+          <w:rFonts w:ascii="Aptos" w:hAnsi="Aptos"/>
+        </w:rPr>
+        <w:t xml:space="preserve"> 'hover:bg-blue-800' — if current path matches this item's path, show bright blue. Otherwise show dim</w:t>
       </w:r>
     </w:p>
     <w:p>
@@ -425,12 +533,656 @@
       </w:r>
     </w:p>
     <w:p>
-      <w:pPr>
-        <w:rPr>
-          <w:rFonts w:ascii="Aptos" w:hAnsi="Aptos"/>
-        </w:rPr>
-      </w:pPr>
-    </w:p>
+      <w:r>
+        <w:rPr>
+          <w:rFonts w:ascii="Aptos" w:hAnsi="Aptos"/>
+        </w:rPr>
+        <w:lastRenderedPageBreak/>
+        <w:drawing>
+          <wp:inline distT="0" distB="0" distL="0" distR="0" wp14:anchorId="40E6506D" wp14:editId="231952D1">
+            <wp:extent cx="5731510" cy="2807335"/>
+            <wp:effectExtent l="0" t="0" r="2540" b="0"/>
+            <wp:docPr id="1926105882" name="Picture 1"/>
+            <wp:cNvGraphicFramePr>
+              <a:graphicFrameLocks xmlns:a="http://schemas.openxmlformats.org/drawingml/2006/main" noChangeAspect="1"/>
+            </wp:cNvGraphicFramePr>
+            <a:graphic xmlns:a="http://schemas.openxmlformats.org/drawingml/2006/main">
+              <a:graphicData uri="http://schemas.openxmlformats.org/drawingml/2006/picture">
+                <pic:pic xmlns:pic="http://schemas.openxmlformats.org/drawingml/2006/picture">
+                  <pic:nvPicPr>
+                    <pic:cNvPr id="1926105882" name=""/>
+                    <pic:cNvPicPr/>
+                  </pic:nvPicPr>
+                  <pic:blipFill>
+                    <a:blip r:embed="rId5"/>
+                    <a:stretch>
+                      <a:fillRect/>
+                    </a:stretch>
+                  </pic:blipFill>
+                  <pic:spPr>
+                    <a:xfrm>
+                      <a:off x="0" y="0"/>
+                      <a:ext cx="5731510" cy="2807335"/>
+                    </a:xfrm>
+                    <a:prstGeom prst="rect">
+                      <a:avLst/>
+                    </a:prstGeom>
+                  </pic:spPr>
+                </pic:pic>
+              </a:graphicData>
+            </a:graphic>
+          </wp:inline>
+        </w:drawing>
+      </w:r>
+    </w:p>
+    <w:p>
+      <w:r>
+        <w:t xml:space="preserve">BRO THIS LOOKS AMAZING! </w:t>
+      </w:r>
+      <w:r>
+        <w:rPr>
+          <w:rFonts w:ascii="Segoe UI Emoji" w:hAnsi="Segoe UI Emoji" w:cs="Segoe UI Emoji"/>
+        </w:rPr>
+        <w:t>🔥🔥🔥</w:t>
+      </w:r>
+    </w:p>
+    <w:p>
+      <w:r>
+        <w:t>That looks like a real professional app already — stats cards, color-coded anomaly badges, proper table with alternating rows. And this is just mock data!</w:t>
+      </w:r>
+    </w:p>
+    <w:p>
+      <w:r>
+        <w:pict w14:anchorId="6F1730A0">
+          <v:rect id="_x0000_i1039" style="width:0;height:0" o:hralign="center" o:hrstd="t" o:hr="t" fillcolor="#a0a0a0" stroked="f"/>
+        </w:pict>
+      </w:r>
+    </w:p>
+    <w:p>
+      <w:r>
+        <w:rPr>
+          <w:b/>
+          <w:bCs/>
+        </w:rPr>
+        <w:t>What just happened — explained:</w:t>
+      </w:r>
+    </w:p>
+    <w:p>
+      <w:proofErr w:type="spellStart"/>
+      <w:r>
+        <w:rPr>
+          <w:b/>
+          <w:bCs/>
+        </w:rPr>
+        <w:t>useState</w:t>
+      </w:r>
+      <w:proofErr w:type="spellEnd"/>
+      <w:r>
+        <w:rPr>
+          <w:b/>
+          <w:bCs/>
+        </w:rPr>
+        <w:t>(</w:t>
+      </w:r>
+      <w:proofErr w:type="spellStart"/>
+      <w:r>
+        <w:rPr>
+          <w:b/>
+          <w:bCs/>
+        </w:rPr>
+        <w:t>mockReadings</w:t>
+      </w:r>
+      <w:proofErr w:type="spellEnd"/>
+      <w:r>
+        <w:rPr>
+          <w:b/>
+          <w:bCs/>
+        </w:rPr>
+        <w:t>)</w:t>
+      </w:r>
+      <w:r>
+        <w:t xml:space="preserve"> — stores the readings array in </w:t>
+      </w:r>
+      <w:proofErr w:type="spellStart"/>
+      <w:r>
+        <w:t>React's</w:t>
+      </w:r>
+      <w:proofErr w:type="spellEnd"/>
+      <w:r>
+        <w:t xml:space="preserve"> memory. When we later replace mock data with real API data, we only change one line here.</w:t>
+      </w:r>
+    </w:p>
+    <w:p>
+      <w:proofErr w:type="gramStart"/>
+      <w:r>
+        <w:rPr>
+          <w:b/>
+          <w:bCs/>
+        </w:rPr>
+        <w:t>.filter</w:t>
+      </w:r>
+      <w:proofErr w:type="gramEnd"/>
+      <w:r>
+        <w:rPr>
+          <w:b/>
+          <w:bCs/>
+        </w:rPr>
+        <w:t xml:space="preserve">(r =&gt; </w:t>
+      </w:r>
+      <w:proofErr w:type="spellStart"/>
+      <w:proofErr w:type="gramStart"/>
+      <w:r>
+        <w:rPr>
+          <w:b/>
+          <w:bCs/>
+        </w:rPr>
+        <w:t>r.status</w:t>
+      </w:r>
+      <w:proofErr w:type="spellEnd"/>
+      <w:proofErr w:type="gramEnd"/>
+      <w:r>
+        <w:rPr>
+          <w:b/>
+          <w:bCs/>
+        </w:rPr>
+        <w:t xml:space="preserve"> === 'ANOMALY'</w:t>
+      </w:r>
+      <w:proofErr w:type="gramStart"/>
+      <w:r>
+        <w:rPr>
+          <w:b/>
+          <w:bCs/>
+        </w:rPr>
+        <w:t>).length</w:t>
+      </w:r>
+      <w:proofErr w:type="gramEnd"/>
+      <w:r>
+        <w:t> — filters the array to only anomaly rows, then counts them. That's how the "2" in the red card is calculated automatically.</w:t>
+      </w:r>
+    </w:p>
+    <w:p>
+      <w:proofErr w:type="spellStart"/>
+      <w:r>
+        <w:rPr>
+          <w:b/>
+          <w:bCs/>
+        </w:rPr>
+        <w:t>readings.map</w:t>
+      </w:r>
+      <w:proofErr w:type="spellEnd"/>
+      <w:r>
+        <w:rPr>
+          <w:b/>
+          <w:bCs/>
+        </w:rPr>
+        <w:t>(...)</w:t>
+      </w:r>
+      <w:r>
+        <w:t xml:space="preserve"> — loops through every reading and returns a &lt;tr&gt; row for each one. This is how </w:t>
+      </w:r>
+      <w:proofErr w:type="gramStart"/>
+      <w:r>
+        <w:t>React</w:t>
+      </w:r>
+      <w:proofErr w:type="gramEnd"/>
+      <w:r>
+        <w:t xml:space="preserve"> renders lists — no manual DOM manipulation needed.</w:t>
+      </w:r>
+    </w:p>
+    <w:p>
+      <w:r>
+        <w:rPr>
+          <w:b/>
+          <w:bCs/>
+        </w:rPr>
+        <w:t>The ternary on status badge</w:t>
+      </w:r>
+      <w:r>
+        <w:t> — ANOMALY gets red background, NORMAL gets green. One line of logic, applied to every row automatically.</w:t>
+      </w:r>
+    </w:p>
+    <w:p>
+      <w:r>
+        <w:rPr>
+          <w:b/>
+          <w:bCs/>
+        </w:rPr>
+        <w:t>index % 2 === 0</w:t>
+      </w:r>
+      <w:r>
+        <w:t xml:space="preserve"> — alternating row </w:t>
+      </w:r>
+      <w:proofErr w:type="spellStart"/>
+      <w:r>
+        <w:t>colors</w:t>
+      </w:r>
+      <w:proofErr w:type="spellEnd"/>
+      <w:r>
+        <w:t xml:space="preserve">. Even rows white, odd rows light </w:t>
+      </w:r>
+      <w:proofErr w:type="spellStart"/>
+      <w:r>
+        <w:t>gray</w:t>
+      </w:r>
+      <w:proofErr w:type="spellEnd"/>
+      <w:r>
+        <w:t>.</w:t>
+      </w:r>
+    </w:p>
+    <w:p>
+      <w:r>
+        <w:lastRenderedPageBreak/>
+        <w:drawing>
+          <wp:inline distT="0" distB="0" distL="0" distR="0" wp14:anchorId="0F37497A" wp14:editId="6B53C592">
+            <wp:extent cx="5731510" cy="2794635"/>
+            <wp:effectExtent l="0" t="0" r="2540" b="5715"/>
+            <wp:docPr id="1246983903" name="Picture 1"/>
+            <wp:cNvGraphicFramePr>
+              <a:graphicFrameLocks xmlns:a="http://schemas.openxmlformats.org/drawingml/2006/main" noChangeAspect="1"/>
+            </wp:cNvGraphicFramePr>
+            <a:graphic xmlns:a="http://schemas.openxmlformats.org/drawingml/2006/main">
+              <a:graphicData uri="http://schemas.openxmlformats.org/drawingml/2006/picture">
+                <pic:pic xmlns:pic="http://schemas.openxmlformats.org/drawingml/2006/picture">
+                  <pic:nvPicPr>
+                    <pic:cNvPr id="1246983903" name=""/>
+                    <pic:cNvPicPr/>
+                  </pic:nvPicPr>
+                  <pic:blipFill>
+                    <a:blip r:embed="rId6"/>
+                    <a:stretch>
+                      <a:fillRect/>
+                    </a:stretch>
+                  </pic:blipFill>
+                  <pic:spPr>
+                    <a:xfrm>
+                      <a:off x="0" y="0"/>
+                      <a:ext cx="5731510" cy="2794635"/>
+                    </a:xfrm>
+                    <a:prstGeom prst="rect">
+                      <a:avLst/>
+                    </a:prstGeom>
+                  </pic:spPr>
+                </pic:pic>
+              </a:graphicData>
+            </a:graphic>
+          </wp:inline>
+        </w:drawing>
+      </w:r>
+    </w:p>
+    <w:p>
+      <w:r>
+        <w:t xml:space="preserve">BRO! </w:t>
+      </w:r>
+      <w:r>
+        <w:rPr>
+          <w:rFonts w:ascii="Segoe UI Emoji" w:hAnsi="Segoe UI Emoji" w:cs="Segoe UI Emoji"/>
+        </w:rPr>
+        <w:t>🔥🔥🔥</w:t>
+      </w:r>
+    </w:p>
+    <w:p>
+      <w:r>
+        <w:t>That looks like a REAL water quality monitoring app! Stats cards + live chart + data table all in one dashboard. This is genuinely impressive for where you are right now.</w:t>
+      </w:r>
+    </w:p>
+    <w:p>
+      <w:r>
+        <w:pict w14:anchorId="5D8ACA42">
+          <v:rect id="_x0000_i1047" style="width:0;height:1.5pt" o:hralign="center" o:hrstd="t" o:hr="t" fillcolor="#a0a0a0" stroked="f"/>
+        </w:pict>
+      </w:r>
+    </w:p>
+    <w:p>
+      <w:r>
+        <w:rPr>
+          <w:b/>
+          <w:bCs/>
+        </w:rPr>
+        <w:t>What just happened — explained:</w:t>
+      </w:r>
+    </w:p>
+    <w:p>
+      <w:proofErr w:type="spellStart"/>
+      <w:r>
+        <w:rPr>
+          <w:b/>
+          <w:bCs/>
+        </w:rPr>
+        <w:t>ResponsiveContainer</w:t>
+      </w:r>
+      <w:proofErr w:type="spellEnd"/>
+      <w:r>
+        <w:t xml:space="preserve"> — makes the chart fill 100% of its parent width automatically. Without this, charts have a fixed pixel width.</w:t>
+      </w:r>
+    </w:p>
+    <w:p>
+      <w:proofErr w:type="spellStart"/>
+      <w:r>
+        <w:rPr>
+          <w:b/>
+          <w:bCs/>
+        </w:rPr>
+        <w:t>LineChart</w:t>
+      </w:r>
+      <w:proofErr w:type="spellEnd"/>
+      <w:r>
+        <w:rPr>
+          <w:b/>
+          <w:bCs/>
+        </w:rPr>
+        <w:t xml:space="preserve"> data={readings}</w:t>
+      </w:r>
+      <w:r>
+        <w:t xml:space="preserve"> — you just pass your array directly. Recharts loops through it automatically.</w:t>
+      </w:r>
+    </w:p>
+    <w:p>
+      <w:proofErr w:type="spellStart"/>
+      <w:r>
+        <w:rPr>
+          <w:b/>
+          <w:bCs/>
+        </w:rPr>
+        <w:t>XAxis</w:t>
+      </w:r>
+      <w:proofErr w:type="spellEnd"/>
+      <w:r>
+        <w:rPr>
+          <w:b/>
+          <w:bCs/>
+        </w:rPr>
+        <w:t xml:space="preserve"> </w:t>
+      </w:r>
+      <w:proofErr w:type="spellStart"/>
+      <w:r>
+        <w:rPr>
+          <w:b/>
+          <w:bCs/>
+        </w:rPr>
+        <w:t>dataKey</w:t>
+      </w:r>
+      <w:proofErr w:type="spellEnd"/>
+      <w:r>
+        <w:rPr>
+          <w:b/>
+          <w:bCs/>
+        </w:rPr>
+        <w:t>="timestamp"</w:t>
+      </w:r>
+      <w:r>
+        <w:t xml:space="preserve"> — tells Recharts to use the timestamp field from each object as the X axis labels.</w:t>
+      </w:r>
+    </w:p>
+    <w:p>
+      <w:proofErr w:type="spellStart"/>
+      <w:r>
+        <w:rPr>
+          <w:b/>
+          <w:bCs/>
+        </w:rPr>
+        <w:t>YAxis</w:t>
+      </w:r>
+      <w:proofErr w:type="spellEnd"/>
+      <w:r>
+        <w:rPr>
+          <w:b/>
+          <w:bCs/>
+        </w:rPr>
+        <w:t xml:space="preserve"> domain</w:t>
+      </w:r>
+      <w:proofErr w:type="gramStart"/>
+      <w:r>
+        <w:rPr>
+          <w:b/>
+          <w:bCs/>
+        </w:rPr>
+        <w:t>={</w:t>
+      </w:r>
+      <w:proofErr w:type="gramEnd"/>
+      <w:r>
+        <w:rPr>
+          <w:b/>
+          <w:bCs/>
+        </w:rPr>
+        <w:t>[0, 14]}</w:t>
+      </w:r>
+      <w:r>
+        <w:t xml:space="preserve"> — pH scale is 0–14, so we fix the Y axis to that range.</w:t>
+      </w:r>
+    </w:p>
+    <w:p>
+      <w:r>
+        <w:rPr>
+          <w:b/>
+          <w:bCs/>
+        </w:rPr>
+        <w:t xml:space="preserve">Line </w:t>
+      </w:r>
+      <w:proofErr w:type="spellStart"/>
+      <w:r>
+        <w:rPr>
+          <w:b/>
+          <w:bCs/>
+        </w:rPr>
+        <w:t>dataKey</w:t>
+      </w:r>
+      <w:proofErr w:type="spellEnd"/>
+      <w:r>
+        <w:rPr>
+          <w:b/>
+          <w:bCs/>
+        </w:rPr>
+        <w:t>="</w:t>
+      </w:r>
+      <w:proofErr w:type="spellStart"/>
+      <w:r>
+        <w:rPr>
+          <w:b/>
+          <w:bCs/>
+        </w:rPr>
+        <w:t>ph</w:t>
+      </w:r>
+      <w:proofErr w:type="spellEnd"/>
+      <w:r>
+        <w:rPr>
+          <w:b/>
+          <w:bCs/>
+        </w:rPr>
+        <w:t>"</w:t>
+      </w:r>
+      <w:r>
+        <w:t xml:space="preserve"> — draws the line using the </w:t>
+      </w:r>
+      <w:proofErr w:type="spellStart"/>
+      <w:r>
+        <w:t>ph</w:t>
+      </w:r>
+      <w:proofErr w:type="spellEnd"/>
+      <w:r>
+        <w:t xml:space="preserve"> value from each reading object.</w:t>
+      </w:r>
+    </w:p>
+    <w:p>
+      <w:r>
+        <w:lastRenderedPageBreak/>
+        <w:drawing>
+          <wp:inline distT="0" distB="0" distL="0" distR="0" wp14:anchorId="20C65973" wp14:editId="5187E368">
+            <wp:extent cx="5731510" cy="2765425"/>
+            <wp:effectExtent l="0" t="0" r="2540" b="0"/>
+            <wp:docPr id="1294426208" name="Picture 1"/>
+            <wp:cNvGraphicFramePr>
+              <a:graphicFrameLocks xmlns:a="http://schemas.openxmlformats.org/drawingml/2006/main" noChangeAspect="1"/>
+            </wp:cNvGraphicFramePr>
+            <a:graphic xmlns:a="http://schemas.openxmlformats.org/drawingml/2006/main">
+              <a:graphicData uri="http://schemas.openxmlformats.org/drawingml/2006/picture">
+                <pic:pic xmlns:pic="http://schemas.openxmlformats.org/drawingml/2006/picture">
+                  <pic:nvPicPr>
+                    <pic:cNvPr id="1294426208" name=""/>
+                    <pic:cNvPicPr/>
+                  </pic:nvPicPr>
+                  <pic:blipFill>
+                    <a:blip r:embed="rId7"/>
+                    <a:stretch>
+                      <a:fillRect/>
+                    </a:stretch>
+                  </pic:blipFill>
+                  <pic:spPr>
+                    <a:xfrm>
+                      <a:off x="0" y="0"/>
+                      <a:ext cx="5731510" cy="2765425"/>
+                    </a:xfrm>
+                    <a:prstGeom prst="rect">
+                      <a:avLst/>
+                    </a:prstGeom>
+                  </pic:spPr>
+                </pic:pic>
+              </a:graphicData>
+            </a:graphic>
+          </wp:inline>
+        </w:drawing>
+      </w:r>
+    </w:p>
+    <w:p>
+      <w:r>
+        <w:t xml:space="preserve">Perfect! </w:t>
+      </w:r>
+      <w:r>
+        <w:rPr>
+          <w:rFonts w:ascii="Segoe UI Emoji" w:hAnsi="Segoe UI Emoji" w:cs="Segoe UI Emoji"/>
+        </w:rPr>
+        <w:t>✅</w:t>
+      </w:r>
+    </w:p>
+    <w:p>
+      <w:r>
+        <w:rPr>
+          <w:b/>
+          <w:bCs/>
+        </w:rPr>
+        <w:t>What just happened — explained:</w:t>
+      </w:r>
+    </w:p>
+    <w:p>
+      <w:proofErr w:type="spellStart"/>
+      <w:r>
+        <w:rPr>
+          <w:b/>
+          <w:bCs/>
+        </w:rPr>
+        <w:t>useState</w:t>
+      </w:r>
+      <w:proofErr w:type="spellEnd"/>
+      <w:r>
+        <w:rPr>
+          <w:b/>
+          <w:bCs/>
+        </w:rPr>
+        <w:t>(null)</w:t>
+      </w:r>
+      <w:r>
+        <w:t xml:space="preserve"> for file — starts as null (no file selected). When user picks a file, </w:t>
+      </w:r>
+      <w:proofErr w:type="spellStart"/>
+      <w:r>
+        <w:t>setFile</w:t>
+      </w:r>
+      <w:proofErr w:type="spellEnd"/>
+      <w:r>
+        <w:t>(</w:t>
+      </w:r>
+      <w:proofErr w:type="spellStart"/>
+      <w:proofErr w:type="gramStart"/>
+      <w:r>
+        <w:t>e.target</w:t>
+      </w:r>
+      <w:proofErr w:type="gramEnd"/>
+      <w:r>
+        <w:t>.</w:t>
+      </w:r>
+      <w:proofErr w:type="gramStart"/>
+      <w:r>
+        <w:t>files</w:t>
+      </w:r>
+      <w:proofErr w:type="spellEnd"/>
+      <w:r>
+        <w:t>[</w:t>
+      </w:r>
+      <w:proofErr w:type="gramEnd"/>
+      <w:r>
+        <w:t>0]) stores it.</w:t>
+      </w:r>
+    </w:p>
+    <w:p>
+      <w:r>
+        <w:rPr>
+          <w:b/>
+          <w:bCs/>
+        </w:rPr>
+        <w:t>input type="file" hidden + label trick</w:t>
+      </w:r>
+      <w:r>
+        <w:t xml:space="preserve"> — the actual file input is hidden (</w:t>
+      </w:r>
+      <w:proofErr w:type="spellStart"/>
+      <w:r>
+        <w:t>className</w:t>
+      </w:r>
+      <w:proofErr w:type="spellEnd"/>
+      <w:r>
+        <w:t xml:space="preserve">="hidden"). The visible dashed box is just a &lt;label&gt; pointing to it via </w:t>
+      </w:r>
+      <w:proofErr w:type="spellStart"/>
+      <w:r>
+        <w:t>htmlFor</w:t>
+      </w:r>
+      <w:proofErr w:type="spellEnd"/>
+      <w:r>
+        <w:t>="</w:t>
+      </w:r>
+      <w:proofErr w:type="spellStart"/>
+      <w:r>
+        <w:t>csvInput</w:t>
+      </w:r>
+      <w:proofErr w:type="spellEnd"/>
+      <w:r>
+        <w:t>". Clicking the label triggers the hidden input. This is how every custom file upload UI works.</w:t>
+      </w:r>
+    </w:p>
+    <w:p>
+      <w:r>
+        <w:rPr>
+          <w:b/>
+          <w:bCs/>
+        </w:rPr>
+        <w:t xml:space="preserve">{file &amp;&amp; </w:t>
+      </w:r>
+      <w:proofErr w:type="gramStart"/>
+      <w:r>
+        <w:rPr>
+          <w:b/>
+          <w:bCs/>
+        </w:rPr>
+        <w:t>(...) }</w:t>
+      </w:r>
+      <w:proofErr w:type="gramEnd"/>
+      <w:r>
+        <w:t xml:space="preserve"> — only shows the filename box when a file is actually selected. If file is null, nothing renders.</w:t>
+      </w:r>
+    </w:p>
+    <w:p>
+      <w:r>
+        <w:rPr>
+          <w:b/>
+          <w:bCs/>
+        </w:rPr>
+        <w:t>status state</w:t>
+      </w:r>
+      <w:r>
+        <w:t xml:space="preserve"> — starts as empty string. Button sets it to 'success' or 'error'. The JSX checks the value and shows the right message.</w:t>
+      </w:r>
+    </w:p>
+    <w:p/>
+    <w:p/>
     <w:p/>
     <w:sectPr>
       <w:pgSz w:w="11906" w:h="16838"/>

</xml_diff>

<commit_message>
login page — form validation + mock auth + redirect
</commit_message>
<xml_diff>
--- a/documents/The Complete Step-by-Step Implementation logic.docx
+++ b/documents/The Complete Step-by-Step Implementation logic.docx
@@ -1181,6 +1181,375 @@
         <w:t xml:space="preserve"> — starts as empty string. Button sets it to 'success' or 'error'. The JSX checks the value and shows the right message.</w:t>
       </w:r>
     </w:p>
+    <w:p>
+      <w:r>
+        <w:lastRenderedPageBreak/>
+        <w:drawing>
+          <wp:inline distT="0" distB="0" distL="0" distR="0" wp14:anchorId="0BE737AB" wp14:editId="28CB3E71">
+            <wp:extent cx="5731510" cy="2786380"/>
+            <wp:effectExtent l="0" t="0" r="2540" b="0"/>
+            <wp:docPr id="1384534220" name="Picture 1"/>
+            <wp:cNvGraphicFramePr>
+              <a:graphicFrameLocks xmlns:a="http://schemas.openxmlformats.org/drawingml/2006/main" noChangeAspect="1"/>
+            </wp:cNvGraphicFramePr>
+            <a:graphic xmlns:a="http://schemas.openxmlformats.org/drawingml/2006/main">
+              <a:graphicData uri="http://schemas.openxmlformats.org/drawingml/2006/picture">
+                <pic:pic xmlns:pic="http://schemas.openxmlformats.org/drawingml/2006/picture">
+                  <pic:nvPicPr>
+                    <pic:cNvPr id="1384534220" name=""/>
+                    <pic:cNvPicPr/>
+                  </pic:nvPicPr>
+                  <pic:blipFill>
+                    <a:blip r:embed="rId8"/>
+                    <a:stretch>
+                      <a:fillRect/>
+                    </a:stretch>
+                  </pic:blipFill>
+                  <pic:spPr>
+                    <a:xfrm>
+                      <a:off x="0" y="0"/>
+                      <a:ext cx="5731510" cy="2786380"/>
+                    </a:xfrm>
+                    <a:prstGeom prst="rect">
+                      <a:avLst/>
+                    </a:prstGeom>
+                  </pic:spPr>
+                </pic:pic>
+              </a:graphicData>
+            </a:graphic>
+          </wp:inline>
+        </w:drawing>
+      </w:r>
+    </w:p>
+    <w:p>
+      <w:r>
+        <w:rPr>
+          <w:b/>
+          <w:bCs/>
+        </w:rPr>
+        <w:t>Here's what you've built today in Step 02:</w:t>
+      </w:r>
+      <w:r>
+        <w:t xml:space="preserve"> </w:t>
+      </w:r>
+      <w:r>
+        <w:rPr>
+          <w:rFonts w:ascii="Segoe UI Emoji" w:hAnsi="Segoe UI Emoji" w:cs="Segoe UI Emoji"/>
+        </w:rPr>
+        <w:t>✅</w:t>
+      </w:r>
+    </w:p>
+    <w:tbl>
+      <w:tblPr>
+        <w:tblW w:w="0" w:type="auto"/>
+        <w:tblCellSpacing w:w="15" w:type="dxa"/>
+        <w:tblCellMar>
+          <w:top w:w="15" w:type="dxa"/>
+          <w:left w:w="15" w:type="dxa"/>
+          <w:bottom w:w="15" w:type="dxa"/>
+          <w:right w:w="15" w:type="dxa"/>
+        </w:tblCellMar>
+        <w:tblLook w:val="04A0" w:firstRow="1" w:lastRow="0" w:firstColumn="1" w:lastColumn="0" w:noHBand="0" w:noVBand="1"/>
+      </w:tblPr>
+      <w:tblGrid>
+        <w:gridCol w:w="4268"/>
+        <w:gridCol w:w="694"/>
+      </w:tblGrid>
+      <w:tr>
+        <w:trPr>
+          <w:tblHeader/>
+          <w:tblCellSpacing w:w="15" w:type="dxa"/>
+        </w:trPr>
+        <w:tc>
+          <w:tcPr>
+            <w:tcW w:w="0" w:type="auto"/>
+            <w:vAlign w:val="center"/>
+            <w:hideMark/>
+          </w:tcPr>
+          <w:p>
+            <w:pPr>
+              <w:rPr>
+                <w:b/>
+                <w:bCs/>
+              </w:rPr>
+            </w:pPr>
+            <w:r>
+              <w:rPr>
+                <w:b/>
+                <w:bCs/>
+              </w:rPr>
+              <w:t>Feature</w:t>
+            </w:r>
+          </w:p>
+        </w:tc>
+        <w:tc>
+          <w:tcPr>
+            <w:tcW w:w="0" w:type="auto"/>
+            <w:vAlign w:val="center"/>
+            <w:hideMark/>
+          </w:tcPr>
+          <w:p>
+            <w:pPr>
+              <w:rPr>
+                <w:b/>
+                <w:bCs/>
+              </w:rPr>
+            </w:pPr>
+            <w:r>
+              <w:rPr>
+                <w:b/>
+                <w:bCs/>
+              </w:rPr>
+              <w:t>Status</w:t>
+            </w:r>
+          </w:p>
+        </w:tc>
+      </w:tr>
+      <w:tr>
+        <w:trPr>
+          <w:tblCellSpacing w:w="15" w:type="dxa"/>
+        </w:trPr>
+        <w:tc>
+          <w:tcPr>
+            <w:tcW w:w="0" w:type="auto"/>
+            <w:vAlign w:val="center"/>
+            <w:hideMark/>
+          </w:tcPr>
+          <w:p>
+            <w:r>
+              <w:t>React + Vite + Tailwind setup</w:t>
+            </w:r>
+          </w:p>
+        </w:tc>
+        <w:tc>
+          <w:tcPr>
+            <w:tcW w:w="0" w:type="auto"/>
+            <w:vAlign w:val="center"/>
+            <w:hideMark/>
+          </w:tcPr>
+          <w:p>
+            <w:r>
+              <w:rPr>
+                <w:rFonts w:ascii="Segoe UI Emoji" w:hAnsi="Segoe UI Emoji" w:cs="Segoe UI Emoji"/>
+              </w:rPr>
+              <w:t>✅</w:t>
+            </w:r>
+          </w:p>
+        </w:tc>
+      </w:tr>
+      <w:tr>
+        <w:trPr>
+          <w:tblCellSpacing w:w="15" w:type="dxa"/>
+        </w:trPr>
+        <w:tc>
+          <w:tcPr>
+            <w:tcW w:w="0" w:type="auto"/>
+            <w:vAlign w:val="center"/>
+            <w:hideMark/>
+          </w:tcPr>
+          <w:p>
+            <w:r>
+              <w:t>React Router — 4 pages</w:t>
+            </w:r>
+          </w:p>
+        </w:tc>
+        <w:tc>
+          <w:tcPr>
+            <w:tcW w:w="0" w:type="auto"/>
+            <w:vAlign w:val="center"/>
+            <w:hideMark/>
+          </w:tcPr>
+          <w:p>
+            <w:r>
+              <w:rPr>
+                <w:rFonts w:ascii="Segoe UI Emoji" w:hAnsi="Segoe UI Emoji" w:cs="Segoe UI Emoji"/>
+              </w:rPr>
+              <w:t>✅</w:t>
+            </w:r>
+          </w:p>
+        </w:tc>
+      </w:tr>
+      <w:tr>
+        <w:trPr>
+          <w:tblCellSpacing w:w="15" w:type="dxa"/>
+        </w:trPr>
+        <w:tc>
+          <w:tcPr>
+            <w:tcW w:w="0" w:type="auto"/>
+            <w:vAlign w:val="center"/>
+            <w:hideMark/>
+          </w:tcPr>
+          <w:p>
+            <w:r>
+              <w:t>Sidebar with active route highlighting</w:t>
+            </w:r>
+          </w:p>
+        </w:tc>
+        <w:tc>
+          <w:tcPr>
+            <w:tcW w:w="0" w:type="auto"/>
+            <w:vAlign w:val="center"/>
+            <w:hideMark/>
+          </w:tcPr>
+          <w:p>
+            <w:r>
+              <w:rPr>
+                <w:rFonts w:ascii="Segoe UI Emoji" w:hAnsi="Segoe UI Emoji" w:cs="Segoe UI Emoji"/>
+              </w:rPr>
+              <w:t>✅</w:t>
+            </w:r>
+          </w:p>
+        </w:tc>
+      </w:tr>
+      <w:tr>
+        <w:trPr>
+          <w:tblCellSpacing w:w="15" w:type="dxa"/>
+        </w:trPr>
+        <w:tc>
+          <w:tcPr>
+            <w:tcW w:w="0" w:type="auto"/>
+            <w:vAlign w:val="center"/>
+            <w:hideMark/>
+          </w:tcPr>
+          <w:p>
+            <w:r>
+              <w:t>Dashboard — stats cards + pH chart + table</w:t>
+            </w:r>
+          </w:p>
+        </w:tc>
+        <w:tc>
+          <w:tcPr>
+            <w:tcW w:w="0" w:type="auto"/>
+            <w:vAlign w:val="center"/>
+            <w:hideMark/>
+          </w:tcPr>
+          <w:p>
+            <w:r>
+              <w:rPr>
+                <w:rFonts w:ascii="Segoe UI Emoji" w:hAnsi="Segoe UI Emoji" w:cs="Segoe UI Emoji"/>
+              </w:rPr>
+              <w:t>✅</w:t>
+            </w:r>
+          </w:p>
+        </w:tc>
+      </w:tr>
+      <w:tr>
+        <w:trPr>
+          <w:tblCellSpacing w:w="15" w:type="dxa"/>
+        </w:trPr>
+        <w:tc>
+          <w:tcPr>
+            <w:tcW w:w="0" w:type="auto"/>
+            <w:vAlign w:val="center"/>
+            <w:hideMark/>
+          </w:tcPr>
+          <w:p>
+            <w:r>
+              <w:t>Upload CSV page — file picker + validation</w:t>
+            </w:r>
+          </w:p>
+        </w:tc>
+        <w:tc>
+          <w:tcPr>
+            <w:tcW w:w="0" w:type="auto"/>
+            <w:vAlign w:val="center"/>
+            <w:hideMark/>
+          </w:tcPr>
+          <w:p>
+            <w:r>
+              <w:rPr>
+                <w:rFonts w:ascii="Segoe UI Emoji" w:hAnsi="Segoe UI Emoji" w:cs="Segoe UI Emoji"/>
+              </w:rPr>
+              <w:t>✅</w:t>
+            </w:r>
+          </w:p>
+        </w:tc>
+      </w:tr>
+      <w:tr>
+        <w:trPr>
+          <w:tblCellSpacing w:w="15" w:type="dxa"/>
+        </w:trPr>
+        <w:tc>
+          <w:tcPr>
+            <w:tcW w:w="0" w:type="auto"/>
+            <w:vAlign w:val="center"/>
+            <w:hideMark/>
+          </w:tcPr>
+          <w:p>
+            <w:r>
+              <w:t>Anomalies page — color-coded risk cards</w:t>
+            </w:r>
+          </w:p>
+        </w:tc>
+        <w:tc>
+          <w:tcPr>
+            <w:tcW w:w="0" w:type="auto"/>
+            <w:vAlign w:val="center"/>
+            <w:hideMark/>
+          </w:tcPr>
+          <w:p>
+            <w:r>
+              <w:rPr>
+                <w:rFonts w:ascii="Segoe UI Emoji" w:hAnsi="Segoe UI Emoji" w:cs="Segoe UI Emoji"/>
+              </w:rPr>
+              <w:t>✅</w:t>
+            </w:r>
+          </w:p>
+        </w:tc>
+      </w:tr>
+    </w:tbl>
+    <w:p>
+      <w:r>
+        <w:pict w14:anchorId="00972766">
+          <v:rect id="_x0000_i1055" style="width:0;height:1.5pt" o:hralign="center" o:hrstd="t" o:hr="t" fillcolor="#a0a0a0" stroked="f"/>
+        </w:pict>
+      </w:r>
+    </w:p>
+    <w:p>
+      <w:r>
+        <w:rPr>
+          <w:b/>
+          <w:bCs/>
+        </w:rPr>
+        <w:t>Where we are in the roadmap:</w:t>
+      </w:r>
+    </w:p>
+    <w:p>
+      <w:pPr>
+        <w:numPr>
+          <w:ilvl w:val="0"/>
+          <w:numId w:val="3"/>
+        </w:numPr>
+      </w:pPr>
+      <w:r>
+        <w:rPr>
+          <w:rFonts w:ascii="Segoe UI Emoji" w:hAnsi="Segoe UI Emoji" w:cs="Segoe UI Emoji"/>
+        </w:rPr>
+        <w:t>✅</w:t>
+      </w:r>
+      <w:r>
+        <w:t xml:space="preserve"> Step 01 — HTML/CSS/JS concepts (applied through React)</w:t>
+      </w:r>
+    </w:p>
+    <w:p>
+      <w:pPr>
+        <w:numPr>
+          <w:ilvl w:val="0"/>
+          <w:numId w:val="3"/>
+        </w:numPr>
+      </w:pPr>
+      <w:r>
+        <w:rPr>
+          <w:rFonts w:ascii="Segoe UI Emoji" w:hAnsi="Segoe UI Emoji" w:cs="Segoe UI Emoji"/>
+        </w:rPr>
+        <w:t>🔄</w:t>
+      </w:r>
+      <w:r>
+        <w:t xml:space="preserve"> Step 02 — React frontend (70% done — Login page remaining, then we connect to real API in Step 04)</w:t>
+      </w:r>
+    </w:p>
+    <w:p/>
+    <w:p/>
     <w:p/>
     <w:p/>
     <w:p/>
@@ -1494,11 +1863,163 @@
       </w:rPr>
     </w:lvl>
   </w:abstractNum>
+  <w:abstractNum w:abstractNumId="2" w15:restartNumberingAfterBreak="0">
+    <w:nsid w:val="4E0B3438"/>
+    <w:multiLevelType w:val="multilevel"/>
+    <w:tmpl w:val="04E2C06E"/>
+    <w:lvl w:ilvl="0">
+      <w:start w:val="1"/>
+      <w:numFmt w:val="bullet"/>
+      <w:lvlText w:val=""/>
+      <w:lvlJc w:val="left"/>
+      <w:pPr>
+        <w:tabs>
+          <w:tab w:val="num" w:pos="720"/>
+        </w:tabs>
+        <w:ind w:left="720" w:hanging="360"/>
+      </w:pPr>
+      <w:rPr>
+        <w:rFonts w:ascii="Symbol" w:hAnsi="Symbol" w:hint="default"/>
+        <w:sz w:val="20"/>
+      </w:rPr>
+    </w:lvl>
+    <w:lvl w:ilvl="1" w:tentative="1">
+      <w:start w:val="1"/>
+      <w:numFmt w:val="bullet"/>
+      <w:lvlText w:val="o"/>
+      <w:lvlJc w:val="left"/>
+      <w:pPr>
+        <w:tabs>
+          <w:tab w:val="num" w:pos="1440"/>
+        </w:tabs>
+        <w:ind w:left="1440" w:hanging="360"/>
+      </w:pPr>
+      <w:rPr>
+        <w:rFonts w:ascii="Courier New" w:hAnsi="Courier New" w:hint="default"/>
+        <w:sz w:val="20"/>
+      </w:rPr>
+    </w:lvl>
+    <w:lvl w:ilvl="2" w:tentative="1">
+      <w:start w:val="1"/>
+      <w:numFmt w:val="bullet"/>
+      <w:lvlText w:val=""/>
+      <w:lvlJc w:val="left"/>
+      <w:pPr>
+        <w:tabs>
+          <w:tab w:val="num" w:pos="2160"/>
+        </w:tabs>
+        <w:ind w:left="2160" w:hanging="360"/>
+      </w:pPr>
+      <w:rPr>
+        <w:rFonts w:ascii="Wingdings" w:hAnsi="Wingdings" w:hint="default"/>
+        <w:sz w:val="20"/>
+      </w:rPr>
+    </w:lvl>
+    <w:lvl w:ilvl="3" w:tentative="1">
+      <w:start w:val="1"/>
+      <w:numFmt w:val="bullet"/>
+      <w:lvlText w:val=""/>
+      <w:lvlJc w:val="left"/>
+      <w:pPr>
+        <w:tabs>
+          <w:tab w:val="num" w:pos="2880"/>
+        </w:tabs>
+        <w:ind w:left="2880" w:hanging="360"/>
+      </w:pPr>
+      <w:rPr>
+        <w:rFonts w:ascii="Wingdings" w:hAnsi="Wingdings" w:hint="default"/>
+        <w:sz w:val="20"/>
+      </w:rPr>
+    </w:lvl>
+    <w:lvl w:ilvl="4" w:tentative="1">
+      <w:start w:val="1"/>
+      <w:numFmt w:val="bullet"/>
+      <w:lvlText w:val=""/>
+      <w:lvlJc w:val="left"/>
+      <w:pPr>
+        <w:tabs>
+          <w:tab w:val="num" w:pos="3600"/>
+        </w:tabs>
+        <w:ind w:left="3600" w:hanging="360"/>
+      </w:pPr>
+      <w:rPr>
+        <w:rFonts w:ascii="Wingdings" w:hAnsi="Wingdings" w:hint="default"/>
+        <w:sz w:val="20"/>
+      </w:rPr>
+    </w:lvl>
+    <w:lvl w:ilvl="5" w:tentative="1">
+      <w:start w:val="1"/>
+      <w:numFmt w:val="bullet"/>
+      <w:lvlText w:val=""/>
+      <w:lvlJc w:val="left"/>
+      <w:pPr>
+        <w:tabs>
+          <w:tab w:val="num" w:pos="4320"/>
+        </w:tabs>
+        <w:ind w:left="4320" w:hanging="360"/>
+      </w:pPr>
+      <w:rPr>
+        <w:rFonts w:ascii="Wingdings" w:hAnsi="Wingdings" w:hint="default"/>
+        <w:sz w:val="20"/>
+      </w:rPr>
+    </w:lvl>
+    <w:lvl w:ilvl="6" w:tentative="1">
+      <w:start w:val="1"/>
+      <w:numFmt w:val="bullet"/>
+      <w:lvlText w:val=""/>
+      <w:lvlJc w:val="left"/>
+      <w:pPr>
+        <w:tabs>
+          <w:tab w:val="num" w:pos="5040"/>
+        </w:tabs>
+        <w:ind w:left="5040" w:hanging="360"/>
+      </w:pPr>
+      <w:rPr>
+        <w:rFonts w:ascii="Wingdings" w:hAnsi="Wingdings" w:hint="default"/>
+        <w:sz w:val="20"/>
+      </w:rPr>
+    </w:lvl>
+    <w:lvl w:ilvl="7" w:tentative="1">
+      <w:start w:val="1"/>
+      <w:numFmt w:val="bullet"/>
+      <w:lvlText w:val=""/>
+      <w:lvlJc w:val="left"/>
+      <w:pPr>
+        <w:tabs>
+          <w:tab w:val="num" w:pos="5760"/>
+        </w:tabs>
+        <w:ind w:left="5760" w:hanging="360"/>
+      </w:pPr>
+      <w:rPr>
+        <w:rFonts w:ascii="Wingdings" w:hAnsi="Wingdings" w:hint="default"/>
+        <w:sz w:val="20"/>
+      </w:rPr>
+    </w:lvl>
+    <w:lvl w:ilvl="8" w:tentative="1">
+      <w:start w:val="1"/>
+      <w:numFmt w:val="bullet"/>
+      <w:lvlText w:val=""/>
+      <w:lvlJc w:val="left"/>
+      <w:pPr>
+        <w:tabs>
+          <w:tab w:val="num" w:pos="6480"/>
+        </w:tabs>
+        <w:ind w:left="6480" w:hanging="360"/>
+      </w:pPr>
+      <w:rPr>
+        <w:rFonts w:ascii="Wingdings" w:hAnsi="Wingdings" w:hint="default"/>
+        <w:sz w:val="20"/>
+      </w:rPr>
+    </w:lvl>
+  </w:abstractNum>
   <w:num w:numId="1" w16cid:durableId="431248552">
     <w:abstractNumId w:val="1"/>
   </w:num>
   <w:num w:numId="2" w16cid:durableId="1486580539">
     <w:abstractNumId w:val="0"/>
+  </w:num>
+  <w:num w:numId="3" w16cid:durableId="1608192328">
+    <w:abstractNumId w:val="2"/>
   </w:num>
 </w:numbering>
 </file>

</xml_diff>

<commit_message>
feat: upgrade to V2 teal UI with edge-to-edge layout
</commit_message>
<xml_diff>
--- a/documents/The Complete Step-by-Step Implementation logic.docx
+++ b/documents/The Complete Step-by-Step Implementation logic.docx
@@ -314,8 +314,44 @@
         <w:rPr>
           <w:rFonts w:ascii="Aptos" w:hAnsi="Aptos"/>
         </w:rPr>
-        <w:t>) — gives you the current URL path. So if you're on /upload, it returns { pathname: '/upload' }</w:t>
-      </w:r>
+        <w:t xml:space="preserve">) — gives you the current URL path. </w:t>
+      </w:r>
+      <w:proofErr w:type="gramStart"/>
+      <w:r>
+        <w:rPr>
+          <w:rFonts w:ascii="Aptos" w:hAnsi="Aptos"/>
+        </w:rPr>
+        <w:t>So</w:t>
+      </w:r>
+      <w:proofErr w:type="gramEnd"/>
+      <w:r>
+        <w:rPr>
+          <w:rFonts w:ascii="Aptos" w:hAnsi="Aptos"/>
+        </w:rPr>
+        <w:t xml:space="preserve"> if you're on /upload, it returns </w:t>
+      </w:r>
+      <w:proofErr w:type="gramStart"/>
+      <w:r>
+        <w:rPr>
+          <w:rFonts w:ascii="Aptos" w:hAnsi="Aptos"/>
+        </w:rPr>
+        <w:t>{ pathname</w:t>
+      </w:r>
+      <w:proofErr w:type="gramEnd"/>
+      <w:r>
+        <w:rPr>
+          <w:rFonts w:ascii="Aptos" w:hAnsi="Aptos"/>
+        </w:rPr>
+        <w:t>: '/upload</w:t>
+      </w:r>
+      <w:proofErr w:type="gramStart"/>
+      <w:r>
+        <w:rPr>
+          <w:rFonts w:ascii="Aptos" w:hAnsi="Aptos"/>
+        </w:rPr>
+        <w:t>' }</w:t>
+      </w:r>
+      <w:proofErr w:type="gramEnd"/>
     </w:p>
     <w:p>
       <w:pPr>
@@ -348,7 +384,49 @@
         <w:rPr>
           <w:rFonts w:ascii="Aptos" w:hAnsi="Aptos"/>
         </w:rPr>
-        <w:t>The ternary ? 'bg-blue-600' : 'hover:bg-blue-800' — if current path matches this item's path, show bright blue. Otherwise show dim</w:t>
+        <w:t xml:space="preserve">The </w:t>
+      </w:r>
+      <w:proofErr w:type="gramStart"/>
+      <w:r>
+        <w:rPr>
+          <w:rFonts w:ascii="Aptos" w:hAnsi="Aptos"/>
+        </w:rPr>
+        <w:t>ternary ?</w:t>
+      </w:r>
+      <w:proofErr w:type="gramEnd"/>
+      <w:r>
+        <w:rPr>
+          <w:rFonts w:ascii="Aptos" w:hAnsi="Aptos"/>
+        </w:rPr>
+        <w:t xml:space="preserve"> '</w:t>
+      </w:r>
+      <w:proofErr w:type="gramStart"/>
+      <w:r>
+        <w:rPr>
+          <w:rFonts w:ascii="Aptos" w:hAnsi="Aptos"/>
+        </w:rPr>
+        <w:t>bg</w:t>
+      </w:r>
+      <w:proofErr w:type="gramEnd"/>
+      <w:r>
+        <w:rPr>
+          <w:rFonts w:ascii="Aptos" w:hAnsi="Aptos"/>
+        </w:rPr>
+        <w:t>-blue-600</w:t>
+      </w:r>
+      <w:proofErr w:type="gramStart"/>
+      <w:r>
+        <w:rPr>
+          <w:rFonts w:ascii="Aptos" w:hAnsi="Aptos"/>
+        </w:rPr>
+        <w:t>' :</w:t>
+      </w:r>
+      <w:proofErr w:type="gramEnd"/>
+      <w:r>
+        <w:rPr>
+          <w:rFonts w:ascii="Aptos" w:hAnsi="Aptos"/>
+        </w:rPr>
+        <w:t xml:space="preserve"> 'hover:bg-blue-800' — if current path matches this item's path, show bright blue. Otherwise show dim</w:t>
       </w:r>
     </w:p>
     <w:p>
@@ -6927,6 +7005,691 @@
         <w:pStyle w:val="NormalWeb"/>
         <w:rPr>
           <w:rFonts w:ascii="Aptos" w:hAnsi="Aptos"/>
+          <w:b/>
+          <w:bCs/>
+        </w:rPr>
+      </w:pPr>
+      <w:r>
+        <w:rPr>
+          <w:rFonts w:ascii="Aptos" w:hAnsi="Aptos"/>
+          <w:b/>
+          <w:bCs/>
+        </w:rPr>
+        <w:lastRenderedPageBreak/>
+        <w:t>1. The Architecture: "The Three-Way Handshake"</w:t>
+      </w:r>
+    </w:p>
+    <w:p>
+      <w:pPr>
+        <w:pStyle w:val="NormalWeb"/>
+        <w:rPr>
+          <w:rFonts w:ascii="Aptos" w:hAnsi="Aptos"/>
+        </w:rPr>
+      </w:pPr>
+      <w:r>
+        <w:rPr>
+          <w:rFonts w:ascii="Aptos" w:hAnsi="Aptos"/>
+        </w:rPr>
+        <w:t xml:space="preserve">Most beginner apps are just Frontend + Backend. Yours is a </w:t>
+      </w:r>
+      <w:r>
+        <w:rPr>
+          <w:rFonts w:ascii="Aptos" w:hAnsi="Aptos"/>
+          <w:b/>
+          <w:bCs/>
+        </w:rPr>
+        <w:t>Microservice System</w:t>
+      </w:r>
+      <w:r>
+        <w:rPr>
+          <w:rFonts w:ascii="Aptos" w:hAnsi="Aptos"/>
+        </w:rPr>
+        <w:t>.</w:t>
+      </w:r>
+    </w:p>
+    <w:p>
+      <w:pPr>
+        <w:pStyle w:val="NormalWeb"/>
+        <w:numPr>
+          <w:ilvl w:val="0"/>
+          <w:numId w:val="23"/>
+        </w:numPr>
+        <w:rPr>
+          <w:rFonts w:ascii="Aptos" w:hAnsi="Aptos"/>
+        </w:rPr>
+      </w:pPr>
+      <w:r>
+        <w:rPr>
+          <w:rFonts w:ascii="Aptos" w:hAnsi="Aptos"/>
+          <w:b/>
+          <w:bCs/>
+        </w:rPr>
+        <w:t>React (The Messenger):</w:t>
+      </w:r>
+      <w:r>
+        <w:rPr>
+          <w:rFonts w:ascii="Aptos" w:hAnsi="Aptos"/>
+        </w:rPr>
+        <w:t xml:space="preserve"> Captures the raw image file from the user. It doesn't know how to </w:t>
+      </w:r>
+      <w:proofErr w:type="spellStart"/>
+      <w:r>
+        <w:rPr>
+          <w:rFonts w:ascii="Aptos" w:hAnsi="Aptos"/>
+        </w:rPr>
+        <w:t>analyze</w:t>
+      </w:r>
+      <w:proofErr w:type="spellEnd"/>
+      <w:r>
+        <w:rPr>
+          <w:rFonts w:ascii="Aptos" w:hAnsi="Aptos"/>
+        </w:rPr>
+        <w:t xml:space="preserve"> images; it just knows how to "ship" them.</w:t>
+      </w:r>
+    </w:p>
+    <w:p>
+      <w:pPr>
+        <w:pStyle w:val="NormalWeb"/>
+        <w:numPr>
+          <w:ilvl w:val="0"/>
+          <w:numId w:val="23"/>
+        </w:numPr>
+        <w:rPr>
+          <w:rFonts w:ascii="Aptos" w:hAnsi="Aptos"/>
+        </w:rPr>
+      </w:pPr>
+      <w:r>
+        <w:rPr>
+          <w:rFonts w:ascii="Aptos" w:hAnsi="Aptos"/>
+          <w:b/>
+          <w:bCs/>
+        </w:rPr>
+        <w:t>Spring Boot (The Orchestrator):</w:t>
+      </w:r>
+      <w:r>
+        <w:rPr>
+          <w:rFonts w:ascii="Aptos" w:hAnsi="Aptos"/>
+        </w:rPr>
+        <w:t xml:space="preserve"> This is the heart. It receives the image from React. Instead of trying to run AI (which Java is slow at), it acts as a </w:t>
+      </w:r>
+      <w:r>
+        <w:rPr>
+          <w:rFonts w:ascii="Aptos" w:hAnsi="Aptos"/>
+          <w:b/>
+          <w:bCs/>
+        </w:rPr>
+        <w:t>Proxy</w:t>
+      </w:r>
+      <w:r>
+        <w:rPr>
+          <w:rFonts w:ascii="Aptos" w:hAnsi="Aptos"/>
+        </w:rPr>
+        <w:t>. It "tunnels" the request over to the Python server.</w:t>
+      </w:r>
+    </w:p>
+    <w:p>
+      <w:pPr>
+        <w:pStyle w:val="NormalWeb"/>
+        <w:numPr>
+          <w:ilvl w:val="0"/>
+          <w:numId w:val="23"/>
+        </w:numPr>
+        <w:rPr>
+          <w:rFonts w:ascii="Aptos" w:hAnsi="Aptos"/>
+        </w:rPr>
+      </w:pPr>
+      <w:r>
+        <w:rPr>
+          <w:rFonts w:ascii="Aptos" w:hAnsi="Aptos"/>
+          <w:b/>
+          <w:bCs/>
+        </w:rPr>
+        <w:t>Python/Flask (The Brain):</w:t>
+      </w:r>
+      <w:r>
+        <w:rPr>
+          <w:rFonts w:ascii="Aptos" w:hAnsi="Aptos"/>
+        </w:rPr>
+        <w:t xml:space="preserve"> This is the specialist. It uses </w:t>
+      </w:r>
+      <w:proofErr w:type="spellStart"/>
+      <w:r>
+        <w:rPr>
+          <w:rFonts w:ascii="Aptos" w:hAnsi="Aptos"/>
+          <w:b/>
+          <w:bCs/>
+        </w:rPr>
+        <w:t>PyTorch</w:t>
+      </w:r>
+      <w:proofErr w:type="spellEnd"/>
+      <w:r>
+        <w:rPr>
+          <w:rFonts w:ascii="Aptos" w:hAnsi="Aptos"/>
+        </w:rPr>
+        <w:t xml:space="preserve"> and </w:t>
+      </w:r>
+      <w:r>
+        <w:rPr>
+          <w:rFonts w:ascii="Aptos" w:hAnsi="Aptos"/>
+          <w:b/>
+          <w:bCs/>
+        </w:rPr>
+        <w:t>Pillow</w:t>
+      </w:r>
+      <w:r>
+        <w:rPr>
+          <w:rFonts w:ascii="Aptos" w:hAnsi="Aptos"/>
+        </w:rPr>
+        <w:t xml:space="preserve"> to turn those raw image pixels into a mathematical tensor (a matrix of numbers). It runs those numbers through a neural network logic gate and returns a JSON diagnosis.</w:t>
+      </w:r>
+    </w:p>
+    <w:p>
+      <w:pPr>
+        <w:pStyle w:val="NormalWeb"/>
+        <w:rPr>
+          <w:rFonts w:ascii="Aptos" w:hAnsi="Aptos"/>
+          <w:b/>
+          <w:bCs/>
+        </w:rPr>
+      </w:pPr>
+      <w:r>
+        <w:rPr>
+          <w:rFonts w:ascii="Aptos" w:hAnsi="Aptos"/>
+          <w:b/>
+          <w:bCs/>
+        </w:rPr>
+        <w:t>2. The AI Pipeline (The Python Logic)</w:t>
+      </w:r>
+    </w:p>
+    <w:p>
+      <w:pPr>
+        <w:pStyle w:val="NormalWeb"/>
+        <w:rPr>
+          <w:rFonts w:ascii="Aptos" w:hAnsi="Aptos"/>
+        </w:rPr>
+      </w:pPr>
+      <w:r>
+        <w:rPr>
+          <w:rFonts w:ascii="Aptos" w:hAnsi="Aptos"/>
+        </w:rPr>
+        <w:t xml:space="preserve">Inside the ml-service, we implemented a standard </w:t>
+      </w:r>
+      <w:r>
+        <w:rPr>
+          <w:rFonts w:ascii="Aptos" w:hAnsi="Aptos"/>
+          <w:b/>
+          <w:bCs/>
+        </w:rPr>
+        <w:t>Computer Vision Pipeline</w:t>
+      </w:r>
+      <w:r>
+        <w:rPr>
+          <w:rFonts w:ascii="Aptos" w:hAnsi="Aptos"/>
+        </w:rPr>
+        <w:t>:</w:t>
+      </w:r>
+    </w:p>
+    <w:p>
+      <w:pPr>
+        <w:pStyle w:val="NormalWeb"/>
+        <w:numPr>
+          <w:ilvl w:val="0"/>
+          <w:numId w:val="24"/>
+        </w:numPr>
+        <w:rPr>
+          <w:rFonts w:ascii="Aptos" w:hAnsi="Aptos"/>
+        </w:rPr>
+      </w:pPr>
+      <w:r>
+        <w:rPr>
+          <w:rFonts w:ascii="Aptos" w:hAnsi="Aptos"/>
+          <w:b/>
+          <w:bCs/>
+        </w:rPr>
+        <w:t>Preprocessing:</w:t>
+      </w:r>
+      <w:r>
+        <w:rPr>
+          <w:rFonts w:ascii="Aptos" w:hAnsi="Aptos"/>
+        </w:rPr>
+        <w:t xml:space="preserve"> We used </w:t>
+      </w:r>
+      <w:proofErr w:type="spellStart"/>
+      <w:r>
+        <w:rPr>
+          <w:rFonts w:ascii="Aptos" w:hAnsi="Aptos"/>
+        </w:rPr>
+        <w:t>torchvision.transforms</w:t>
+      </w:r>
+      <w:proofErr w:type="spellEnd"/>
+      <w:r>
+        <w:rPr>
+          <w:rFonts w:ascii="Aptos" w:hAnsi="Aptos"/>
+        </w:rPr>
+        <w:t xml:space="preserve"> to resize the image to </w:t>
+      </w:r>
+      <w:r>
+        <w:rPr>
+          <w:rFonts w:ascii="Aptos" w:hAnsi="Aptos"/>
+          <w:b/>
+          <w:bCs/>
+        </w:rPr>
+        <w:t>224x224</w:t>
+      </w:r>
+      <w:r>
+        <w:rPr>
+          <w:rFonts w:ascii="Aptos" w:hAnsi="Aptos"/>
+        </w:rPr>
+        <w:t xml:space="preserve"> pixels and "Normalize" the </w:t>
+      </w:r>
+      <w:proofErr w:type="spellStart"/>
+      <w:r>
+        <w:rPr>
+          <w:rFonts w:ascii="Aptos" w:hAnsi="Aptos"/>
+        </w:rPr>
+        <w:t>colors</w:t>
+      </w:r>
+      <w:proofErr w:type="spellEnd"/>
+      <w:r>
+        <w:rPr>
+          <w:rFonts w:ascii="Aptos" w:hAnsi="Aptos"/>
+        </w:rPr>
+        <w:t xml:space="preserve">. This is the exact same preparation used for world-class models like </w:t>
+      </w:r>
+      <w:proofErr w:type="spellStart"/>
+      <w:r>
+        <w:rPr>
+          <w:rFonts w:ascii="Aptos" w:hAnsi="Aptos"/>
+        </w:rPr>
+        <w:t>ResNet</w:t>
+      </w:r>
+      <w:proofErr w:type="spellEnd"/>
+      <w:r>
+        <w:rPr>
+          <w:rFonts w:ascii="Aptos" w:hAnsi="Aptos"/>
+        </w:rPr>
+        <w:t xml:space="preserve"> or the models you'd use for sugarcane leaf disease detection.</w:t>
+      </w:r>
+    </w:p>
+    <w:p>
+      <w:pPr>
+        <w:pStyle w:val="NormalWeb"/>
+        <w:numPr>
+          <w:ilvl w:val="0"/>
+          <w:numId w:val="24"/>
+        </w:numPr>
+        <w:rPr>
+          <w:rFonts w:ascii="Aptos" w:hAnsi="Aptos"/>
+        </w:rPr>
+      </w:pPr>
+      <w:r>
+        <w:rPr>
+          <w:rFonts w:ascii="Aptos" w:hAnsi="Aptos"/>
+          <w:b/>
+          <w:bCs/>
+        </w:rPr>
+        <w:t>Inference:</w:t>
+      </w:r>
+      <w:r>
+        <w:rPr>
+          <w:rFonts w:ascii="Aptos" w:hAnsi="Aptos"/>
+        </w:rPr>
+        <w:t xml:space="preserve"> The server "infers" (guesses) the state of the water based on the pixel patterns.</w:t>
+      </w:r>
+    </w:p>
+    <w:p>
+      <w:pPr>
+        <w:pStyle w:val="NormalWeb"/>
+        <w:numPr>
+          <w:ilvl w:val="0"/>
+          <w:numId w:val="24"/>
+        </w:numPr>
+        <w:rPr>
+          <w:rFonts w:ascii="Aptos" w:hAnsi="Aptos"/>
+        </w:rPr>
+      </w:pPr>
+      <w:r>
+        <w:rPr>
+          <w:rFonts w:ascii="Aptos" w:hAnsi="Aptos"/>
+          <w:b/>
+          <w:bCs/>
+        </w:rPr>
+        <w:t>The JSON Bridge:</w:t>
+      </w:r>
+      <w:r>
+        <w:rPr>
+          <w:rFonts w:ascii="Aptos" w:hAnsi="Aptos"/>
+        </w:rPr>
+        <w:t xml:space="preserve"> Python talks back to Java using a simple JSON format:</w:t>
+      </w:r>
+    </w:p>
+    <w:p>
+      <w:pPr>
+        <w:pStyle w:val="NormalWeb"/>
+        <w:rPr>
+          <w:rFonts w:ascii="Aptos" w:hAnsi="Aptos"/>
+        </w:rPr>
+      </w:pPr>
+      <w:r>
+        <w:rPr>
+          <w:rFonts w:ascii="Aptos" w:hAnsi="Aptos"/>
+        </w:rPr>
+        <w:t>JSON</w:t>
+      </w:r>
+    </w:p>
+    <w:p>
+      <w:pPr>
+        <w:pStyle w:val="NormalWeb"/>
+        <w:rPr>
+          <w:rFonts w:ascii="Aptos" w:hAnsi="Aptos"/>
+        </w:rPr>
+      </w:pPr>
+      <w:r>
+        <w:rPr>
+          <w:rFonts w:ascii="Aptos" w:hAnsi="Aptos"/>
+        </w:rPr>
+        <w:t>{ "status": "ANOMALY", "confidence": 0.92, "message": "..." }</w:t>
+      </w:r>
+    </w:p>
+    <w:p>
+      <w:pPr>
+        <w:pStyle w:val="NormalWeb"/>
+        <w:rPr>
+          <w:rFonts w:ascii="Aptos" w:hAnsi="Aptos"/>
+          <w:b/>
+          <w:bCs/>
+        </w:rPr>
+      </w:pPr>
+      <w:r>
+        <w:rPr>
+          <w:rFonts w:ascii="Aptos" w:hAnsi="Aptos"/>
+          <w:b/>
+          <w:bCs/>
+        </w:rPr>
+        <w:t>3. Why did we do it this way? (The "Pro" Reason)</w:t>
+      </w:r>
+    </w:p>
+    <w:p>
+      <w:pPr>
+        <w:pStyle w:val="NormalWeb"/>
+        <w:rPr>
+          <w:rFonts w:ascii="Aptos" w:hAnsi="Aptos"/>
+        </w:rPr>
+      </w:pPr>
+      <w:r>
+        <w:rPr>
+          <w:rFonts w:ascii="Aptos" w:hAnsi="Aptos"/>
+        </w:rPr>
+        <w:t>In the real world, you don't want your AI and your Database on the same server.</w:t>
+      </w:r>
+    </w:p>
+    <w:p>
+      <w:pPr>
+        <w:pStyle w:val="NormalWeb"/>
+        <w:numPr>
+          <w:ilvl w:val="0"/>
+          <w:numId w:val="25"/>
+        </w:numPr>
+        <w:rPr>
+          <w:rFonts w:ascii="Aptos" w:hAnsi="Aptos"/>
+        </w:rPr>
+      </w:pPr>
+      <w:r>
+        <w:rPr>
+          <w:rFonts w:ascii="Aptos" w:hAnsi="Aptos"/>
+          <w:b/>
+          <w:bCs/>
+        </w:rPr>
+        <w:t>Scalability:</w:t>
+      </w:r>
+      <w:r>
+        <w:rPr>
+          <w:rFonts w:ascii="Aptos" w:hAnsi="Aptos"/>
+        </w:rPr>
+        <w:t xml:space="preserve"> If 1,000 people upload images at once, you can spin up 10 Python servers to handle the math, while your 1 Java server keeps handling the database.</w:t>
+      </w:r>
+    </w:p>
+    <w:p>
+      <w:pPr>
+        <w:pStyle w:val="NormalWeb"/>
+        <w:numPr>
+          <w:ilvl w:val="0"/>
+          <w:numId w:val="25"/>
+        </w:numPr>
+        <w:rPr>
+          <w:rFonts w:ascii="Aptos" w:hAnsi="Aptos"/>
+        </w:rPr>
+      </w:pPr>
+      <w:r>
+        <w:rPr>
+          <w:rFonts w:ascii="Aptos" w:hAnsi="Aptos"/>
+          <w:b/>
+          <w:bCs/>
+        </w:rPr>
+        <w:t>Language Synergy:</w:t>
+      </w:r>
+      <w:r>
+        <w:rPr>
+          <w:rFonts w:ascii="Aptos" w:hAnsi="Aptos"/>
+        </w:rPr>
+        <w:t xml:space="preserve"> You’re using </w:t>
+      </w:r>
+      <w:r>
+        <w:rPr>
+          <w:rFonts w:ascii="Aptos" w:hAnsi="Aptos"/>
+          <w:b/>
+          <w:bCs/>
+        </w:rPr>
+        <w:t>Java</w:t>
+      </w:r>
+      <w:r>
+        <w:rPr>
+          <w:rFonts w:ascii="Aptos" w:hAnsi="Aptos"/>
+        </w:rPr>
+        <w:t xml:space="preserve"> for what it’s best at (Security, Data, Enterprise stability) and </w:t>
+      </w:r>
+      <w:r>
+        <w:rPr>
+          <w:rFonts w:ascii="Aptos" w:hAnsi="Aptos"/>
+          <w:b/>
+          <w:bCs/>
+        </w:rPr>
+        <w:t>Python</w:t>
+      </w:r>
+      <w:r>
+        <w:rPr>
+          <w:rFonts w:ascii="Aptos" w:hAnsi="Aptos"/>
+        </w:rPr>
+        <w:t xml:space="preserve"> for what it’s best at (AI, Math, Fast Prototyping).</w:t>
+      </w:r>
+    </w:p>
+    <w:p>
+      <w:pPr>
+        <w:pStyle w:val="NormalWeb"/>
+        <w:rPr>
+          <w:rFonts w:ascii="Aptos" w:hAnsi="Aptos"/>
+        </w:rPr>
+      </w:pPr>
+      <w:r>
+        <w:rPr>
+          <w:rFonts w:ascii="Aptos" w:hAnsi="Aptos"/>
+        </w:rPr>
+        <w:pict w14:anchorId="1D4BBFF5">
+          <v:rect id="_x0000_i1044" style="width:0;height:1.5pt" o:hralign="center" o:hrstd="t" o:hr="t" fillcolor="#a0a0a0" stroked="f"/>
+        </w:pict>
+      </w:r>
+    </w:p>
+    <w:p>
+      <w:pPr>
+        <w:pStyle w:val="NormalWeb"/>
+        <w:rPr>
+          <w:rFonts w:ascii="Aptos" w:hAnsi="Aptos"/>
+          <w:b/>
+          <w:bCs/>
+        </w:rPr>
+      </w:pPr>
+      <w:r>
+        <w:rPr>
+          <w:rFonts w:ascii="Aptos" w:hAnsi="Aptos"/>
+          <w:b/>
+          <w:bCs/>
+        </w:rPr>
+        <w:t xml:space="preserve">Your Final Status Report </w:t>
+      </w:r>
+      <w:r>
+        <w:rPr>
+          <w:rFonts w:ascii="Segoe UI Emoji" w:hAnsi="Segoe UI Emoji" w:cs="Segoe UI Emoji"/>
+          <w:b/>
+          <w:bCs/>
+        </w:rPr>
+        <w:t>📋</w:t>
+      </w:r>
+    </w:p>
+    <w:p>
+      <w:pPr>
+        <w:pStyle w:val="NormalWeb"/>
+        <w:numPr>
+          <w:ilvl w:val="0"/>
+          <w:numId w:val="26"/>
+        </w:numPr>
+        <w:rPr>
+          <w:rFonts w:ascii="Aptos" w:hAnsi="Aptos"/>
+        </w:rPr>
+      </w:pPr>
+      <w:r>
+        <w:rPr>
+          <w:rFonts w:ascii="Aptos" w:hAnsi="Aptos"/>
+          <w:b/>
+          <w:bCs/>
+        </w:rPr>
+        <w:t>Database:</w:t>
+      </w:r>
+      <w:r>
+        <w:rPr>
+          <w:rFonts w:ascii="Aptos" w:hAnsi="Aptos"/>
+        </w:rPr>
+        <w:t xml:space="preserve"> PostgreSQL is live and storing your history.</w:t>
+      </w:r>
+    </w:p>
+    <w:p>
+      <w:pPr>
+        <w:pStyle w:val="NormalWeb"/>
+        <w:numPr>
+          <w:ilvl w:val="0"/>
+          <w:numId w:val="26"/>
+        </w:numPr>
+        <w:rPr>
+          <w:rFonts w:ascii="Aptos" w:hAnsi="Aptos"/>
+        </w:rPr>
+      </w:pPr>
+      <w:r>
+        <w:rPr>
+          <w:rFonts w:ascii="Aptos" w:hAnsi="Aptos"/>
+          <w:b/>
+          <w:bCs/>
+        </w:rPr>
+        <w:t>Backend:</w:t>
+      </w:r>
+      <w:r>
+        <w:rPr>
+          <w:rFonts w:ascii="Aptos" w:hAnsi="Aptos"/>
+        </w:rPr>
+        <w:t xml:space="preserve"> Spring Boot is acting as the secure gateway.</w:t>
+      </w:r>
+    </w:p>
+    <w:p>
+      <w:pPr>
+        <w:pStyle w:val="NormalWeb"/>
+        <w:numPr>
+          <w:ilvl w:val="0"/>
+          <w:numId w:val="26"/>
+        </w:numPr>
+        <w:rPr>
+          <w:rFonts w:ascii="Aptos" w:hAnsi="Aptos"/>
+        </w:rPr>
+      </w:pPr>
+      <w:r>
+        <w:rPr>
+          <w:rFonts w:ascii="Aptos" w:hAnsi="Aptos"/>
+          <w:b/>
+          <w:bCs/>
+        </w:rPr>
+        <w:t>AI:</w:t>
+      </w:r>
+      <w:r>
+        <w:rPr>
+          <w:rFonts w:ascii="Aptos" w:hAnsi="Aptos"/>
+        </w:rPr>
+        <w:t xml:space="preserve"> Python/</w:t>
+      </w:r>
+      <w:proofErr w:type="spellStart"/>
+      <w:r>
+        <w:rPr>
+          <w:rFonts w:ascii="Aptos" w:hAnsi="Aptos"/>
+        </w:rPr>
+        <w:t>PyTorch</w:t>
+      </w:r>
+      <w:proofErr w:type="spellEnd"/>
+      <w:r>
+        <w:rPr>
+          <w:rFonts w:ascii="Aptos" w:hAnsi="Aptos"/>
+        </w:rPr>
+        <w:t xml:space="preserve"> is </w:t>
+      </w:r>
+      <w:proofErr w:type="spellStart"/>
+      <w:r>
+        <w:rPr>
+          <w:rFonts w:ascii="Aptos" w:hAnsi="Aptos"/>
+        </w:rPr>
+        <w:t>analyzing</w:t>
+      </w:r>
+      <w:proofErr w:type="spellEnd"/>
+      <w:r>
+        <w:rPr>
+          <w:rFonts w:ascii="Aptos" w:hAnsi="Aptos"/>
+        </w:rPr>
+        <w:t xml:space="preserve"> "visual samples."</w:t>
+      </w:r>
+    </w:p>
+    <w:p>
+      <w:pPr>
+        <w:pStyle w:val="NormalWeb"/>
+        <w:numPr>
+          <w:ilvl w:val="0"/>
+          <w:numId w:val="26"/>
+        </w:numPr>
+        <w:rPr>
+          <w:rFonts w:ascii="Aptos" w:hAnsi="Aptos"/>
+        </w:rPr>
+      </w:pPr>
+      <w:r>
+        <w:rPr>
+          <w:rFonts w:ascii="Aptos" w:hAnsi="Aptos"/>
+          <w:b/>
+          <w:bCs/>
+        </w:rPr>
+        <w:t>Frontend:</w:t>
+      </w:r>
+      <w:r>
+        <w:rPr>
+          <w:rFonts w:ascii="Aptos" w:hAnsi="Aptos"/>
+        </w:rPr>
+        <w:t xml:space="preserve"> React is giving you a high-end dashboard.</w:t>
+      </w:r>
+    </w:p>
+    <w:p>
+      <w:pPr>
+        <w:pStyle w:val="NormalWeb"/>
+        <w:rPr>
+          <w:rFonts w:ascii="Aptos" w:hAnsi="Aptos"/>
+        </w:rPr>
+      </w:pPr>
+    </w:p>
+    <w:p>
+      <w:pPr>
+        <w:pStyle w:val="NormalWeb"/>
+        <w:rPr>
+          <w:rFonts w:ascii="Aptos" w:hAnsi="Aptos"/>
         </w:rPr>
       </w:pPr>
     </w:p>
@@ -7047,6 +7810,155 @@
 <file path=word/numbering.xml><?xml version="1.0" encoding="utf-8"?>
 <w:numbering xmlns:wpc="http://schemas.microsoft.com/office/word/2010/wordprocessingCanvas" xmlns:cx="http://schemas.microsoft.com/office/drawing/2014/chartex" xmlns:cx1="http://schemas.microsoft.com/office/drawing/2015/9/8/chartex" xmlns:cx2="http://schemas.microsoft.com/office/drawing/2015/10/21/chartex" xmlns:cx3="http://schemas.microsoft.com/office/drawing/2016/5/9/chartex" xmlns:cx4="http://schemas.microsoft.com/office/drawing/2016/5/10/chartex" xmlns:cx5="http://schemas.microsoft.com/office/drawing/2016/5/11/chartex" xmlns:cx6="http://schemas.microsoft.com/office/drawing/2016/5/12/chartex" xmlns:cx7="http://schemas.microsoft.com/office/drawing/2016/5/13/chartex" xmlns:cx8="http://schemas.microsoft.com/office/drawing/2016/5/14/chartex" xmlns:mc="http://schemas.openxmlformats.org/markup-compatibility/2006" xmlns:aink="http://schemas.microsoft.com/office/drawing/2016/ink" xmlns:am3d="http://schemas.microsoft.com/office/drawing/2017/model3d" xmlns:o="urn:schemas-microsoft-com:office:office" xmlns:oel="http://schemas.microsoft.com/office/2019/extlst" xmlns:r="http://schemas.openxmlformats.org/officeDocument/2006/relationships" xmlns:m="http://schemas.openxmlformats.org/officeDocument/2006/math" xmlns:v="urn:schemas-microsoft-com:vml" xmlns:wp14="http://schemas.microsoft.com/office/word/2010/wordprocessingDrawing" xmlns:wp="http://schemas.openxmlformats.org/drawingml/2006/wordprocessingDrawing" xmlns:w10="urn:schemas-microsoft-com:office:word" xmlns:w="http://schemas.openxmlformats.org/wordprocessingml/2006/main" xmlns:w14="http://schemas.microsoft.com/office/word/2010/wordml" xmlns:w15="http://schemas.microsoft.com/office/word/2012/wordml" xmlns:w16cex="http://schemas.microsoft.com/office/word/2018/wordml/cex" xmlns:w16cid="http://schemas.microsoft.com/office/word/2016/wordml/cid" xmlns:w16="http://schemas.microsoft.com/office/word/2018/wordml" xmlns:w16du="http://schemas.microsoft.com/office/word/2023/wordml/word16du" xmlns:w16sdtdh="http://schemas.microsoft.com/office/word/2020/wordml/sdtdatahash" xmlns:w16sdtfl="http://schemas.microsoft.com/office/word/2024/wordml/sdtformatlock" xmlns:w16se="http://schemas.microsoft.com/office/word/2015/wordml/symex" xmlns:wpg="http://schemas.microsoft.com/office/word/2010/wordprocessingGroup" xmlns:wpi="http://schemas.microsoft.com/office/word/2010/wordprocessingInk" xmlns:wne="http://schemas.microsoft.com/office/word/2006/wordml" xmlns:wps="http://schemas.microsoft.com/office/word/2010/wordprocessingShape" mc:Ignorable="w14 w15 w16se w16cid w16 w16cex w16sdtdh w16sdtfl w16du wp14">
   <w:abstractNum w:abstractNumId="0" w15:restartNumberingAfterBreak="0">
+    <w:nsid w:val="004E5775"/>
+    <w:multiLevelType w:val="multilevel"/>
+    <w:tmpl w:val="F10E5CFE"/>
+    <w:lvl w:ilvl="0">
+      <w:start w:val="1"/>
+      <w:numFmt w:val="bullet"/>
+      <w:lvlText w:val=""/>
+      <w:lvlJc w:val="left"/>
+      <w:pPr>
+        <w:tabs>
+          <w:tab w:val="num" w:pos="720"/>
+        </w:tabs>
+        <w:ind w:left="720" w:hanging="360"/>
+      </w:pPr>
+      <w:rPr>
+        <w:rFonts w:ascii="Symbol" w:hAnsi="Symbol" w:hint="default"/>
+        <w:sz w:val="20"/>
+      </w:rPr>
+    </w:lvl>
+    <w:lvl w:ilvl="1" w:tentative="1">
+      <w:start w:val="1"/>
+      <w:numFmt w:val="bullet"/>
+      <w:lvlText w:val="o"/>
+      <w:lvlJc w:val="left"/>
+      <w:pPr>
+        <w:tabs>
+          <w:tab w:val="num" w:pos="1440"/>
+        </w:tabs>
+        <w:ind w:left="1440" w:hanging="360"/>
+      </w:pPr>
+      <w:rPr>
+        <w:rFonts w:ascii="Courier New" w:hAnsi="Courier New" w:hint="default"/>
+        <w:sz w:val="20"/>
+      </w:rPr>
+    </w:lvl>
+    <w:lvl w:ilvl="2" w:tentative="1">
+      <w:start w:val="1"/>
+      <w:numFmt w:val="bullet"/>
+      <w:lvlText w:val=""/>
+      <w:lvlJc w:val="left"/>
+      <w:pPr>
+        <w:tabs>
+          <w:tab w:val="num" w:pos="2160"/>
+        </w:tabs>
+        <w:ind w:left="2160" w:hanging="360"/>
+      </w:pPr>
+      <w:rPr>
+        <w:rFonts w:ascii="Wingdings" w:hAnsi="Wingdings" w:hint="default"/>
+        <w:sz w:val="20"/>
+      </w:rPr>
+    </w:lvl>
+    <w:lvl w:ilvl="3" w:tentative="1">
+      <w:start w:val="1"/>
+      <w:numFmt w:val="bullet"/>
+      <w:lvlText w:val=""/>
+      <w:lvlJc w:val="left"/>
+      <w:pPr>
+        <w:tabs>
+          <w:tab w:val="num" w:pos="2880"/>
+        </w:tabs>
+        <w:ind w:left="2880" w:hanging="360"/>
+      </w:pPr>
+      <w:rPr>
+        <w:rFonts w:ascii="Wingdings" w:hAnsi="Wingdings" w:hint="default"/>
+        <w:sz w:val="20"/>
+      </w:rPr>
+    </w:lvl>
+    <w:lvl w:ilvl="4" w:tentative="1">
+      <w:start w:val="1"/>
+      <w:numFmt w:val="bullet"/>
+      <w:lvlText w:val=""/>
+      <w:lvlJc w:val="left"/>
+      <w:pPr>
+        <w:tabs>
+          <w:tab w:val="num" w:pos="3600"/>
+        </w:tabs>
+        <w:ind w:left="3600" w:hanging="360"/>
+      </w:pPr>
+      <w:rPr>
+        <w:rFonts w:ascii="Wingdings" w:hAnsi="Wingdings" w:hint="default"/>
+        <w:sz w:val="20"/>
+      </w:rPr>
+    </w:lvl>
+    <w:lvl w:ilvl="5" w:tentative="1">
+      <w:start w:val="1"/>
+      <w:numFmt w:val="bullet"/>
+      <w:lvlText w:val=""/>
+      <w:lvlJc w:val="left"/>
+      <w:pPr>
+        <w:tabs>
+          <w:tab w:val="num" w:pos="4320"/>
+        </w:tabs>
+        <w:ind w:left="4320" w:hanging="360"/>
+      </w:pPr>
+      <w:rPr>
+        <w:rFonts w:ascii="Wingdings" w:hAnsi="Wingdings" w:hint="default"/>
+        <w:sz w:val="20"/>
+      </w:rPr>
+    </w:lvl>
+    <w:lvl w:ilvl="6" w:tentative="1">
+      <w:start w:val="1"/>
+      <w:numFmt w:val="bullet"/>
+      <w:lvlText w:val=""/>
+      <w:lvlJc w:val="left"/>
+      <w:pPr>
+        <w:tabs>
+          <w:tab w:val="num" w:pos="5040"/>
+        </w:tabs>
+        <w:ind w:left="5040" w:hanging="360"/>
+      </w:pPr>
+      <w:rPr>
+        <w:rFonts w:ascii="Wingdings" w:hAnsi="Wingdings" w:hint="default"/>
+        <w:sz w:val="20"/>
+      </w:rPr>
+    </w:lvl>
+    <w:lvl w:ilvl="7" w:tentative="1">
+      <w:start w:val="1"/>
+      <w:numFmt w:val="bullet"/>
+      <w:lvlText w:val=""/>
+      <w:lvlJc w:val="left"/>
+      <w:pPr>
+        <w:tabs>
+          <w:tab w:val="num" w:pos="5760"/>
+        </w:tabs>
+        <w:ind w:left="5760" w:hanging="360"/>
+      </w:pPr>
+      <w:rPr>
+        <w:rFonts w:ascii="Wingdings" w:hAnsi="Wingdings" w:hint="default"/>
+        <w:sz w:val="20"/>
+      </w:rPr>
+    </w:lvl>
+    <w:lvl w:ilvl="8" w:tentative="1">
+      <w:start w:val="1"/>
+      <w:numFmt w:val="bullet"/>
+      <w:lvlText w:val=""/>
+      <w:lvlJc w:val="left"/>
+      <w:pPr>
+        <w:tabs>
+          <w:tab w:val="num" w:pos="6480"/>
+        </w:tabs>
+        <w:ind w:left="6480" w:hanging="360"/>
+      </w:pPr>
+      <w:rPr>
+        <w:rFonts w:ascii="Wingdings" w:hAnsi="Wingdings" w:hint="default"/>
+        <w:sz w:val="20"/>
+      </w:rPr>
+    </w:lvl>
+  </w:abstractNum>
+  <w:abstractNum w:abstractNumId="1" w15:restartNumberingAfterBreak="0">
     <w:nsid w:val="03ED51C3"/>
     <w:multiLevelType w:val="multilevel"/>
     <w:tmpl w:val="EB8AA6CC"/>
@@ -7195,7 +8107,7 @@
       </w:rPr>
     </w:lvl>
   </w:abstractNum>
-  <w:abstractNum w:abstractNumId="1" w15:restartNumberingAfterBreak="0">
+  <w:abstractNum w:abstractNumId="2" w15:restartNumberingAfterBreak="0">
     <w:nsid w:val="059712CC"/>
     <w:multiLevelType w:val="multilevel"/>
     <w:tmpl w:val="BF8602F2"/>
@@ -7344,7 +8256,7 @@
       </w:rPr>
     </w:lvl>
   </w:abstractNum>
-  <w:abstractNum w:abstractNumId="2" w15:restartNumberingAfterBreak="0">
+  <w:abstractNum w:abstractNumId="3" w15:restartNumberingAfterBreak="0">
     <w:nsid w:val="09A53CC7"/>
     <w:multiLevelType w:val="multilevel"/>
     <w:tmpl w:val="AB3214BC"/>
@@ -7493,7 +8405,7 @@
       </w:rPr>
     </w:lvl>
   </w:abstractNum>
-  <w:abstractNum w:abstractNumId="3" w15:restartNumberingAfterBreak="0">
+  <w:abstractNum w:abstractNumId="4" w15:restartNumberingAfterBreak="0">
     <w:nsid w:val="0AF34332"/>
     <w:multiLevelType w:val="multilevel"/>
     <w:tmpl w:val="4DF08802"/>
@@ -7642,7 +8554,7 @@
       </w:rPr>
     </w:lvl>
   </w:abstractNum>
-  <w:abstractNum w:abstractNumId="4" w15:restartNumberingAfterBreak="0">
+  <w:abstractNum w:abstractNumId="5" w15:restartNumberingAfterBreak="0">
     <w:nsid w:val="15981CB8"/>
     <w:multiLevelType w:val="multilevel"/>
     <w:tmpl w:val="0C127F82"/>
@@ -7755,7 +8667,7 @@
       </w:pPr>
     </w:lvl>
   </w:abstractNum>
-  <w:abstractNum w:abstractNumId="5" w15:restartNumberingAfterBreak="0">
+  <w:abstractNum w:abstractNumId="6" w15:restartNumberingAfterBreak="0">
     <w:nsid w:val="1A5263CF"/>
     <w:multiLevelType w:val="multilevel"/>
     <w:tmpl w:val="A1C0DFB4"/>
@@ -7872,7 +8784,7 @@
       </w:pPr>
     </w:lvl>
   </w:abstractNum>
-  <w:abstractNum w:abstractNumId="6" w15:restartNumberingAfterBreak="0">
+  <w:abstractNum w:abstractNumId="7" w15:restartNumberingAfterBreak="0">
     <w:nsid w:val="210F68C4"/>
     <w:multiLevelType w:val="multilevel"/>
     <w:tmpl w:val="F19807B8"/>
@@ -8021,7 +8933,7 @@
       </w:rPr>
     </w:lvl>
   </w:abstractNum>
-  <w:abstractNum w:abstractNumId="7" w15:restartNumberingAfterBreak="0">
+  <w:abstractNum w:abstractNumId="8" w15:restartNumberingAfterBreak="0">
     <w:nsid w:val="24371D72"/>
     <w:multiLevelType w:val="multilevel"/>
     <w:tmpl w:val="B576F314"/>
@@ -8170,7 +9082,156 @@
       </w:rPr>
     </w:lvl>
   </w:abstractNum>
-  <w:abstractNum w:abstractNumId="8" w15:restartNumberingAfterBreak="0">
+  <w:abstractNum w:abstractNumId="9" w15:restartNumberingAfterBreak="0">
+    <w:nsid w:val="263628FB"/>
+    <w:multiLevelType w:val="multilevel"/>
+    <w:tmpl w:val="B41666F8"/>
+    <w:lvl w:ilvl="0">
+      <w:start w:val="1"/>
+      <w:numFmt w:val="bullet"/>
+      <w:lvlText w:val=""/>
+      <w:lvlJc w:val="left"/>
+      <w:pPr>
+        <w:tabs>
+          <w:tab w:val="num" w:pos="720"/>
+        </w:tabs>
+        <w:ind w:left="720" w:hanging="360"/>
+      </w:pPr>
+      <w:rPr>
+        <w:rFonts w:ascii="Symbol" w:hAnsi="Symbol" w:hint="default"/>
+        <w:sz w:val="20"/>
+      </w:rPr>
+    </w:lvl>
+    <w:lvl w:ilvl="1" w:tentative="1">
+      <w:start w:val="1"/>
+      <w:numFmt w:val="bullet"/>
+      <w:lvlText w:val="o"/>
+      <w:lvlJc w:val="left"/>
+      <w:pPr>
+        <w:tabs>
+          <w:tab w:val="num" w:pos="1440"/>
+        </w:tabs>
+        <w:ind w:left="1440" w:hanging="360"/>
+      </w:pPr>
+      <w:rPr>
+        <w:rFonts w:ascii="Courier New" w:hAnsi="Courier New" w:hint="default"/>
+        <w:sz w:val="20"/>
+      </w:rPr>
+    </w:lvl>
+    <w:lvl w:ilvl="2" w:tentative="1">
+      <w:start w:val="1"/>
+      <w:numFmt w:val="bullet"/>
+      <w:lvlText w:val=""/>
+      <w:lvlJc w:val="left"/>
+      <w:pPr>
+        <w:tabs>
+          <w:tab w:val="num" w:pos="2160"/>
+        </w:tabs>
+        <w:ind w:left="2160" w:hanging="360"/>
+      </w:pPr>
+      <w:rPr>
+        <w:rFonts w:ascii="Wingdings" w:hAnsi="Wingdings" w:hint="default"/>
+        <w:sz w:val="20"/>
+      </w:rPr>
+    </w:lvl>
+    <w:lvl w:ilvl="3" w:tentative="1">
+      <w:start w:val="1"/>
+      <w:numFmt w:val="bullet"/>
+      <w:lvlText w:val=""/>
+      <w:lvlJc w:val="left"/>
+      <w:pPr>
+        <w:tabs>
+          <w:tab w:val="num" w:pos="2880"/>
+        </w:tabs>
+        <w:ind w:left="2880" w:hanging="360"/>
+      </w:pPr>
+      <w:rPr>
+        <w:rFonts w:ascii="Wingdings" w:hAnsi="Wingdings" w:hint="default"/>
+        <w:sz w:val="20"/>
+      </w:rPr>
+    </w:lvl>
+    <w:lvl w:ilvl="4" w:tentative="1">
+      <w:start w:val="1"/>
+      <w:numFmt w:val="bullet"/>
+      <w:lvlText w:val=""/>
+      <w:lvlJc w:val="left"/>
+      <w:pPr>
+        <w:tabs>
+          <w:tab w:val="num" w:pos="3600"/>
+        </w:tabs>
+        <w:ind w:left="3600" w:hanging="360"/>
+      </w:pPr>
+      <w:rPr>
+        <w:rFonts w:ascii="Wingdings" w:hAnsi="Wingdings" w:hint="default"/>
+        <w:sz w:val="20"/>
+      </w:rPr>
+    </w:lvl>
+    <w:lvl w:ilvl="5" w:tentative="1">
+      <w:start w:val="1"/>
+      <w:numFmt w:val="bullet"/>
+      <w:lvlText w:val=""/>
+      <w:lvlJc w:val="left"/>
+      <w:pPr>
+        <w:tabs>
+          <w:tab w:val="num" w:pos="4320"/>
+        </w:tabs>
+        <w:ind w:left="4320" w:hanging="360"/>
+      </w:pPr>
+      <w:rPr>
+        <w:rFonts w:ascii="Wingdings" w:hAnsi="Wingdings" w:hint="default"/>
+        <w:sz w:val="20"/>
+      </w:rPr>
+    </w:lvl>
+    <w:lvl w:ilvl="6" w:tentative="1">
+      <w:start w:val="1"/>
+      <w:numFmt w:val="bullet"/>
+      <w:lvlText w:val=""/>
+      <w:lvlJc w:val="left"/>
+      <w:pPr>
+        <w:tabs>
+          <w:tab w:val="num" w:pos="5040"/>
+        </w:tabs>
+        <w:ind w:left="5040" w:hanging="360"/>
+      </w:pPr>
+      <w:rPr>
+        <w:rFonts w:ascii="Wingdings" w:hAnsi="Wingdings" w:hint="default"/>
+        <w:sz w:val="20"/>
+      </w:rPr>
+    </w:lvl>
+    <w:lvl w:ilvl="7" w:tentative="1">
+      <w:start w:val="1"/>
+      <w:numFmt w:val="bullet"/>
+      <w:lvlText w:val=""/>
+      <w:lvlJc w:val="left"/>
+      <w:pPr>
+        <w:tabs>
+          <w:tab w:val="num" w:pos="5760"/>
+        </w:tabs>
+        <w:ind w:left="5760" w:hanging="360"/>
+      </w:pPr>
+      <w:rPr>
+        <w:rFonts w:ascii="Wingdings" w:hAnsi="Wingdings" w:hint="default"/>
+        <w:sz w:val="20"/>
+      </w:rPr>
+    </w:lvl>
+    <w:lvl w:ilvl="8" w:tentative="1">
+      <w:start w:val="1"/>
+      <w:numFmt w:val="bullet"/>
+      <w:lvlText w:val=""/>
+      <w:lvlJc w:val="left"/>
+      <w:pPr>
+        <w:tabs>
+          <w:tab w:val="num" w:pos="6480"/>
+        </w:tabs>
+        <w:ind w:left="6480" w:hanging="360"/>
+      </w:pPr>
+      <w:rPr>
+        <w:rFonts w:ascii="Wingdings" w:hAnsi="Wingdings" w:hint="default"/>
+        <w:sz w:val="20"/>
+      </w:rPr>
+    </w:lvl>
+  </w:abstractNum>
+  <w:abstractNum w:abstractNumId="10" w15:restartNumberingAfterBreak="0">
     <w:nsid w:val="2AAD76DD"/>
     <w:multiLevelType w:val="multilevel"/>
     <w:tmpl w:val="7C703578"/>
@@ -8319,7 +9380,7 @@
       </w:rPr>
     </w:lvl>
   </w:abstractNum>
-  <w:abstractNum w:abstractNumId="9" w15:restartNumberingAfterBreak="0">
+  <w:abstractNum w:abstractNumId="11" w15:restartNumberingAfterBreak="0">
     <w:nsid w:val="35CB7899"/>
     <w:multiLevelType w:val="multilevel"/>
     <w:tmpl w:val="CCF80158"/>
@@ -8468,7 +9529,7 @@
       </w:rPr>
     </w:lvl>
   </w:abstractNum>
-  <w:abstractNum w:abstractNumId="10" w15:restartNumberingAfterBreak="0">
+  <w:abstractNum w:abstractNumId="12" w15:restartNumberingAfterBreak="0">
     <w:nsid w:val="373525FB"/>
     <w:multiLevelType w:val="multilevel"/>
     <w:tmpl w:val="79DA3516"/>
@@ -8617,7 +9678,7 @@
       </w:rPr>
     </w:lvl>
   </w:abstractNum>
-  <w:abstractNum w:abstractNumId="11" w15:restartNumberingAfterBreak="0">
+  <w:abstractNum w:abstractNumId="13" w15:restartNumberingAfterBreak="0">
     <w:nsid w:val="3A7D0CDF"/>
     <w:multiLevelType w:val="multilevel"/>
     <w:tmpl w:val="FDB000BC"/>
@@ -8766,7 +9827,7 @@
       </w:rPr>
     </w:lvl>
   </w:abstractNum>
-  <w:abstractNum w:abstractNumId="12" w15:restartNumberingAfterBreak="0">
+  <w:abstractNum w:abstractNumId="14" w15:restartNumberingAfterBreak="0">
     <w:nsid w:val="3CC46E24"/>
     <w:multiLevelType w:val="multilevel"/>
     <w:tmpl w:val="2F8C6752"/>
@@ -8915,7 +9976,7 @@
       </w:rPr>
     </w:lvl>
   </w:abstractNum>
-  <w:abstractNum w:abstractNumId="13" w15:restartNumberingAfterBreak="0">
+  <w:abstractNum w:abstractNumId="15" w15:restartNumberingAfterBreak="0">
     <w:nsid w:val="3CCD51C5"/>
     <w:multiLevelType w:val="multilevel"/>
     <w:tmpl w:val="6AE42D34"/>
@@ -9064,7 +10125,7 @@
       </w:rPr>
     </w:lvl>
   </w:abstractNum>
-  <w:abstractNum w:abstractNumId="14" w15:restartNumberingAfterBreak="0">
+  <w:abstractNum w:abstractNumId="16" w15:restartNumberingAfterBreak="0">
     <w:nsid w:val="46631489"/>
     <w:multiLevelType w:val="multilevel"/>
     <w:tmpl w:val="F16ECABE"/>
@@ -9213,7 +10274,7 @@
       </w:rPr>
     </w:lvl>
   </w:abstractNum>
-  <w:abstractNum w:abstractNumId="15" w15:restartNumberingAfterBreak="0">
+  <w:abstractNum w:abstractNumId="17" w15:restartNumberingAfterBreak="0">
     <w:nsid w:val="467819F7"/>
     <w:multiLevelType w:val="multilevel"/>
     <w:tmpl w:val="99340086"/>
@@ -9326,7 +10387,7 @@
       </w:pPr>
     </w:lvl>
   </w:abstractNum>
-  <w:abstractNum w:abstractNumId="16" w15:restartNumberingAfterBreak="0">
+  <w:abstractNum w:abstractNumId="18" w15:restartNumberingAfterBreak="0">
     <w:nsid w:val="49950FAF"/>
     <w:multiLevelType w:val="multilevel"/>
     <w:tmpl w:val="DDEC31FE"/>
@@ -9475,7 +10536,7 @@
       </w:rPr>
     </w:lvl>
   </w:abstractNum>
-  <w:abstractNum w:abstractNumId="17" w15:restartNumberingAfterBreak="0">
+  <w:abstractNum w:abstractNumId="19" w15:restartNumberingAfterBreak="0">
     <w:nsid w:val="4AB13DA4"/>
     <w:multiLevelType w:val="multilevel"/>
     <w:tmpl w:val="0FA69454"/>
@@ -9624,7 +10685,7 @@
       </w:rPr>
     </w:lvl>
   </w:abstractNum>
-  <w:abstractNum w:abstractNumId="18" w15:restartNumberingAfterBreak="0">
+  <w:abstractNum w:abstractNumId="20" w15:restartNumberingAfterBreak="0">
     <w:nsid w:val="4E0B3438"/>
     <w:multiLevelType w:val="multilevel"/>
     <w:tmpl w:val="04E2C06E"/>
@@ -9773,7 +10834,156 @@
       </w:rPr>
     </w:lvl>
   </w:abstractNum>
-  <w:abstractNum w:abstractNumId="19" w15:restartNumberingAfterBreak="0">
+  <w:abstractNum w:abstractNumId="21" w15:restartNumberingAfterBreak="0">
+    <w:nsid w:val="58E76910"/>
+    <w:multiLevelType w:val="multilevel"/>
+    <w:tmpl w:val="96D4D970"/>
+    <w:lvl w:ilvl="0">
+      <w:start w:val="1"/>
+      <w:numFmt w:val="bullet"/>
+      <w:lvlText w:val=""/>
+      <w:lvlJc w:val="left"/>
+      <w:pPr>
+        <w:tabs>
+          <w:tab w:val="num" w:pos="720"/>
+        </w:tabs>
+        <w:ind w:left="720" w:hanging="360"/>
+      </w:pPr>
+      <w:rPr>
+        <w:rFonts w:ascii="Symbol" w:hAnsi="Symbol" w:hint="default"/>
+        <w:sz w:val="20"/>
+      </w:rPr>
+    </w:lvl>
+    <w:lvl w:ilvl="1" w:tentative="1">
+      <w:start w:val="1"/>
+      <w:numFmt w:val="bullet"/>
+      <w:lvlText w:val="o"/>
+      <w:lvlJc w:val="left"/>
+      <w:pPr>
+        <w:tabs>
+          <w:tab w:val="num" w:pos="1440"/>
+        </w:tabs>
+        <w:ind w:left="1440" w:hanging="360"/>
+      </w:pPr>
+      <w:rPr>
+        <w:rFonts w:ascii="Courier New" w:hAnsi="Courier New" w:hint="default"/>
+        <w:sz w:val="20"/>
+      </w:rPr>
+    </w:lvl>
+    <w:lvl w:ilvl="2" w:tentative="1">
+      <w:start w:val="1"/>
+      <w:numFmt w:val="bullet"/>
+      <w:lvlText w:val=""/>
+      <w:lvlJc w:val="left"/>
+      <w:pPr>
+        <w:tabs>
+          <w:tab w:val="num" w:pos="2160"/>
+        </w:tabs>
+        <w:ind w:left="2160" w:hanging="360"/>
+      </w:pPr>
+      <w:rPr>
+        <w:rFonts w:ascii="Wingdings" w:hAnsi="Wingdings" w:hint="default"/>
+        <w:sz w:val="20"/>
+      </w:rPr>
+    </w:lvl>
+    <w:lvl w:ilvl="3" w:tentative="1">
+      <w:start w:val="1"/>
+      <w:numFmt w:val="bullet"/>
+      <w:lvlText w:val=""/>
+      <w:lvlJc w:val="left"/>
+      <w:pPr>
+        <w:tabs>
+          <w:tab w:val="num" w:pos="2880"/>
+        </w:tabs>
+        <w:ind w:left="2880" w:hanging="360"/>
+      </w:pPr>
+      <w:rPr>
+        <w:rFonts w:ascii="Wingdings" w:hAnsi="Wingdings" w:hint="default"/>
+        <w:sz w:val="20"/>
+      </w:rPr>
+    </w:lvl>
+    <w:lvl w:ilvl="4" w:tentative="1">
+      <w:start w:val="1"/>
+      <w:numFmt w:val="bullet"/>
+      <w:lvlText w:val=""/>
+      <w:lvlJc w:val="left"/>
+      <w:pPr>
+        <w:tabs>
+          <w:tab w:val="num" w:pos="3600"/>
+        </w:tabs>
+        <w:ind w:left="3600" w:hanging="360"/>
+      </w:pPr>
+      <w:rPr>
+        <w:rFonts w:ascii="Wingdings" w:hAnsi="Wingdings" w:hint="default"/>
+        <w:sz w:val="20"/>
+      </w:rPr>
+    </w:lvl>
+    <w:lvl w:ilvl="5" w:tentative="1">
+      <w:start w:val="1"/>
+      <w:numFmt w:val="bullet"/>
+      <w:lvlText w:val=""/>
+      <w:lvlJc w:val="left"/>
+      <w:pPr>
+        <w:tabs>
+          <w:tab w:val="num" w:pos="4320"/>
+        </w:tabs>
+        <w:ind w:left="4320" w:hanging="360"/>
+      </w:pPr>
+      <w:rPr>
+        <w:rFonts w:ascii="Wingdings" w:hAnsi="Wingdings" w:hint="default"/>
+        <w:sz w:val="20"/>
+      </w:rPr>
+    </w:lvl>
+    <w:lvl w:ilvl="6" w:tentative="1">
+      <w:start w:val="1"/>
+      <w:numFmt w:val="bullet"/>
+      <w:lvlText w:val=""/>
+      <w:lvlJc w:val="left"/>
+      <w:pPr>
+        <w:tabs>
+          <w:tab w:val="num" w:pos="5040"/>
+        </w:tabs>
+        <w:ind w:left="5040" w:hanging="360"/>
+      </w:pPr>
+      <w:rPr>
+        <w:rFonts w:ascii="Wingdings" w:hAnsi="Wingdings" w:hint="default"/>
+        <w:sz w:val="20"/>
+      </w:rPr>
+    </w:lvl>
+    <w:lvl w:ilvl="7" w:tentative="1">
+      <w:start w:val="1"/>
+      <w:numFmt w:val="bullet"/>
+      <w:lvlText w:val=""/>
+      <w:lvlJc w:val="left"/>
+      <w:pPr>
+        <w:tabs>
+          <w:tab w:val="num" w:pos="5760"/>
+        </w:tabs>
+        <w:ind w:left="5760" w:hanging="360"/>
+      </w:pPr>
+      <w:rPr>
+        <w:rFonts w:ascii="Wingdings" w:hAnsi="Wingdings" w:hint="default"/>
+        <w:sz w:val="20"/>
+      </w:rPr>
+    </w:lvl>
+    <w:lvl w:ilvl="8" w:tentative="1">
+      <w:start w:val="1"/>
+      <w:numFmt w:val="bullet"/>
+      <w:lvlText w:val=""/>
+      <w:lvlJc w:val="left"/>
+      <w:pPr>
+        <w:tabs>
+          <w:tab w:val="num" w:pos="6480"/>
+        </w:tabs>
+        <w:ind w:left="6480" w:hanging="360"/>
+      </w:pPr>
+      <w:rPr>
+        <w:rFonts w:ascii="Wingdings" w:hAnsi="Wingdings" w:hint="default"/>
+        <w:sz w:val="20"/>
+      </w:rPr>
+    </w:lvl>
+  </w:abstractNum>
+  <w:abstractNum w:abstractNumId="22" w15:restartNumberingAfterBreak="0">
     <w:nsid w:val="65025CAA"/>
     <w:multiLevelType w:val="multilevel"/>
     <w:tmpl w:val="4964E1AA"/>
@@ -9922,7 +11132,7 @@
       </w:rPr>
     </w:lvl>
   </w:abstractNum>
-  <w:abstractNum w:abstractNumId="20" w15:restartNumberingAfterBreak="0">
+  <w:abstractNum w:abstractNumId="23" w15:restartNumberingAfterBreak="0">
     <w:nsid w:val="66841DAA"/>
     <w:multiLevelType w:val="multilevel"/>
     <w:tmpl w:val="546C3614"/>
@@ -10071,7 +11281,7 @@
       </w:rPr>
     </w:lvl>
   </w:abstractNum>
-  <w:abstractNum w:abstractNumId="21" w15:restartNumberingAfterBreak="0">
+  <w:abstractNum w:abstractNumId="24" w15:restartNumberingAfterBreak="0">
     <w:nsid w:val="6FE62A81"/>
     <w:multiLevelType w:val="multilevel"/>
     <w:tmpl w:val="B8AE6C00"/>
@@ -10184,71 +11394,232 @@
       </w:pPr>
     </w:lvl>
   </w:abstractNum>
+  <w:abstractNum w:abstractNumId="25" w15:restartNumberingAfterBreak="0">
+    <w:nsid w:val="72AA35BF"/>
+    <w:multiLevelType w:val="multilevel"/>
+    <w:tmpl w:val="5C965086"/>
+    <w:lvl w:ilvl="0">
+      <w:start w:val="1"/>
+      <w:numFmt w:val="bullet"/>
+      <w:lvlText w:val=""/>
+      <w:lvlJc w:val="left"/>
+      <w:pPr>
+        <w:tabs>
+          <w:tab w:val="num" w:pos="720"/>
+        </w:tabs>
+        <w:ind w:left="720" w:hanging="360"/>
+      </w:pPr>
+      <w:rPr>
+        <w:rFonts w:ascii="Symbol" w:hAnsi="Symbol" w:hint="default"/>
+        <w:sz w:val="20"/>
+      </w:rPr>
+    </w:lvl>
+    <w:lvl w:ilvl="1" w:tentative="1">
+      <w:start w:val="1"/>
+      <w:numFmt w:val="bullet"/>
+      <w:lvlText w:val="o"/>
+      <w:lvlJc w:val="left"/>
+      <w:pPr>
+        <w:tabs>
+          <w:tab w:val="num" w:pos="1440"/>
+        </w:tabs>
+        <w:ind w:left="1440" w:hanging="360"/>
+      </w:pPr>
+      <w:rPr>
+        <w:rFonts w:ascii="Courier New" w:hAnsi="Courier New" w:hint="default"/>
+        <w:sz w:val="20"/>
+      </w:rPr>
+    </w:lvl>
+    <w:lvl w:ilvl="2" w:tentative="1">
+      <w:start w:val="1"/>
+      <w:numFmt w:val="bullet"/>
+      <w:lvlText w:val=""/>
+      <w:lvlJc w:val="left"/>
+      <w:pPr>
+        <w:tabs>
+          <w:tab w:val="num" w:pos="2160"/>
+        </w:tabs>
+        <w:ind w:left="2160" w:hanging="360"/>
+      </w:pPr>
+      <w:rPr>
+        <w:rFonts w:ascii="Wingdings" w:hAnsi="Wingdings" w:hint="default"/>
+        <w:sz w:val="20"/>
+      </w:rPr>
+    </w:lvl>
+    <w:lvl w:ilvl="3" w:tentative="1">
+      <w:start w:val="1"/>
+      <w:numFmt w:val="bullet"/>
+      <w:lvlText w:val=""/>
+      <w:lvlJc w:val="left"/>
+      <w:pPr>
+        <w:tabs>
+          <w:tab w:val="num" w:pos="2880"/>
+        </w:tabs>
+        <w:ind w:left="2880" w:hanging="360"/>
+      </w:pPr>
+      <w:rPr>
+        <w:rFonts w:ascii="Wingdings" w:hAnsi="Wingdings" w:hint="default"/>
+        <w:sz w:val="20"/>
+      </w:rPr>
+    </w:lvl>
+    <w:lvl w:ilvl="4" w:tentative="1">
+      <w:start w:val="1"/>
+      <w:numFmt w:val="bullet"/>
+      <w:lvlText w:val=""/>
+      <w:lvlJc w:val="left"/>
+      <w:pPr>
+        <w:tabs>
+          <w:tab w:val="num" w:pos="3600"/>
+        </w:tabs>
+        <w:ind w:left="3600" w:hanging="360"/>
+      </w:pPr>
+      <w:rPr>
+        <w:rFonts w:ascii="Wingdings" w:hAnsi="Wingdings" w:hint="default"/>
+        <w:sz w:val="20"/>
+      </w:rPr>
+    </w:lvl>
+    <w:lvl w:ilvl="5" w:tentative="1">
+      <w:start w:val="1"/>
+      <w:numFmt w:val="bullet"/>
+      <w:lvlText w:val=""/>
+      <w:lvlJc w:val="left"/>
+      <w:pPr>
+        <w:tabs>
+          <w:tab w:val="num" w:pos="4320"/>
+        </w:tabs>
+        <w:ind w:left="4320" w:hanging="360"/>
+      </w:pPr>
+      <w:rPr>
+        <w:rFonts w:ascii="Wingdings" w:hAnsi="Wingdings" w:hint="default"/>
+        <w:sz w:val="20"/>
+      </w:rPr>
+    </w:lvl>
+    <w:lvl w:ilvl="6" w:tentative="1">
+      <w:start w:val="1"/>
+      <w:numFmt w:val="bullet"/>
+      <w:lvlText w:val=""/>
+      <w:lvlJc w:val="left"/>
+      <w:pPr>
+        <w:tabs>
+          <w:tab w:val="num" w:pos="5040"/>
+        </w:tabs>
+        <w:ind w:left="5040" w:hanging="360"/>
+      </w:pPr>
+      <w:rPr>
+        <w:rFonts w:ascii="Wingdings" w:hAnsi="Wingdings" w:hint="default"/>
+        <w:sz w:val="20"/>
+      </w:rPr>
+    </w:lvl>
+    <w:lvl w:ilvl="7" w:tentative="1">
+      <w:start w:val="1"/>
+      <w:numFmt w:val="bullet"/>
+      <w:lvlText w:val=""/>
+      <w:lvlJc w:val="left"/>
+      <w:pPr>
+        <w:tabs>
+          <w:tab w:val="num" w:pos="5760"/>
+        </w:tabs>
+        <w:ind w:left="5760" w:hanging="360"/>
+      </w:pPr>
+      <w:rPr>
+        <w:rFonts w:ascii="Wingdings" w:hAnsi="Wingdings" w:hint="default"/>
+        <w:sz w:val="20"/>
+      </w:rPr>
+    </w:lvl>
+    <w:lvl w:ilvl="8" w:tentative="1">
+      <w:start w:val="1"/>
+      <w:numFmt w:val="bullet"/>
+      <w:lvlText w:val=""/>
+      <w:lvlJc w:val="left"/>
+      <w:pPr>
+        <w:tabs>
+          <w:tab w:val="num" w:pos="6480"/>
+        </w:tabs>
+        <w:ind w:left="6480" w:hanging="360"/>
+      </w:pPr>
+      <w:rPr>
+        <w:rFonts w:ascii="Wingdings" w:hAnsi="Wingdings" w:hint="default"/>
+        <w:sz w:val="20"/>
+      </w:rPr>
+    </w:lvl>
+  </w:abstractNum>
   <w:num w:numId="1" w16cid:durableId="431248552">
+    <w:abstractNumId w:val="14"/>
+  </w:num>
+  <w:num w:numId="2" w16cid:durableId="1486580539">
+    <w:abstractNumId w:val="3"/>
+  </w:num>
+  <w:num w:numId="3" w16cid:durableId="1608192328">
+    <w:abstractNumId w:val="20"/>
+  </w:num>
+  <w:num w:numId="4" w16cid:durableId="1639069128">
+    <w:abstractNumId w:val="19"/>
+  </w:num>
+  <w:num w:numId="5" w16cid:durableId="1048797234">
+    <w:abstractNumId w:val="2"/>
+  </w:num>
+  <w:num w:numId="6" w16cid:durableId="93021018">
+    <w:abstractNumId w:val="23"/>
+  </w:num>
+  <w:num w:numId="7" w16cid:durableId="1104881592">
+    <w:abstractNumId w:val="17"/>
+  </w:num>
+  <w:num w:numId="8" w16cid:durableId="384303804">
+    <w:abstractNumId w:val="5"/>
+  </w:num>
+  <w:num w:numId="9" w16cid:durableId="1174033075">
+    <w:abstractNumId w:val="6"/>
+  </w:num>
+  <w:num w:numId="10" w16cid:durableId="716900506">
+    <w:abstractNumId w:val="1"/>
+  </w:num>
+  <w:num w:numId="11" w16cid:durableId="845359796">
+    <w:abstractNumId w:val="7"/>
+  </w:num>
+  <w:num w:numId="12" w16cid:durableId="205413393">
     <w:abstractNumId w:val="12"/>
   </w:num>
-  <w:num w:numId="2" w16cid:durableId="1486580539">
-    <w:abstractNumId w:val="2"/>
-  </w:num>
-  <w:num w:numId="3" w16cid:durableId="1608192328">
+  <w:num w:numId="13" w16cid:durableId="516045932">
     <w:abstractNumId w:val="18"/>
   </w:num>
-  <w:num w:numId="4" w16cid:durableId="1639069128">
-    <w:abstractNumId w:val="17"/>
-  </w:num>
-  <w:num w:numId="5" w16cid:durableId="1048797234">
-    <w:abstractNumId w:val="1"/>
-  </w:num>
-  <w:num w:numId="6" w16cid:durableId="93021018">
-    <w:abstractNumId w:val="20"/>
-  </w:num>
-  <w:num w:numId="7" w16cid:durableId="1104881592">
+  <w:num w:numId="14" w16cid:durableId="1040476145">
     <w:abstractNumId w:val="15"/>
   </w:num>
-  <w:num w:numId="8" w16cid:durableId="384303804">
+  <w:num w:numId="15" w16cid:durableId="1228688926">
+    <w:abstractNumId w:val="16"/>
+  </w:num>
+  <w:num w:numId="16" w16cid:durableId="1881165064">
+    <w:abstractNumId w:val="8"/>
+  </w:num>
+  <w:num w:numId="17" w16cid:durableId="1856462126">
+    <w:abstractNumId w:val="24"/>
+  </w:num>
+  <w:num w:numId="18" w16cid:durableId="2003119084">
+    <w:abstractNumId w:val="22"/>
+  </w:num>
+  <w:num w:numId="19" w16cid:durableId="2035107415">
+    <w:abstractNumId w:val="11"/>
+  </w:num>
+  <w:num w:numId="20" w16cid:durableId="865145293">
+    <w:abstractNumId w:val="13"/>
+  </w:num>
+  <w:num w:numId="21" w16cid:durableId="233129795">
     <w:abstractNumId w:val="4"/>
   </w:num>
-  <w:num w:numId="9" w16cid:durableId="1174033075">
-    <w:abstractNumId w:val="5"/>
+  <w:num w:numId="22" w16cid:durableId="1506286140">
+    <w:abstractNumId w:val="10"/>
   </w:num>
-  <w:num w:numId="10" w16cid:durableId="716900506">
+  <w:num w:numId="23" w16cid:durableId="2075466915">
     <w:abstractNumId w:val="0"/>
   </w:num>
-  <w:num w:numId="11" w16cid:durableId="845359796">
-    <w:abstractNumId w:val="6"/>
-  </w:num>
-  <w:num w:numId="12" w16cid:durableId="205413393">
-    <w:abstractNumId w:val="10"/>
-  </w:num>
-  <w:num w:numId="13" w16cid:durableId="516045932">
-    <w:abstractNumId w:val="16"/>
-  </w:num>
-  <w:num w:numId="14" w16cid:durableId="1040476145">
-    <w:abstractNumId w:val="13"/>
-  </w:num>
-  <w:num w:numId="15" w16cid:durableId="1228688926">
-    <w:abstractNumId w:val="14"/>
-  </w:num>
-  <w:num w:numId="16" w16cid:durableId="1881165064">
-    <w:abstractNumId w:val="7"/>
-  </w:num>
-  <w:num w:numId="17" w16cid:durableId="1856462126">
+  <w:num w:numId="24" w16cid:durableId="403340664">
     <w:abstractNumId w:val="21"/>
   </w:num>
-  <w:num w:numId="18" w16cid:durableId="2003119084">
-    <w:abstractNumId w:val="19"/>
-  </w:num>
-  <w:num w:numId="19" w16cid:durableId="2035107415">
+  <w:num w:numId="25" w16cid:durableId="1688671282">
     <w:abstractNumId w:val="9"/>
   </w:num>
-  <w:num w:numId="20" w16cid:durableId="865145293">
-    <w:abstractNumId w:val="11"/>
-  </w:num>
-  <w:num w:numId="21" w16cid:durableId="233129795">
-    <w:abstractNumId w:val="3"/>
-  </w:num>
-  <w:num w:numId="22" w16cid:durableId="1506286140">
-    <w:abstractNumId w:val="8"/>
+  <w:num w:numId="26" w16cid:durableId="1380322845">
+    <w:abstractNumId w:val="25"/>
   </w:num>
 </w:numbering>
 </file>

</xml_diff>

<commit_message>
feat: added interactive digital twin, system blueprint diagram, and integrated fleet health UI
</commit_message>
<xml_diff>
--- a/documents/The Complete Step-by-Step Implementation logic.docx
+++ b/documents/The Complete Step-by-Step Implementation logic.docx
@@ -5959,7 +5959,7 @@
           <w:rFonts w:ascii="Aptos" w:hAnsi="Aptos"/>
         </w:rPr>
         <w:pict w14:anchorId="094954BD">
-          <v:rect id="_x0000_i1036" style="width:0;height:1.5pt" o:hralign="center" o:hrstd="t" o:hr="t" fillcolor="#a0a0a0" stroked="f"/>
+          <v:rect id="_x0000_i1030" style="width:0;height:1.5pt" o:hralign="center" o:hrstd="t" o:hr="t" fillcolor="#a0a0a0" stroked="f"/>
         </w:pict>
       </w:r>
     </w:p>
@@ -7515,7 +7515,7 @@
           <w:rFonts w:ascii="Aptos" w:hAnsi="Aptos"/>
         </w:rPr>
         <w:pict w14:anchorId="1D4BBFF5">
-          <v:rect id="_x0000_i1044" style="width:0;height:1.5pt" o:hralign="center" o:hrstd="t" o:hr="t" fillcolor="#a0a0a0" stroked="f"/>
+          <v:rect id="_x0000_i1031" style="width:0;height:1.5pt" o:hralign="center" o:hrstd="t" o:hr="t" fillcolor="#a0a0a0" stroked="f"/>
         </w:pict>
       </w:r>
     </w:p>
@@ -7682,8 +7682,1214 @@
         <w:pStyle w:val="NormalWeb"/>
         <w:rPr>
           <w:rFonts w:ascii="Aptos" w:hAnsi="Aptos"/>
-        </w:rPr>
-      </w:pPr>
+          <w:b/>
+          <w:bCs/>
+          <w:color w:val="4472C4" w:themeColor="accent1"/>
+          <w:sz w:val="32"/>
+          <w:szCs w:val="32"/>
+          <w:u w:val="single"/>
+        </w:rPr>
+      </w:pPr>
+      <w:r>
+        <w:rPr>
+          <w:rFonts w:ascii="Aptos" w:hAnsi="Aptos"/>
+          <w:b/>
+          <w:bCs/>
+          <w:color w:val="4472C4" w:themeColor="accent1"/>
+          <w:sz w:val="32"/>
+          <w:szCs w:val="32"/>
+          <w:u w:val="single"/>
+        </w:rPr>
+        <w:lastRenderedPageBreak/>
+        <w:t>4.0 Telecom Protocol: Emergency SMS Dispatch Integration</w:t>
+      </w:r>
+    </w:p>
+    <w:p>
+      <w:pPr>
+        <w:pStyle w:val="NormalWeb"/>
+        <w:rPr>
+          <w:rFonts w:ascii="Aptos" w:hAnsi="Aptos"/>
+        </w:rPr>
+      </w:pPr>
+      <w:r>
+        <w:rPr>
+          <w:rFonts w:ascii="Aptos" w:hAnsi="Aptos"/>
+          <w:b/>
+          <w:bCs/>
+        </w:rPr>
+        <w:t>4.1 Objective and Value Proposition</w:t>
+      </w:r>
+      <w:r>
+        <w:rPr>
+          <w:rFonts w:ascii="Aptos" w:hAnsi="Aptos"/>
+        </w:rPr>
+        <w:t xml:space="preserve"> The primary limitation of traditional environmental monitoring dashboards is that they rely on passive observation; an operator must be looking at the screen to notice a crisis. To solve this, a Telecom Protocol was engineered using the Twilio REST API. This integration bridges the gap between digital anomaly detection and physical-world emergency response by automatically dispatching critical SMS alerts to municipal authorities or system administrators the moment the AI predicts a catastrophic water quality event.</w:t>
+      </w:r>
+    </w:p>
+    <w:p>
+      <w:pPr>
+        <w:pStyle w:val="NormalWeb"/>
+        <w:rPr>
+          <w:rFonts w:ascii="Aptos" w:hAnsi="Aptos"/>
+        </w:rPr>
+      </w:pPr>
+      <w:r>
+        <w:rPr>
+          <w:rFonts w:ascii="Aptos" w:hAnsi="Aptos"/>
+          <w:b/>
+          <w:bCs/>
+        </w:rPr>
+        <w:t>4.2 System Architecture and Logic Flow</w:t>
+      </w:r>
+      <w:r>
+        <w:rPr>
+          <w:rFonts w:ascii="Aptos" w:hAnsi="Aptos"/>
+        </w:rPr>
+        <w:t xml:space="preserve"> </w:t>
+      </w:r>
+      <w:proofErr w:type="gramStart"/>
+      <w:r>
+        <w:rPr>
+          <w:rFonts w:ascii="Aptos" w:hAnsi="Aptos"/>
+        </w:rPr>
+        <w:t>The</w:t>
+      </w:r>
+      <w:proofErr w:type="gramEnd"/>
+      <w:r>
+        <w:rPr>
+          <w:rFonts w:ascii="Aptos" w:hAnsi="Aptos"/>
+        </w:rPr>
+        <w:t xml:space="preserve"> SMS dispatch system operates on a seamless, event-driven microservices architecture. The logic follows a strict four-step pipeline to ensure rapid and secure delivery of the alert:</w:t>
+      </w:r>
+    </w:p>
+    <w:p>
+      <w:pPr>
+        <w:pStyle w:val="NormalWeb"/>
+        <w:numPr>
+          <w:ilvl w:val="0"/>
+          <w:numId w:val="27"/>
+        </w:numPr>
+        <w:rPr>
+          <w:rFonts w:ascii="Aptos" w:hAnsi="Aptos"/>
+        </w:rPr>
+      </w:pPr>
+      <w:r>
+        <w:rPr>
+          <w:rFonts w:ascii="Aptos" w:hAnsi="Aptos"/>
+          <w:b/>
+          <w:bCs/>
+        </w:rPr>
+        <w:t>The Trigger Event (Frontend):</w:t>
+      </w:r>
+      <w:r>
+        <w:rPr>
+          <w:rFonts w:ascii="Aptos" w:hAnsi="Aptos"/>
+        </w:rPr>
+        <w:t xml:space="preserve"> When the Scikit-Learn Predictive Engine detects an imminent threat (e.g., pH dropping to toxic levels), it generates an "AI Threat Assessment" UI. The user initiates the protocol by clicking the "Dispatch Emergency Protocol" button. To prevent API spam and accidental double-billing, the React UI immediately locks the button using a </w:t>
+      </w:r>
+      <w:proofErr w:type="spellStart"/>
+      <w:r>
+        <w:rPr>
+          <w:rFonts w:ascii="Aptos" w:hAnsi="Aptos"/>
+        </w:rPr>
+        <w:t>boolean</w:t>
+      </w:r>
+      <w:proofErr w:type="spellEnd"/>
+      <w:r>
+        <w:rPr>
+          <w:rFonts w:ascii="Aptos" w:hAnsi="Aptos"/>
+        </w:rPr>
+        <w:t xml:space="preserve"> state (</w:t>
+      </w:r>
+      <w:proofErr w:type="spellStart"/>
+      <w:r>
+        <w:rPr>
+          <w:rFonts w:ascii="Aptos" w:hAnsi="Aptos"/>
+        </w:rPr>
+        <w:t>isDispatched</w:t>
+      </w:r>
+      <w:proofErr w:type="spellEnd"/>
+      <w:r>
+        <w:rPr>
+          <w:rFonts w:ascii="Aptos" w:hAnsi="Aptos"/>
+        </w:rPr>
+        <w:t>), changing the UI to a confirmed green state.</w:t>
+      </w:r>
+    </w:p>
+    <w:p>
+      <w:pPr>
+        <w:pStyle w:val="NormalWeb"/>
+        <w:numPr>
+          <w:ilvl w:val="0"/>
+          <w:numId w:val="27"/>
+        </w:numPr>
+        <w:rPr>
+          <w:rFonts w:ascii="Aptos" w:hAnsi="Aptos"/>
+        </w:rPr>
+      </w:pPr>
+      <w:r>
+        <w:rPr>
+          <w:rFonts w:ascii="Aptos" w:hAnsi="Aptos"/>
+          <w:b/>
+          <w:bCs/>
+        </w:rPr>
+        <w:t>The Intermediary Request (Client-to-Server):</w:t>
+      </w:r>
+      <w:r>
+        <w:rPr>
+          <w:rFonts w:ascii="Aptos" w:hAnsi="Aptos"/>
+        </w:rPr>
+        <w:t xml:space="preserve"> React utilizes the JavaScript fetch API to send an asynchronous POST request to the Python Flask microservice (/dispatch endpoint). This payload contains the specific context of the emergency, including the target location, predicted pH, and predicted turbidity.</w:t>
+      </w:r>
+    </w:p>
+    <w:p>
+      <w:pPr>
+        <w:pStyle w:val="NormalWeb"/>
+        <w:numPr>
+          <w:ilvl w:val="0"/>
+          <w:numId w:val="27"/>
+        </w:numPr>
+        <w:rPr>
+          <w:rFonts w:ascii="Aptos" w:hAnsi="Aptos"/>
+        </w:rPr>
+      </w:pPr>
+      <w:r>
+        <w:rPr>
+          <w:rFonts w:ascii="Aptos" w:hAnsi="Aptos"/>
+          <w:b/>
+          <w:bCs/>
+        </w:rPr>
+        <w:t>Payload Formatting &amp; Authentication (Backend):</w:t>
+      </w:r>
+      <w:r>
+        <w:rPr>
+          <w:rFonts w:ascii="Aptos" w:hAnsi="Aptos"/>
+        </w:rPr>
+        <w:t xml:space="preserve"> The Flask server catches the JSON payload and dynamically formats a highly concise SMS string. The backend then initializes the official </w:t>
+      </w:r>
+      <w:proofErr w:type="spellStart"/>
+      <w:proofErr w:type="gramStart"/>
+      <w:r>
+        <w:rPr>
+          <w:rFonts w:ascii="Aptos" w:hAnsi="Aptos"/>
+        </w:rPr>
+        <w:t>twilio.rest</w:t>
+      </w:r>
+      <w:proofErr w:type="spellEnd"/>
+      <w:proofErr w:type="gramEnd"/>
+      <w:r>
+        <w:rPr>
+          <w:rFonts w:ascii="Aptos" w:hAnsi="Aptos"/>
+        </w:rPr>
+        <w:t xml:space="preserve"> Python Client. It authenticates securely with the Twilio network using environment-level secret keys (Account SID and Auth Token).</w:t>
+      </w:r>
+    </w:p>
+    <w:p>
+      <w:pPr>
+        <w:pStyle w:val="NormalWeb"/>
+        <w:numPr>
+          <w:ilvl w:val="0"/>
+          <w:numId w:val="27"/>
+        </w:numPr>
+        <w:rPr>
+          <w:rFonts w:ascii="Aptos" w:hAnsi="Aptos"/>
+        </w:rPr>
+      </w:pPr>
+      <w:r>
+        <w:rPr>
+          <w:rFonts w:ascii="Aptos" w:hAnsi="Aptos"/>
+          <w:b/>
+          <w:bCs/>
+        </w:rPr>
+        <w:t>Telecom Routing (API-to-Device):</w:t>
+      </w:r>
+      <w:r>
+        <w:rPr>
+          <w:rFonts w:ascii="Aptos" w:hAnsi="Aptos"/>
+        </w:rPr>
+        <w:t xml:space="preserve"> Flask passes the target phone number, the virtual sender number, and the SMS payload to Twilio's REST API. Twilio processes the request and routes the SMS through local telecommunication towers (e.g., Indian telecom networks) directly to the verified physical device within seconds.</w:t>
+      </w:r>
+    </w:p>
+    <w:p>
+      <w:pPr>
+        <w:pStyle w:val="NormalWeb"/>
+        <w:rPr>
+          <w:rFonts w:ascii="Aptos" w:hAnsi="Aptos"/>
+        </w:rPr>
+      </w:pPr>
+      <w:r>
+        <w:rPr>
+          <w:rFonts w:ascii="Aptos" w:hAnsi="Aptos"/>
+          <w:b/>
+          <w:bCs/>
+        </w:rPr>
+        <w:t>4.3 Technical Implementation Details</w:t>
+      </w:r>
+    </w:p>
+    <w:p>
+      <w:pPr>
+        <w:pStyle w:val="NormalWeb"/>
+        <w:numPr>
+          <w:ilvl w:val="0"/>
+          <w:numId w:val="28"/>
+        </w:numPr>
+        <w:rPr>
+          <w:rFonts w:ascii="Aptos" w:hAnsi="Aptos"/>
+        </w:rPr>
+      </w:pPr>
+      <w:r>
+        <w:rPr>
+          <w:rFonts w:ascii="Aptos" w:hAnsi="Aptos"/>
+          <w:b/>
+          <w:bCs/>
+        </w:rPr>
+        <w:t>Backend (app.py):</w:t>
+      </w:r>
+      <w:r>
+        <w:rPr>
+          <w:rFonts w:ascii="Aptos" w:hAnsi="Aptos"/>
+        </w:rPr>
+        <w:t xml:space="preserve"> A dedicated /dispatch POST route was created to separate the notification logic from the machine learning logic. This modularity ensures that if the SMS API goes down, the AI predictions continue to function normally.</w:t>
+      </w:r>
+    </w:p>
+    <w:p>
+      <w:pPr>
+        <w:pStyle w:val="NormalWeb"/>
+        <w:numPr>
+          <w:ilvl w:val="0"/>
+          <w:numId w:val="28"/>
+        </w:numPr>
+        <w:rPr>
+          <w:rFonts w:ascii="Aptos" w:hAnsi="Aptos"/>
+        </w:rPr>
+      </w:pPr>
+      <w:r>
+        <w:rPr>
+          <w:rFonts w:ascii="Aptos" w:hAnsi="Aptos"/>
+          <w:b/>
+          <w:bCs/>
+        </w:rPr>
+        <w:t>Frontend (</w:t>
+      </w:r>
+      <w:proofErr w:type="spellStart"/>
+      <w:r>
+        <w:rPr>
+          <w:rFonts w:ascii="Aptos" w:hAnsi="Aptos"/>
+          <w:b/>
+          <w:bCs/>
+        </w:rPr>
+        <w:t>Dashboard.jsx</w:t>
+      </w:r>
+      <w:proofErr w:type="spellEnd"/>
+      <w:r>
+        <w:rPr>
+          <w:rFonts w:ascii="Aptos" w:hAnsi="Aptos"/>
+          <w:b/>
+          <w:bCs/>
+        </w:rPr>
+        <w:t>):</w:t>
+      </w:r>
+      <w:r>
+        <w:rPr>
+          <w:rFonts w:ascii="Aptos" w:hAnsi="Aptos"/>
+        </w:rPr>
+        <w:t xml:space="preserve"> State management (</w:t>
+      </w:r>
+      <w:proofErr w:type="spellStart"/>
+      <w:r>
+        <w:rPr>
+          <w:rFonts w:ascii="Aptos" w:hAnsi="Aptos"/>
+        </w:rPr>
+        <w:t>useState</w:t>
+      </w:r>
+      <w:proofErr w:type="spellEnd"/>
+      <w:r>
+        <w:rPr>
+          <w:rFonts w:ascii="Aptos" w:hAnsi="Aptos"/>
+        </w:rPr>
+        <w:t>) was utilized to handle the lifecycle of the dispatch button, providing instant visual feedback to the user while the asynchronous network request is processing in the background.</w:t>
+      </w:r>
+    </w:p>
+    <w:p>
+      <w:pPr>
+        <w:pStyle w:val="NormalWeb"/>
+        <w:rPr>
+          <w:rFonts w:ascii="Aptos" w:hAnsi="Aptos"/>
+        </w:rPr>
+      </w:pPr>
+      <w:r>
+        <w:rPr>
+          <w:rFonts w:ascii="Aptos" w:hAnsi="Aptos"/>
+          <w:b/>
+          <w:bCs/>
+        </w:rPr>
+        <w:t>4.4 Optimization and Constraint Management</w:t>
+      </w:r>
+      <w:r>
+        <w:rPr>
+          <w:rFonts w:ascii="Aptos" w:hAnsi="Aptos"/>
+        </w:rPr>
+        <w:t xml:space="preserve"> During testing, a critical constraint was discovered regarding Twilio's Trial Account character limits and local telecom spam </w:t>
+      </w:r>
+      <w:r>
+        <w:rPr>
+          <w:rFonts w:ascii="Aptos" w:hAnsi="Aptos"/>
+        </w:rPr>
+        <w:lastRenderedPageBreak/>
+        <w:t>filters (TRAI regulations). Twilio injects a mandatory "Trial Account" prefix into outgoing messages, which caused the initial, highly detailed alert to exceed the 160-character SMS segment limit, resulting in a blocked delivery (Error 30044).</w:t>
+      </w:r>
+    </w:p>
+    <w:p>
+      <w:pPr>
+        <w:pStyle w:val="NormalWeb"/>
+        <w:rPr>
+          <w:rFonts w:ascii="Aptos" w:hAnsi="Aptos"/>
+        </w:rPr>
+      </w:pPr>
+      <w:r>
+        <w:rPr>
+          <w:rFonts w:ascii="Aptos" w:hAnsi="Aptos"/>
+          <w:b/>
+          <w:bCs/>
+        </w:rPr>
+        <w:t>Resolution:</w:t>
+      </w:r>
+      <w:r>
+        <w:rPr>
+          <w:rFonts w:ascii="Aptos" w:hAnsi="Aptos"/>
+        </w:rPr>
+        <w:t xml:space="preserve"> The architecture was optimized by engineering a "Micro-Payload." The SMS string was stripped of redundant characters and reformatted into a highly condensed alert: </w:t>
+      </w:r>
+      <w:r>
+        <w:rPr>
+          <w:rFonts w:ascii="Segoe UI Emoji" w:hAnsi="Segoe UI Emoji" w:cs="Segoe UI Emoji"/>
+        </w:rPr>
+        <w:t>🚨</w:t>
+      </w:r>
+      <w:r>
+        <w:rPr>
+          <w:rFonts w:ascii="Aptos" w:hAnsi="Aptos"/>
+        </w:rPr>
+        <w:t xml:space="preserve"> TOXIC ALERT: [Location] | pH: [Value] | Turbidity: [Value]. Dispatch team immediately. This surgical reduction ensured the payload stayed well under the threshold, resulting in a 100% successful delivery rate.</w:t>
+      </w:r>
+    </w:p>
+    <w:p>
+      <w:pPr>
+        <w:pStyle w:val="NormalWeb"/>
+        <w:rPr>
+          <w:rFonts w:ascii="Aptos" w:hAnsi="Aptos"/>
+        </w:rPr>
+      </w:pPr>
+    </w:p>
+    <w:p>
+      <w:pPr>
+        <w:pStyle w:val="NormalWeb"/>
+        <w:rPr>
+          <w:rFonts w:ascii="Aptos" w:hAnsi="Aptos"/>
+          <w:b/>
+          <w:bCs/>
+          <w:color w:val="4472C4" w:themeColor="accent1"/>
+          <w:sz w:val="32"/>
+          <w:szCs w:val="32"/>
+          <w:u w:val="single"/>
+        </w:rPr>
+      </w:pPr>
+      <w:r>
+        <w:rPr>
+          <w:rFonts w:ascii="Aptos" w:hAnsi="Aptos"/>
+          <w:b/>
+          <w:bCs/>
+          <w:color w:val="4472C4" w:themeColor="accent1"/>
+          <w:sz w:val="32"/>
+          <w:szCs w:val="32"/>
+          <w:u w:val="single"/>
+        </w:rPr>
+        <w:t>5.0 Machine Learning Architecture: Predictive Time-Series Forecasting</w:t>
+      </w:r>
+    </w:p>
+    <w:p>
+      <w:pPr>
+        <w:pStyle w:val="NormalWeb"/>
+        <w:rPr>
+          <w:rFonts w:ascii="Aptos" w:hAnsi="Aptos"/>
+        </w:rPr>
+      </w:pPr>
+      <w:r>
+        <w:rPr>
+          <w:rFonts w:ascii="Aptos" w:hAnsi="Aptos"/>
+          <w:b/>
+          <w:bCs/>
+        </w:rPr>
+        <w:t>5.1 Objective and Value Proposition</w:t>
+      </w:r>
+      <w:r>
+        <w:rPr>
+          <w:rFonts w:ascii="Aptos" w:hAnsi="Aptos"/>
+        </w:rPr>
+        <w:t xml:space="preserve"> Traditional water quality monitoring systems are inherently reactive; they only alert administrators </w:t>
+      </w:r>
+      <w:r>
+        <w:rPr>
+          <w:rFonts w:ascii="Aptos" w:hAnsi="Aptos"/>
+          <w:i/>
+          <w:iCs/>
+        </w:rPr>
+        <w:t>after</w:t>
+      </w:r>
+      <w:r>
+        <w:rPr>
+          <w:rFonts w:ascii="Aptos" w:hAnsi="Aptos"/>
+        </w:rPr>
+        <w:t xml:space="preserve"> a contamination event has occurred. To shift the paradigm from reactive monitoring to proactive prevention, a custom Machine Learning microservice was engineered. The objective of this engine is to </w:t>
+      </w:r>
+      <w:proofErr w:type="spellStart"/>
+      <w:r>
+        <w:rPr>
+          <w:rFonts w:ascii="Aptos" w:hAnsi="Aptos"/>
+        </w:rPr>
+        <w:t>analyze</w:t>
+      </w:r>
+      <w:proofErr w:type="spellEnd"/>
+      <w:r>
+        <w:rPr>
+          <w:rFonts w:ascii="Aptos" w:hAnsi="Aptos"/>
+        </w:rPr>
+        <w:t xml:space="preserve"> current environmental telemetry (pH, Turbidity, Temperature, Dissolved Oxygen) and forecast the ecosystem's stability 12 hours into the future, granting municipal authorities a critical window to intervene before a full-scale ecological disaster unfolds.</w:t>
+      </w:r>
+    </w:p>
+    <w:p>
+      <w:pPr>
+        <w:pStyle w:val="NormalWeb"/>
+        <w:rPr>
+          <w:rFonts w:ascii="Aptos" w:hAnsi="Aptos"/>
+        </w:rPr>
+      </w:pPr>
+      <w:r>
+        <w:rPr>
+          <w:rFonts w:ascii="Aptos" w:hAnsi="Aptos"/>
+          <w:b/>
+          <w:bCs/>
+        </w:rPr>
+        <w:t>5.2 Algorithm Selection: The Random Forest Regressor</w:t>
+      </w:r>
+      <w:r>
+        <w:rPr>
+          <w:rFonts w:ascii="Aptos" w:hAnsi="Aptos"/>
+        </w:rPr>
+        <w:t xml:space="preserve"> For the predictive engine, a </w:t>
+      </w:r>
+      <w:r>
+        <w:rPr>
+          <w:rFonts w:ascii="Aptos" w:hAnsi="Aptos"/>
+          <w:b/>
+          <w:bCs/>
+        </w:rPr>
+        <w:t>Random Forest Regressor</w:t>
+      </w:r>
+      <w:r>
+        <w:rPr>
+          <w:rFonts w:ascii="Aptos" w:hAnsi="Aptos"/>
+        </w:rPr>
+        <w:t xml:space="preserve"> (implemented via Python's scikit-learn library) was selected over alternative algorithms such as simple Linear Regression or Deep Learning (e.g., LSTMs).</w:t>
+      </w:r>
+    </w:p>
+    <w:p>
+      <w:pPr>
+        <w:pStyle w:val="NormalWeb"/>
+        <w:numPr>
+          <w:ilvl w:val="0"/>
+          <w:numId w:val="29"/>
+        </w:numPr>
+        <w:rPr>
+          <w:rFonts w:ascii="Aptos" w:hAnsi="Aptos"/>
+        </w:rPr>
+      </w:pPr>
+      <w:r>
+        <w:rPr>
+          <w:rFonts w:ascii="Aptos" w:hAnsi="Aptos"/>
+          <w:b/>
+          <w:bCs/>
+        </w:rPr>
+        <w:t>Non-Linearity:</w:t>
+      </w:r>
+      <w:r>
+        <w:rPr>
+          <w:rFonts w:ascii="Aptos" w:hAnsi="Aptos"/>
+        </w:rPr>
+        <w:t xml:space="preserve"> Environmental variables interact in highly non-linear ways (e.g., high temperatures combined with low oxygen create exponential threats to aquatic life). Random Forests handle complex, multi-dimensional feature interactions natively.</w:t>
+      </w:r>
+    </w:p>
+    <w:p>
+      <w:pPr>
+        <w:pStyle w:val="NormalWeb"/>
+        <w:numPr>
+          <w:ilvl w:val="0"/>
+          <w:numId w:val="29"/>
+        </w:numPr>
+        <w:rPr>
+          <w:rFonts w:ascii="Aptos" w:hAnsi="Aptos"/>
+        </w:rPr>
+      </w:pPr>
+      <w:r>
+        <w:rPr>
+          <w:rFonts w:ascii="Aptos" w:hAnsi="Aptos"/>
+          <w:b/>
+          <w:bCs/>
+        </w:rPr>
+        <w:t>Robustness:</w:t>
+      </w:r>
+      <w:r>
+        <w:rPr>
+          <w:rFonts w:ascii="Aptos" w:hAnsi="Aptos"/>
+        </w:rPr>
+        <w:t xml:space="preserve"> The algorithm is highly resistant to overfitting and resilient against noisy sensor data or extreme outliers.</w:t>
+      </w:r>
+    </w:p>
+    <w:p>
+      <w:pPr>
+        <w:pStyle w:val="NormalWeb"/>
+        <w:numPr>
+          <w:ilvl w:val="0"/>
+          <w:numId w:val="29"/>
+        </w:numPr>
+        <w:rPr>
+          <w:rFonts w:ascii="Aptos" w:hAnsi="Aptos"/>
+        </w:rPr>
+      </w:pPr>
+      <w:r>
+        <w:rPr>
+          <w:rFonts w:ascii="Aptos" w:hAnsi="Aptos"/>
+          <w:b/>
+          <w:bCs/>
+        </w:rPr>
+        <w:t>Inference Speed:</w:t>
+      </w:r>
+      <w:r>
+        <w:rPr>
+          <w:rFonts w:ascii="Aptos" w:hAnsi="Aptos"/>
+        </w:rPr>
+        <w:t xml:space="preserve"> Because the model needed to be deployed as a live microservice endpoint responding to a React frontend in real-time, the sub-millisecond inference time of a serialized Random Forest made it the optimal choice for a seamless user experience.</w:t>
+      </w:r>
+    </w:p>
+    <w:p>
+      <w:pPr>
+        <w:pStyle w:val="NormalWeb"/>
+        <w:rPr>
+          <w:rFonts w:ascii="Aptos" w:hAnsi="Aptos"/>
+        </w:rPr>
+      </w:pPr>
+      <w:r>
+        <w:rPr>
+          <w:rFonts w:ascii="Aptos" w:hAnsi="Aptos"/>
+          <w:b/>
+          <w:bCs/>
+        </w:rPr>
+        <w:t xml:space="preserve">5.3 Data Engineering and </w:t>
+      </w:r>
+      <w:proofErr w:type="gramStart"/>
+      <w:r>
+        <w:rPr>
+          <w:rFonts w:ascii="Aptos" w:hAnsi="Aptos"/>
+          <w:b/>
+          <w:bCs/>
+        </w:rPr>
+        <w:t>The</w:t>
+      </w:r>
+      <w:proofErr w:type="gramEnd"/>
+      <w:r>
+        <w:rPr>
+          <w:rFonts w:ascii="Aptos" w:hAnsi="Aptos"/>
+          <w:b/>
+          <w:bCs/>
+        </w:rPr>
+        <w:t xml:space="preserve"> "Random Walk" Solution</w:t>
+      </w:r>
+      <w:r>
+        <w:rPr>
+          <w:rFonts w:ascii="Aptos" w:hAnsi="Aptos"/>
+        </w:rPr>
+        <w:t xml:space="preserve"> During the initial model training phase, a critical limitation known as </w:t>
+      </w:r>
+      <w:r>
+        <w:rPr>
+          <w:rFonts w:ascii="Aptos" w:hAnsi="Aptos"/>
+          <w:b/>
+          <w:bCs/>
+        </w:rPr>
+        <w:t>Regression to the Mean</w:t>
+      </w:r>
+      <w:r>
+        <w:rPr>
+          <w:rFonts w:ascii="Aptos" w:hAnsi="Aptos"/>
+        </w:rPr>
+        <w:t xml:space="preserve"> was identified. The original synthetic training data treated anomalies as isolated hourly events. Consequently, when presented with highly toxic, out-of-distribution data (e.g., pH 5.4, Turbidity 8.9), the algorithm incorrectly predicted an immediate return to a safe baseline (pH 7.4) because 90% of the historical training data represented safe </w:t>
+      </w:r>
+      <w:r>
+        <w:rPr>
+          <w:rFonts w:ascii="Aptos" w:hAnsi="Aptos"/>
+        </w:rPr>
+        <w:lastRenderedPageBreak/>
+        <w:t>conditions. The model had learned the statistical average, but not the physical momentum of a toxic spill.</w:t>
+      </w:r>
+    </w:p>
+    <w:p>
+      <w:pPr>
+        <w:pStyle w:val="NormalWeb"/>
+        <w:rPr>
+          <w:rFonts w:ascii="Aptos" w:hAnsi="Aptos"/>
+        </w:rPr>
+      </w:pPr>
+      <w:r>
+        <w:rPr>
+          <w:rFonts w:ascii="Aptos" w:hAnsi="Aptos"/>
+          <w:b/>
+          <w:bCs/>
+        </w:rPr>
+        <w:t>Resolution:</w:t>
+      </w:r>
+      <w:r>
+        <w:rPr>
+          <w:rFonts w:ascii="Aptos" w:hAnsi="Aptos"/>
+        </w:rPr>
+        <w:t xml:space="preserve"> To solve this, the data generation pipeline was completely re-architected using a </w:t>
+      </w:r>
+      <w:r>
+        <w:rPr>
+          <w:rFonts w:ascii="Aptos" w:hAnsi="Aptos"/>
+          <w:b/>
+          <w:bCs/>
+        </w:rPr>
+        <w:t>Random Walk statistical model</w:t>
+      </w:r>
+      <w:r>
+        <w:rPr>
+          <w:rFonts w:ascii="Aptos" w:hAnsi="Aptos"/>
+        </w:rPr>
+        <w:t>. This injected "momentum" into the synthetic dataset. If an anomaly occurred (simulating a chemical leak), the script mathematically forced the pH to crash and the turbidity to spike, and explicitly maintained those toxic levels over subsequent hours. By training on this upgraded dataset, the Random Forest learned the actual physics of a disaster, allowing it to accurately predict cascading environmental failures based on extreme inputs.</w:t>
+      </w:r>
+    </w:p>
+    <w:p>
+      <w:pPr>
+        <w:pStyle w:val="NormalWeb"/>
+        <w:rPr>
+          <w:rFonts w:ascii="Aptos" w:hAnsi="Aptos"/>
+        </w:rPr>
+      </w:pPr>
+      <w:r>
+        <w:rPr>
+          <w:rFonts w:ascii="Aptos" w:hAnsi="Aptos"/>
+          <w:b/>
+          <w:bCs/>
+        </w:rPr>
+        <w:t>5.4 Inference Microservice and Threat Logic</w:t>
+      </w:r>
+      <w:r>
+        <w:rPr>
+          <w:rFonts w:ascii="Aptos" w:hAnsi="Aptos"/>
+        </w:rPr>
+        <w:t xml:space="preserve"> The trained model was serialized using </w:t>
+      </w:r>
+      <w:proofErr w:type="spellStart"/>
+      <w:r>
+        <w:rPr>
+          <w:rFonts w:ascii="Aptos" w:hAnsi="Aptos"/>
+        </w:rPr>
+        <w:t>joblib</w:t>
+      </w:r>
+      <w:proofErr w:type="spellEnd"/>
+      <w:r>
+        <w:rPr>
+          <w:rFonts w:ascii="Aptos" w:hAnsi="Aptos"/>
+        </w:rPr>
+        <w:t xml:space="preserve"> and encapsulated within a dedicated Python Flask REST API, effectively decoupling the heavy AI computation from the Java Spring Boot database layer.</w:t>
+      </w:r>
+    </w:p>
+    <w:p>
+      <w:pPr>
+        <w:pStyle w:val="NormalWeb"/>
+        <w:numPr>
+          <w:ilvl w:val="0"/>
+          <w:numId w:val="30"/>
+        </w:numPr>
+        <w:rPr>
+          <w:rFonts w:ascii="Aptos" w:hAnsi="Aptos"/>
+        </w:rPr>
+      </w:pPr>
+      <w:r>
+        <w:rPr>
+          <w:rFonts w:ascii="Aptos" w:hAnsi="Aptos"/>
+          <w:b/>
+          <w:bCs/>
+        </w:rPr>
+        <w:t>Ingestion:</w:t>
+      </w:r>
+      <w:r>
+        <w:rPr>
+          <w:rFonts w:ascii="Aptos" w:hAnsi="Aptos"/>
+        </w:rPr>
+        <w:t xml:space="preserve"> The Flask endpoint (/predict) receives a JSON payload from the React dashboard containing current telemetry.</w:t>
+      </w:r>
+    </w:p>
+    <w:p>
+      <w:pPr>
+        <w:pStyle w:val="NormalWeb"/>
+        <w:numPr>
+          <w:ilvl w:val="0"/>
+          <w:numId w:val="30"/>
+        </w:numPr>
+        <w:rPr>
+          <w:rFonts w:ascii="Aptos" w:hAnsi="Aptos"/>
+        </w:rPr>
+      </w:pPr>
+      <w:r>
+        <w:rPr>
+          <w:rFonts w:ascii="Aptos" w:hAnsi="Aptos"/>
+          <w:b/>
+          <w:bCs/>
+        </w:rPr>
+        <w:t>Processing:</w:t>
+      </w:r>
+      <w:r>
+        <w:rPr>
+          <w:rFonts w:ascii="Aptos" w:hAnsi="Aptos"/>
+        </w:rPr>
+        <w:t xml:space="preserve"> The data is structured into a Pandas </w:t>
+      </w:r>
+      <w:proofErr w:type="spellStart"/>
+      <w:r>
+        <w:rPr>
+          <w:rFonts w:ascii="Aptos" w:hAnsi="Aptos"/>
+        </w:rPr>
+        <w:t>DataFrame</w:t>
+      </w:r>
+      <w:proofErr w:type="spellEnd"/>
+      <w:r>
+        <w:rPr>
+          <w:rFonts w:ascii="Aptos" w:hAnsi="Aptos"/>
+        </w:rPr>
+        <w:t xml:space="preserve"> and passed to the loaded Random Forest model.</w:t>
+      </w:r>
+    </w:p>
+    <w:p>
+      <w:pPr>
+        <w:pStyle w:val="NormalWeb"/>
+        <w:numPr>
+          <w:ilvl w:val="0"/>
+          <w:numId w:val="30"/>
+        </w:numPr>
+        <w:rPr>
+          <w:rFonts w:ascii="Aptos" w:hAnsi="Aptos"/>
+        </w:rPr>
+      </w:pPr>
+      <w:r>
+        <w:rPr>
+          <w:rFonts w:ascii="Aptos" w:hAnsi="Aptos"/>
+          <w:b/>
+          <w:bCs/>
+        </w:rPr>
+        <w:t>Threat Assessment:</w:t>
+      </w:r>
+      <w:r>
+        <w:rPr>
+          <w:rFonts w:ascii="Aptos" w:hAnsi="Aptos"/>
+        </w:rPr>
+        <w:t xml:space="preserve"> The model outputs continuous numerical predictions for future pH and turbidity. A hardcoded Threat Logic layer then evaluates these outputs (triggering a CRITICAL FORECAST if future pH &lt; 6.5 or &gt; 8.5, or if future turbidity &gt; 5.0).</w:t>
+      </w:r>
+    </w:p>
+    <w:p>
+      <w:pPr>
+        <w:pStyle w:val="NormalWeb"/>
+        <w:numPr>
+          <w:ilvl w:val="0"/>
+          <w:numId w:val="30"/>
+        </w:numPr>
+        <w:rPr>
+          <w:rFonts w:ascii="Aptos" w:hAnsi="Aptos"/>
+        </w:rPr>
+      </w:pPr>
+      <w:r>
+        <w:rPr>
+          <w:rFonts w:ascii="Aptos" w:hAnsi="Aptos"/>
+          <w:b/>
+          <w:bCs/>
+        </w:rPr>
+        <w:t>Delivery:</w:t>
+      </w:r>
+      <w:r>
+        <w:rPr>
+          <w:rFonts w:ascii="Aptos" w:hAnsi="Aptos"/>
+        </w:rPr>
+        <w:t xml:space="preserve"> The engine formats a detailed Threat Assessment report and returns it to the client for immediate UI rendering and potential emergency dispatch</w:t>
+      </w:r>
+    </w:p>
+    <w:p>
+      <w:pPr>
+        <w:pStyle w:val="NormalWeb"/>
+        <w:rPr>
+          <w:rFonts w:ascii="Aptos" w:hAnsi="Aptos"/>
+        </w:rPr>
+      </w:pPr>
+    </w:p>
+    <w:p>
+      <w:pPr>
+        <w:pStyle w:val="NormalWeb"/>
+        <w:rPr>
+          <w:rFonts w:ascii="Aptos" w:hAnsi="Aptos"/>
+          <w:b/>
+          <w:bCs/>
+          <w:color w:val="4472C4" w:themeColor="accent1"/>
+          <w:sz w:val="32"/>
+          <w:szCs w:val="32"/>
+          <w:u w:val="single"/>
+        </w:rPr>
+      </w:pPr>
+      <w:r>
+        <w:rPr>
+          <w:rFonts w:ascii="Aptos" w:hAnsi="Aptos"/>
+          <w:b/>
+          <w:bCs/>
+          <w:color w:val="4472C4" w:themeColor="accent1"/>
+          <w:sz w:val="32"/>
+          <w:szCs w:val="32"/>
+          <w:u w:val="single"/>
+        </w:rPr>
+        <w:t>6.0 Autonomous IoT Failsafe &amp; Cyber-Physical Integration</w:t>
+      </w:r>
+    </w:p>
+    <w:p>
+      <w:pPr>
+        <w:pStyle w:val="NormalWeb"/>
+        <w:rPr>
+          <w:rFonts w:ascii="Aptos" w:hAnsi="Aptos"/>
+        </w:rPr>
+      </w:pPr>
+      <w:r>
+        <w:rPr>
+          <w:rFonts w:ascii="Aptos" w:hAnsi="Aptos"/>
+          <w:b/>
+          <w:bCs/>
+        </w:rPr>
+        <w:t>6.1 Objective and Value Proposition</w:t>
+      </w:r>
+      <w:r>
+        <w:rPr>
+          <w:rFonts w:ascii="Aptos" w:hAnsi="Aptos"/>
+        </w:rPr>
+        <w:t xml:space="preserve"> While the Telecommunications Protocol (SMS Dispatch) successfully notifies stakeholders of a contamination event, it inherently relies on a "human-in-the-loop" to take physical action. In the event of a catastrophic chemical spill occurring outside of standard operational hours, the latency between an SMS alert and a human operator manually shutting down the municipal water supply could result in widespread public exposure. To eliminate this human latency, an Autonomous IoT (Internet of Things) Failsafe Simulation was engineered. This system empowers the AI to not only detect threats but to autonomously execute physical hardware lockdowns, severing the water supply instantly upon detecting critical toxicity.</w:t>
+      </w:r>
+    </w:p>
+    <w:p>
+      <w:pPr>
+        <w:pStyle w:val="NormalWeb"/>
+        <w:rPr>
+          <w:rFonts w:ascii="Aptos" w:hAnsi="Aptos"/>
+        </w:rPr>
+      </w:pPr>
+      <w:r>
+        <w:rPr>
+          <w:rFonts w:ascii="Aptos" w:hAnsi="Aptos"/>
+          <w:b/>
+          <w:bCs/>
+        </w:rPr>
+        <w:t>6.2 System Architecture and Closed-Loop Logic</w:t>
+      </w:r>
+      <w:r>
+        <w:rPr>
+          <w:rFonts w:ascii="Aptos" w:hAnsi="Aptos"/>
+        </w:rPr>
+        <w:t xml:space="preserve"> The autonomous failsafe operates as a closed-loop cyber-physical system, bridging the gap between digital AI inference and physical hardware actuation:</w:t>
+      </w:r>
+    </w:p>
+    <w:p>
+      <w:pPr>
+        <w:pStyle w:val="NormalWeb"/>
+        <w:numPr>
+          <w:ilvl w:val="0"/>
+          <w:numId w:val="31"/>
+        </w:numPr>
+        <w:rPr>
+          <w:rFonts w:ascii="Aptos" w:hAnsi="Aptos"/>
+        </w:rPr>
+      </w:pPr>
+      <w:r>
+        <w:rPr>
+          <w:rFonts w:ascii="Aptos" w:hAnsi="Aptos"/>
+          <w:b/>
+          <w:bCs/>
+        </w:rPr>
+        <w:t>Telemetry Ingestion:</w:t>
+      </w:r>
+      <w:r>
+        <w:rPr>
+          <w:rFonts w:ascii="Aptos" w:hAnsi="Aptos"/>
+        </w:rPr>
+        <w:t xml:space="preserve"> The system captures current environmental variables (pH, Turbidity, etc.).</w:t>
+      </w:r>
+    </w:p>
+    <w:p>
+      <w:pPr>
+        <w:pStyle w:val="NormalWeb"/>
+        <w:numPr>
+          <w:ilvl w:val="0"/>
+          <w:numId w:val="31"/>
+        </w:numPr>
+        <w:rPr>
+          <w:rFonts w:ascii="Aptos" w:hAnsi="Aptos"/>
+        </w:rPr>
+      </w:pPr>
+      <w:r>
+        <w:rPr>
+          <w:rFonts w:ascii="Aptos" w:hAnsi="Aptos"/>
+          <w:b/>
+          <w:bCs/>
+        </w:rPr>
+        <w:lastRenderedPageBreak/>
+        <w:t>Predictive Forecasting:</w:t>
+      </w:r>
+      <w:r>
+        <w:rPr>
+          <w:rFonts w:ascii="Aptos" w:hAnsi="Aptos"/>
+        </w:rPr>
+        <w:t xml:space="preserve"> The Scikit-Learn Random Forest model calculates the 12-hour environmental trajectory.</w:t>
+      </w:r>
+    </w:p>
+    <w:p>
+      <w:pPr>
+        <w:pStyle w:val="NormalWeb"/>
+        <w:numPr>
+          <w:ilvl w:val="0"/>
+          <w:numId w:val="31"/>
+        </w:numPr>
+        <w:rPr>
+          <w:rFonts w:ascii="Aptos" w:hAnsi="Aptos"/>
+        </w:rPr>
+      </w:pPr>
+      <w:r>
+        <w:rPr>
+          <w:rFonts w:ascii="Aptos" w:hAnsi="Aptos"/>
+          <w:b/>
+          <w:bCs/>
+        </w:rPr>
+        <w:t>Threat Evaluation:</w:t>
+      </w:r>
+      <w:r>
+        <w:rPr>
+          <w:rFonts w:ascii="Aptos" w:hAnsi="Aptos"/>
+        </w:rPr>
+        <w:t xml:space="preserve"> The system evaluates the predicted state against strict biological and chemical safety thresholds (e.g., pH &lt; 6.5 or Turbidity &gt; 5.0).</w:t>
+      </w:r>
+    </w:p>
+    <w:p>
+      <w:pPr>
+        <w:pStyle w:val="NormalWeb"/>
+        <w:numPr>
+          <w:ilvl w:val="0"/>
+          <w:numId w:val="31"/>
+        </w:numPr>
+        <w:rPr>
+          <w:rFonts w:ascii="Aptos" w:hAnsi="Aptos"/>
+        </w:rPr>
+      </w:pPr>
+      <w:r>
+        <w:rPr>
+          <w:rFonts w:ascii="Aptos" w:hAnsi="Aptos"/>
+          <w:b/>
+          <w:bCs/>
+        </w:rPr>
+        <w:t>Autonomous Actuation (Lockdown):</w:t>
+      </w:r>
+      <w:r>
+        <w:rPr>
+          <w:rFonts w:ascii="Aptos" w:hAnsi="Aptos"/>
+        </w:rPr>
+        <w:t xml:space="preserve"> If the threshold is breached, the system bypasses the manual dispatch queue and instantly triggers a "CRITICAL" state. This state virtually actuates a Smart Valve, restricting water flow to protect the downstream ecosystem and public health.</w:t>
+      </w:r>
+    </w:p>
+    <w:p>
+      <w:pPr>
+        <w:pStyle w:val="NormalWeb"/>
+        <w:rPr>
+          <w:rFonts w:ascii="Aptos" w:hAnsi="Aptos"/>
+        </w:rPr>
+      </w:pPr>
+      <w:r>
+        <w:rPr>
+          <w:rFonts w:ascii="Aptos" w:hAnsi="Aptos"/>
+          <w:b/>
+          <w:bCs/>
+        </w:rPr>
+        <w:t>6.3 Full-Stack Implementation Details</w:t>
+      </w:r>
+      <w:r>
+        <w:rPr>
+          <w:rFonts w:ascii="Aptos" w:hAnsi="Aptos"/>
+        </w:rPr>
+        <w:t xml:space="preserve"> To ensure the hardware actuation is auditable and permanent, the simulation was deeply integrated into the full-stack architecture:</w:t>
+      </w:r>
+    </w:p>
+    <w:p>
+      <w:pPr>
+        <w:pStyle w:val="NormalWeb"/>
+        <w:numPr>
+          <w:ilvl w:val="0"/>
+          <w:numId w:val="32"/>
+        </w:numPr>
+        <w:rPr>
+          <w:rFonts w:ascii="Aptos" w:hAnsi="Aptos"/>
+        </w:rPr>
+      </w:pPr>
+      <w:r>
+        <w:rPr>
+          <w:rFonts w:ascii="Aptos" w:hAnsi="Aptos"/>
+          <w:b/>
+          <w:bCs/>
+        </w:rPr>
+        <w:t>Database Vault (PostgreSQL):</w:t>
+      </w:r>
+      <w:r>
+        <w:rPr>
+          <w:rFonts w:ascii="Aptos" w:hAnsi="Aptos"/>
+        </w:rPr>
+        <w:t xml:space="preserve"> The database schema was expanded to include a </w:t>
+      </w:r>
+      <w:proofErr w:type="spellStart"/>
+      <w:r>
+        <w:rPr>
+          <w:rFonts w:ascii="Aptos" w:hAnsi="Aptos"/>
+        </w:rPr>
+        <w:t>valve_closed</w:t>
+      </w:r>
+      <w:proofErr w:type="spellEnd"/>
+      <w:r>
+        <w:rPr>
+          <w:rFonts w:ascii="Aptos" w:hAnsi="Aptos"/>
+        </w:rPr>
+        <w:t xml:space="preserve"> Boolean column, creating a permanent, auditable ledger of all autonomous hardware actions.</w:t>
+      </w:r>
+    </w:p>
+    <w:p>
+      <w:pPr>
+        <w:pStyle w:val="NormalWeb"/>
+        <w:numPr>
+          <w:ilvl w:val="0"/>
+          <w:numId w:val="32"/>
+        </w:numPr>
+        <w:rPr>
+          <w:rFonts w:ascii="Aptos" w:hAnsi="Aptos"/>
+        </w:rPr>
+      </w:pPr>
+      <w:r>
+        <w:rPr>
+          <w:rFonts w:ascii="Aptos" w:hAnsi="Aptos"/>
+          <w:b/>
+          <w:bCs/>
+        </w:rPr>
+        <w:t>Backend REST API (Java Spring Boot):</w:t>
+      </w:r>
+      <w:r>
+        <w:rPr>
+          <w:rFonts w:ascii="Aptos" w:hAnsi="Aptos"/>
+        </w:rPr>
+        <w:t xml:space="preserve"> The controller logic was re-engineered to accept real-time state overrides. When an existing telemetry record is updated, the @PutMapping endpoint actively parses the AI's decision and explicitly overwrites the historical database row with the new status and </w:t>
+      </w:r>
+      <w:proofErr w:type="spellStart"/>
+      <w:r>
+        <w:rPr>
+          <w:rFonts w:ascii="Aptos" w:hAnsi="Aptos"/>
+        </w:rPr>
+        <w:t>valve_closed</w:t>
+      </w:r>
+      <w:proofErr w:type="spellEnd"/>
+      <w:r>
+        <w:rPr>
+          <w:rFonts w:ascii="Aptos" w:hAnsi="Aptos"/>
+        </w:rPr>
+        <w:t xml:space="preserve"> parameters.</w:t>
+      </w:r>
+    </w:p>
+    <w:p>
+      <w:pPr>
+        <w:pStyle w:val="NormalWeb"/>
+        <w:numPr>
+          <w:ilvl w:val="0"/>
+          <w:numId w:val="32"/>
+        </w:numPr>
+        <w:rPr>
+          <w:rFonts w:ascii="Aptos" w:hAnsi="Aptos"/>
+        </w:rPr>
+      </w:pPr>
+      <w:r>
+        <w:rPr>
+          <w:rFonts w:ascii="Aptos" w:hAnsi="Aptos"/>
+          <w:b/>
+          <w:bCs/>
+        </w:rPr>
+        <w:t>Dynamic UI (React.js):</w:t>
+      </w:r>
+      <w:r>
+        <w:rPr>
+          <w:rFonts w:ascii="Aptos" w:hAnsi="Aptos"/>
+        </w:rPr>
+        <w:t xml:space="preserve"> A custom hardware status module was developed to provide real-time visual feedback to operators. When a safe forecast is generated, the UI renders animated, flowing water pipelines. Upon a critical forecast, the UI instantly transitions to an "AUTONOMOUS LOCKDOWN ENGAGED" state, visualizing the severed supply line.</w:t>
+      </w:r>
+    </w:p>
+    <w:p>
+      <w:pPr>
+        <w:pStyle w:val="NormalWeb"/>
+        <w:rPr>
+          <w:rFonts w:ascii="Aptos" w:hAnsi="Aptos"/>
+        </w:rPr>
+      </w:pPr>
+      <w:r>
+        <w:rPr>
+          <w:rFonts w:ascii="Aptos" w:hAnsi="Aptos"/>
+          <w:b/>
+          <w:bCs/>
+        </w:rPr>
+        <w:t>6.4 Data Integrity and State Synchronization</w:t>
+      </w:r>
+      <w:r>
+        <w:rPr>
+          <w:rFonts w:ascii="Aptos" w:hAnsi="Aptos"/>
+        </w:rPr>
+        <w:t xml:space="preserve"> A significant engineering challenge involved maintaining strict data synchronization during manual telemetry corrections. Initially, updating a sensor reading caused a "payload mismatch" where the AI's new hardware decision was desynchronized from the database's historical state.</w:t>
+      </w:r>
+    </w:p>
+    <w:p>
+      <w:pPr>
+        <w:pStyle w:val="NormalWeb"/>
+        <w:rPr>
+          <w:rFonts w:ascii="Aptos" w:hAnsi="Aptos"/>
+        </w:rPr>
+      </w:pPr>
+      <w:r>
+        <w:rPr>
+          <w:rFonts w:ascii="Aptos" w:hAnsi="Aptos"/>
+          <w:b/>
+          <w:bCs/>
+        </w:rPr>
+        <w:t>Resolution:</w:t>
+      </w:r>
+      <w:r>
+        <w:rPr>
+          <w:rFonts w:ascii="Aptos" w:hAnsi="Aptos"/>
+        </w:rPr>
+        <w:t xml:space="preserve"> A strict HTTP payload enforcement protocol was implemented in the React frontend. Before dispatching a PUT request, the client forces a re-verification of the AI prediction. The React client then dynamically constructs a payload containing the unique record id, an updated to-the-second timestamp, and the newly calculated </w:t>
+      </w:r>
+      <w:proofErr w:type="spellStart"/>
+      <w:r>
+        <w:rPr>
+          <w:rFonts w:ascii="Aptos" w:hAnsi="Aptos"/>
+        </w:rPr>
+        <w:t>valveClosed</w:t>
+      </w:r>
+      <w:proofErr w:type="spellEnd"/>
+      <w:r>
+        <w:rPr>
+          <w:rFonts w:ascii="Aptos" w:hAnsi="Aptos"/>
+        </w:rPr>
+        <w:t xml:space="preserve"> state. This guarantees that the PostgreSQL database, the visual dashboard, and the AI's threat assessment remain in perfect, real-time synchronization, ensuring a reliable audit trail for government and municipal oversight.</w:t>
+      </w:r>
     </w:p>
     <w:p>
       <w:pPr>
@@ -8108,6 +9314,155 @@
     </w:lvl>
   </w:abstractNum>
   <w:abstractNum w:abstractNumId="2" w15:restartNumberingAfterBreak="0">
+    <w:nsid w:val="053B50AD"/>
+    <w:multiLevelType w:val="multilevel"/>
+    <w:tmpl w:val="8048CC48"/>
+    <w:lvl w:ilvl="0">
+      <w:start w:val="1"/>
+      <w:numFmt w:val="bullet"/>
+      <w:lvlText w:val=""/>
+      <w:lvlJc w:val="left"/>
+      <w:pPr>
+        <w:tabs>
+          <w:tab w:val="num" w:pos="720"/>
+        </w:tabs>
+        <w:ind w:left="720" w:hanging="360"/>
+      </w:pPr>
+      <w:rPr>
+        <w:rFonts w:ascii="Symbol" w:hAnsi="Symbol" w:hint="default"/>
+        <w:sz w:val="20"/>
+      </w:rPr>
+    </w:lvl>
+    <w:lvl w:ilvl="1" w:tentative="1">
+      <w:start w:val="1"/>
+      <w:numFmt w:val="bullet"/>
+      <w:lvlText w:val="o"/>
+      <w:lvlJc w:val="left"/>
+      <w:pPr>
+        <w:tabs>
+          <w:tab w:val="num" w:pos="1440"/>
+        </w:tabs>
+        <w:ind w:left="1440" w:hanging="360"/>
+      </w:pPr>
+      <w:rPr>
+        <w:rFonts w:ascii="Courier New" w:hAnsi="Courier New" w:hint="default"/>
+        <w:sz w:val="20"/>
+      </w:rPr>
+    </w:lvl>
+    <w:lvl w:ilvl="2" w:tentative="1">
+      <w:start w:val="1"/>
+      <w:numFmt w:val="bullet"/>
+      <w:lvlText w:val=""/>
+      <w:lvlJc w:val="left"/>
+      <w:pPr>
+        <w:tabs>
+          <w:tab w:val="num" w:pos="2160"/>
+        </w:tabs>
+        <w:ind w:left="2160" w:hanging="360"/>
+      </w:pPr>
+      <w:rPr>
+        <w:rFonts w:ascii="Wingdings" w:hAnsi="Wingdings" w:hint="default"/>
+        <w:sz w:val="20"/>
+      </w:rPr>
+    </w:lvl>
+    <w:lvl w:ilvl="3" w:tentative="1">
+      <w:start w:val="1"/>
+      <w:numFmt w:val="bullet"/>
+      <w:lvlText w:val=""/>
+      <w:lvlJc w:val="left"/>
+      <w:pPr>
+        <w:tabs>
+          <w:tab w:val="num" w:pos="2880"/>
+        </w:tabs>
+        <w:ind w:left="2880" w:hanging="360"/>
+      </w:pPr>
+      <w:rPr>
+        <w:rFonts w:ascii="Wingdings" w:hAnsi="Wingdings" w:hint="default"/>
+        <w:sz w:val="20"/>
+      </w:rPr>
+    </w:lvl>
+    <w:lvl w:ilvl="4" w:tentative="1">
+      <w:start w:val="1"/>
+      <w:numFmt w:val="bullet"/>
+      <w:lvlText w:val=""/>
+      <w:lvlJc w:val="left"/>
+      <w:pPr>
+        <w:tabs>
+          <w:tab w:val="num" w:pos="3600"/>
+        </w:tabs>
+        <w:ind w:left="3600" w:hanging="360"/>
+      </w:pPr>
+      <w:rPr>
+        <w:rFonts w:ascii="Wingdings" w:hAnsi="Wingdings" w:hint="default"/>
+        <w:sz w:val="20"/>
+      </w:rPr>
+    </w:lvl>
+    <w:lvl w:ilvl="5" w:tentative="1">
+      <w:start w:val="1"/>
+      <w:numFmt w:val="bullet"/>
+      <w:lvlText w:val=""/>
+      <w:lvlJc w:val="left"/>
+      <w:pPr>
+        <w:tabs>
+          <w:tab w:val="num" w:pos="4320"/>
+        </w:tabs>
+        <w:ind w:left="4320" w:hanging="360"/>
+      </w:pPr>
+      <w:rPr>
+        <w:rFonts w:ascii="Wingdings" w:hAnsi="Wingdings" w:hint="default"/>
+        <w:sz w:val="20"/>
+      </w:rPr>
+    </w:lvl>
+    <w:lvl w:ilvl="6" w:tentative="1">
+      <w:start w:val="1"/>
+      <w:numFmt w:val="bullet"/>
+      <w:lvlText w:val=""/>
+      <w:lvlJc w:val="left"/>
+      <w:pPr>
+        <w:tabs>
+          <w:tab w:val="num" w:pos="5040"/>
+        </w:tabs>
+        <w:ind w:left="5040" w:hanging="360"/>
+      </w:pPr>
+      <w:rPr>
+        <w:rFonts w:ascii="Wingdings" w:hAnsi="Wingdings" w:hint="default"/>
+        <w:sz w:val="20"/>
+      </w:rPr>
+    </w:lvl>
+    <w:lvl w:ilvl="7" w:tentative="1">
+      <w:start w:val="1"/>
+      <w:numFmt w:val="bullet"/>
+      <w:lvlText w:val=""/>
+      <w:lvlJc w:val="left"/>
+      <w:pPr>
+        <w:tabs>
+          <w:tab w:val="num" w:pos="5760"/>
+        </w:tabs>
+        <w:ind w:left="5760" w:hanging="360"/>
+      </w:pPr>
+      <w:rPr>
+        <w:rFonts w:ascii="Wingdings" w:hAnsi="Wingdings" w:hint="default"/>
+        <w:sz w:val="20"/>
+      </w:rPr>
+    </w:lvl>
+    <w:lvl w:ilvl="8" w:tentative="1">
+      <w:start w:val="1"/>
+      <w:numFmt w:val="bullet"/>
+      <w:lvlText w:val=""/>
+      <w:lvlJc w:val="left"/>
+      <w:pPr>
+        <w:tabs>
+          <w:tab w:val="num" w:pos="6480"/>
+        </w:tabs>
+        <w:ind w:left="6480" w:hanging="360"/>
+      </w:pPr>
+      <w:rPr>
+        <w:rFonts w:ascii="Wingdings" w:hAnsi="Wingdings" w:hint="default"/>
+        <w:sz w:val="20"/>
+      </w:rPr>
+    </w:lvl>
+  </w:abstractNum>
+  <w:abstractNum w:abstractNumId="3" w15:restartNumberingAfterBreak="0">
     <w:nsid w:val="059712CC"/>
     <w:multiLevelType w:val="multilevel"/>
     <w:tmpl w:val="BF8602F2"/>
@@ -8256,7 +9611,7 @@
       </w:rPr>
     </w:lvl>
   </w:abstractNum>
-  <w:abstractNum w:abstractNumId="3" w15:restartNumberingAfterBreak="0">
+  <w:abstractNum w:abstractNumId="4" w15:restartNumberingAfterBreak="0">
     <w:nsid w:val="09A53CC7"/>
     <w:multiLevelType w:val="multilevel"/>
     <w:tmpl w:val="AB3214BC"/>
@@ -8405,7 +9760,7 @@
       </w:rPr>
     </w:lvl>
   </w:abstractNum>
-  <w:abstractNum w:abstractNumId="4" w15:restartNumberingAfterBreak="0">
+  <w:abstractNum w:abstractNumId="5" w15:restartNumberingAfterBreak="0">
     <w:nsid w:val="0AF34332"/>
     <w:multiLevelType w:val="multilevel"/>
     <w:tmpl w:val="4DF08802"/>
@@ -8554,7 +9909,7 @@
       </w:rPr>
     </w:lvl>
   </w:abstractNum>
-  <w:abstractNum w:abstractNumId="5" w15:restartNumberingAfterBreak="0">
+  <w:abstractNum w:abstractNumId="6" w15:restartNumberingAfterBreak="0">
     <w:nsid w:val="15981CB8"/>
     <w:multiLevelType w:val="multilevel"/>
     <w:tmpl w:val="0C127F82"/>
@@ -8667,7 +10022,7 @@
       </w:pPr>
     </w:lvl>
   </w:abstractNum>
-  <w:abstractNum w:abstractNumId="6" w15:restartNumberingAfterBreak="0">
+  <w:abstractNum w:abstractNumId="7" w15:restartNumberingAfterBreak="0">
     <w:nsid w:val="1A5263CF"/>
     <w:multiLevelType w:val="multilevel"/>
     <w:tmpl w:val="A1C0DFB4"/>
@@ -8784,7 +10139,7 @@
       </w:pPr>
     </w:lvl>
   </w:abstractNum>
-  <w:abstractNum w:abstractNumId="7" w15:restartNumberingAfterBreak="0">
+  <w:abstractNum w:abstractNumId="8" w15:restartNumberingAfterBreak="0">
     <w:nsid w:val="210F68C4"/>
     <w:multiLevelType w:val="multilevel"/>
     <w:tmpl w:val="F19807B8"/>
@@ -8933,7 +10288,7 @@
       </w:rPr>
     </w:lvl>
   </w:abstractNum>
-  <w:abstractNum w:abstractNumId="8" w15:restartNumberingAfterBreak="0">
+  <w:abstractNum w:abstractNumId="9" w15:restartNumberingAfterBreak="0">
     <w:nsid w:val="24371D72"/>
     <w:multiLevelType w:val="multilevel"/>
     <w:tmpl w:val="B576F314"/>
@@ -9082,7 +10437,7 @@
       </w:rPr>
     </w:lvl>
   </w:abstractNum>
-  <w:abstractNum w:abstractNumId="9" w15:restartNumberingAfterBreak="0">
+  <w:abstractNum w:abstractNumId="10" w15:restartNumberingAfterBreak="0">
     <w:nsid w:val="263628FB"/>
     <w:multiLevelType w:val="multilevel"/>
     <w:tmpl w:val="B41666F8"/>
@@ -9231,7 +10586,7 @@
       </w:rPr>
     </w:lvl>
   </w:abstractNum>
-  <w:abstractNum w:abstractNumId="10" w15:restartNumberingAfterBreak="0">
+  <w:abstractNum w:abstractNumId="11" w15:restartNumberingAfterBreak="0">
     <w:nsid w:val="2AAD76DD"/>
     <w:multiLevelType w:val="multilevel"/>
     <w:tmpl w:val="7C703578"/>
@@ -9380,7 +10735,156 @@
       </w:rPr>
     </w:lvl>
   </w:abstractNum>
-  <w:abstractNum w:abstractNumId="11" w15:restartNumberingAfterBreak="0">
+  <w:abstractNum w:abstractNumId="12" w15:restartNumberingAfterBreak="0">
+    <w:nsid w:val="2FB26FA7"/>
+    <w:multiLevelType w:val="multilevel"/>
+    <w:tmpl w:val="38D0F29C"/>
+    <w:lvl w:ilvl="0">
+      <w:start w:val="1"/>
+      <w:numFmt w:val="bullet"/>
+      <w:lvlText w:val=""/>
+      <w:lvlJc w:val="left"/>
+      <w:pPr>
+        <w:tabs>
+          <w:tab w:val="num" w:pos="720"/>
+        </w:tabs>
+        <w:ind w:left="720" w:hanging="360"/>
+      </w:pPr>
+      <w:rPr>
+        <w:rFonts w:ascii="Symbol" w:hAnsi="Symbol" w:hint="default"/>
+        <w:sz w:val="20"/>
+      </w:rPr>
+    </w:lvl>
+    <w:lvl w:ilvl="1" w:tentative="1">
+      <w:start w:val="1"/>
+      <w:numFmt w:val="bullet"/>
+      <w:lvlText w:val="o"/>
+      <w:lvlJc w:val="left"/>
+      <w:pPr>
+        <w:tabs>
+          <w:tab w:val="num" w:pos="1440"/>
+        </w:tabs>
+        <w:ind w:left="1440" w:hanging="360"/>
+      </w:pPr>
+      <w:rPr>
+        <w:rFonts w:ascii="Courier New" w:hAnsi="Courier New" w:hint="default"/>
+        <w:sz w:val="20"/>
+      </w:rPr>
+    </w:lvl>
+    <w:lvl w:ilvl="2" w:tentative="1">
+      <w:start w:val="1"/>
+      <w:numFmt w:val="bullet"/>
+      <w:lvlText w:val=""/>
+      <w:lvlJc w:val="left"/>
+      <w:pPr>
+        <w:tabs>
+          <w:tab w:val="num" w:pos="2160"/>
+        </w:tabs>
+        <w:ind w:left="2160" w:hanging="360"/>
+      </w:pPr>
+      <w:rPr>
+        <w:rFonts w:ascii="Wingdings" w:hAnsi="Wingdings" w:hint="default"/>
+        <w:sz w:val="20"/>
+      </w:rPr>
+    </w:lvl>
+    <w:lvl w:ilvl="3" w:tentative="1">
+      <w:start w:val="1"/>
+      <w:numFmt w:val="bullet"/>
+      <w:lvlText w:val=""/>
+      <w:lvlJc w:val="left"/>
+      <w:pPr>
+        <w:tabs>
+          <w:tab w:val="num" w:pos="2880"/>
+        </w:tabs>
+        <w:ind w:left="2880" w:hanging="360"/>
+      </w:pPr>
+      <w:rPr>
+        <w:rFonts w:ascii="Wingdings" w:hAnsi="Wingdings" w:hint="default"/>
+        <w:sz w:val="20"/>
+      </w:rPr>
+    </w:lvl>
+    <w:lvl w:ilvl="4" w:tentative="1">
+      <w:start w:val="1"/>
+      <w:numFmt w:val="bullet"/>
+      <w:lvlText w:val=""/>
+      <w:lvlJc w:val="left"/>
+      <w:pPr>
+        <w:tabs>
+          <w:tab w:val="num" w:pos="3600"/>
+        </w:tabs>
+        <w:ind w:left="3600" w:hanging="360"/>
+      </w:pPr>
+      <w:rPr>
+        <w:rFonts w:ascii="Wingdings" w:hAnsi="Wingdings" w:hint="default"/>
+        <w:sz w:val="20"/>
+      </w:rPr>
+    </w:lvl>
+    <w:lvl w:ilvl="5" w:tentative="1">
+      <w:start w:val="1"/>
+      <w:numFmt w:val="bullet"/>
+      <w:lvlText w:val=""/>
+      <w:lvlJc w:val="left"/>
+      <w:pPr>
+        <w:tabs>
+          <w:tab w:val="num" w:pos="4320"/>
+        </w:tabs>
+        <w:ind w:left="4320" w:hanging="360"/>
+      </w:pPr>
+      <w:rPr>
+        <w:rFonts w:ascii="Wingdings" w:hAnsi="Wingdings" w:hint="default"/>
+        <w:sz w:val="20"/>
+      </w:rPr>
+    </w:lvl>
+    <w:lvl w:ilvl="6" w:tentative="1">
+      <w:start w:val="1"/>
+      <w:numFmt w:val="bullet"/>
+      <w:lvlText w:val=""/>
+      <w:lvlJc w:val="left"/>
+      <w:pPr>
+        <w:tabs>
+          <w:tab w:val="num" w:pos="5040"/>
+        </w:tabs>
+        <w:ind w:left="5040" w:hanging="360"/>
+      </w:pPr>
+      <w:rPr>
+        <w:rFonts w:ascii="Wingdings" w:hAnsi="Wingdings" w:hint="default"/>
+        <w:sz w:val="20"/>
+      </w:rPr>
+    </w:lvl>
+    <w:lvl w:ilvl="7" w:tentative="1">
+      <w:start w:val="1"/>
+      <w:numFmt w:val="bullet"/>
+      <w:lvlText w:val=""/>
+      <w:lvlJc w:val="left"/>
+      <w:pPr>
+        <w:tabs>
+          <w:tab w:val="num" w:pos="5760"/>
+        </w:tabs>
+        <w:ind w:left="5760" w:hanging="360"/>
+      </w:pPr>
+      <w:rPr>
+        <w:rFonts w:ascii="Wingdings" w:hAnsi="Wingdings" w:hint="default"/>
+        <w:sz w:val="20"/>
+      </w:rPr>
+    </w:lvl>
+    <w:lvl w:ilvl="8" w:tentative="1">
+      <w:start w:val="1"/>
+      <w:numFmt w:val="bullet"/>
+      <w:lvlText w:val=""/>
+      <w:lvlJc w:val="left"/>
+      <w:pPr>
+        <w:tabs>
+          <w:tab w:val="num" w:pos="6480"/>
+        </w:tabs>
+        <w:ind w:left="6480" w:hanging="360"/>
+      </w:pPr>
+      <w:rPr>
+        <w:rFonts w:ascii="Wingdings" w:hAnsi="Wingdings" w:hint="default"/>
+        <w:sz w:val="20"/>
+      </w:rPr>
+    </w:lvl>
+  </w:abstractNum>
+  <w:abstractNum w:abstractNumId="13" w15:restartNumberingAfterBreak="0">
     <w:nsid w:val="35CB7899"/>
     <w:multiLevelType w:val="multilevel"/>
     <w:tmpl w:val="CCF80158"/>
@@ -9529,7 +11033,7 @@
       </w:rPr>
     </w:lvl>
   </w:abstractNum>
-  <w:abstractNum w:abstractNumId="12" w15:restartNumberingAfterBreak="0">
+  <w:abstractNum w:abstractNumId="14" w15:restartNumberingAfterBreak="0">
     <w:nsid w:val="373525FB"/>
     <w:multiLevelType w:val="multilevel"/>
     <w:tmpl w:val="79DA3516"/>
@@ -9678,7 +11182,7 @@
       </w:rPr>
     </w:lvl>
   </w:abstractNum>
-  <w:abstractNum w:abstractNumId="13" w15:restartNumberingAfterBreak="0">
+  <w:abstractNum w:abstractNumId="15" w15:restartNumberingAfterBreak="0">
     <w:nsid w:val="3A7D0CDF"/>
     <w:multiLevelType w:val="multilevel"/>
     <w:tmpl w:val="FDB000BC"/>
@@ -9827,7 +11331,7 @@
       </w:rPr>
     </w:lvl>
   </w:abstractNum>
-  <w:abstractNum w:abstractNumId="14" w15:restartNumberingAfterBreak="0">
+  <w:abstractNum w:abstractNumId="16" w15:restartNumberingAfterBreak="0">
     <w:nsid w:val="3CC46E24"/>
     <w:multiLevelType w:val="multilevel"/>
     <w:tmpl w:val="2F8C6752"/>
@@ -9976,7 +11480,7 @@
       </w:rPr>
     </w:lvl>
   </w:abstractNum>
-  <w:abstractNum w:abstractNumId="15" w15:restartNumberingAfterBreak="0">
+  <w:abstractNum w:abstractNumId="17" w15:restartNumberingAfterBreak="0">
     <w:nsid w:val="3CCD51C5"/>
     <w:multiLevelType w:val="multilevel"/>
     <w:tmpl w:val="6AE42D34"/>
@@ -10125,7 +11629,7 @@
       </w:rPr>
     </w:lvl>
   </w:abstractNum>
-  <w:abstractNum w:abstractNumId="16" w15:restartNumberingAfterBreak="0">
+  <w:abstractNum w:abstractNumId="18" w15:restartNumberingAfterBreak="0">
     <w:nsid w:val="46631489"/>
     <w:multiLevelType w:val="multilevel"/>
     <w:tmpl w:val="F16ECABE"/>
@@ -10274,7 +11778,7 @@
       </w:rPr>
     </w:lvl>
   </w:abstractNum>
-  <w:abstractNum w:abstractNumId="17" w15:restartNumberingAfterBreak="0">
+  <w:abstractNum w:abstractNumId="19" w15:restartNumberingAfterBreak="0">
     <w:nsid w:val="467819F7"/>
     <w:multiLevelType w:val="multilevel"/>
     <w:tmpl w:val="99340086"/>
@@ -10387,7 +11891,120 @@
       </w:pPr>
     </w:lvl>
   </w:abstractNum>
-  <w:abstractNum w:abstractNumId="18" w15:restartNumberingAfterBreak="0">
+  <w:abstractNum w:abstractNumId="20" w15:restartNumberingAfterBreak="0">
+    <w:nsid w:val="478A29B5"/>
+    <w:multiLevelType w:val="multilevel"/>
+    <w:tmpl w:val="72362076"/>
+    <w:lvl w:ilvl="0">
+      <w:start w:val="1"/>
+      <w:numFmt w:val="decimal"/>
+      <w:lvlText w:val="%1."/>
+      <w:lvlJc w:val="left"/>
+      <w:pPr>
+        <w:tabs>
+          <w:tab w:val="num" w:pos="720"/>
+        </w:tabs>
+        <w:ind w:left="720" w:hanging="360"/>
+      </w:pPr>
+    </w:lvl>
+    <w:lvl w:ilvl="1" w:tentative="1">
+      <w:start w:val="1"/>
+      <w:numFmt w:val="decimal"/>
+      <w:lvlText w:val="%2."/>
+      <w:lvlJc w:val="left"/>
+      <w:pPr>
+        <w:tabs>
+          <w:tab w:val="num" w:pos="1440"/>
+        </w:tabs>
+        <w:ind w:left="1440" w:hanging="360"/>
+      </w:pPr>
+    </w:lvl>
+    <w:lvl w:ilvl="2" w:tentative="1">
+      <w:start w:val="1"/>
+      <w:numFmt w:val="decimal"/>
+      <w:lvlText w:val="%3."/>
+      <w:lvlJc w:val="left"/>
+      <w:pPr>
+        <w:tabs>
+          <w:tab w:val="num" w:pos="2160"/>
+        </w:tabs>
+        <w:ind w:left="2160" w:hanging="360"/>
+      </w:pPr>
+    </w:lvl>
+    <w:lvl w:ilvl="3" w:tentative="1">
+      <w:start w:val="1"/>
+      <w:numFmt w:val="decimal"/>
+      <w:lvlText w:val="%4."/>
+      <w:lvlJc w:val="left"/>
+      <w:pPr>
+        <w:tabs>
+          <w:tab w:val="num" w:pos="2880"/>
+        </w:tabs>
+        <w:ind w:left="2880" w:hanging="360"/>
+      </w:pPr>
+    </w:lvl>
+    <w:lvl w:ilvl="4" w:tentative="1">
+      <w:start w:val="1"/>
+      <w:numFmt w:val="decimal"/>
+      <w:lvlText w:val="%5."/>
+      <w:lvlJc w:val="left"/>
+      <w:pPr>
+        <w:tabs>
+          <w:tab w:val="num" w:pos="3600"/>
+        </w:tabs>
+        <w:ind w:left="3600" w:hanging="360"/>
+      </w:pPr>
+    </w:lvl>
+    <w:lvl w:ilvl="5" w:tentative="1">
+      <w:start w:val="1"/>
+      <w:numFmt w:val="decimal"/>
+      <w:lvlText w:val="%6."/>
+      <w:lvlJc w:val="left"/>
+      <w:pPr>
+        <w:tabs>
+          <w:tab w:val="num" w:pos="4320"/>
+        </w:tabs>
+        <w:ind w:left="4320" w:hanging="360"/>
+      </w:pPr>
+    </w:lvl>
+    <w:lvl w:ilvl="6" w:tentative="1">
+      <w:start w:val="1"/>
+      <w:numFmt w:val="decimal"/>
+      <w:lvlText w:val="%7."/>
+      <w:lvlJc w:val="left"/>
+      <w:pPr>
+        <w:tabs>
+          <w:tab w:val="num" w:pos="5040"/>
+        </w:tabs>
+        <w:ind w:left="5040" w:hanging="360"/>
+      </w:pPr>
+    </w:lvl>
+    <w:lvl w:ilvl="7" w:tentative="1">
+      <w:start w:val="1"/>
+      <w:numFmt w:val="decimal"/>
+      <w:lvlText w:val="%8."/>
+      <w:lvlJc w:val="left"/>
+      <w:pPr>
+        <w:tabs>
+          <w:tab w:val="num" w:pos="5760"/>
+        </w:tabs>
+        <w:ind w:left="5760" w:hanging="360"/>
+      </w:pPr>
+    </w:lvl>
+    <w:lvl w:ilvl="8" w:tentative="1">
+      <w:start w:val="1"/>
+      <w:numFmt w:val="decimal"/>
+      <w:lvlText w:val="%9."/>
+      <w:lvlJc w:val="left"/>
+      <w:pPr>
+        <w:tabs>
+          <w:tab w:val="num" w:pos="6480"/>
+        </w:tabs>
+        <w:ind w:left="6480" w:hanging="360"/>
+      </w:pPr>
+    </w:lvl>
+  </w:abstractNum>
+  <w:abstractNum w:abstractNumId="21" w15:restartNumberingAfterBreak="0">
     <w:nsid w:val="49950FAF"/>
     <w:multiLevelType w:val="multilevel"/>
     <w:tmpl w:val="DDEC31FE"/>
@@ -10536,7 +12153,120 @@
       </w:rPr>
     </w:lvl>
   </w:abstractNum>
-  <w:abstractNum w:abstractNumId="19" w15:restartNumberingAfterBreak="0">
+  <w:abstractNum w:abstractNumId="22" w15:restartNumberingAfterBreak="0">
+    <w:nsid w:val="4A1719BD"/>
+    <w:multiLevelType w:val="multilevel"/>
+    <w:tmpl w:val="2F007E20"/>
+    <w:lvl w:ilvl="0">
+      <w:start w:val="1"/>
+      <w:numFmt w:val="decimal"/>
+      <w:lvlText w:val="%1."/>
+      <w:lvlJc w:val="left"/>
+      <w:pPr>
+        <w:tabs>
+          <w:tab w:val="num" w:pos="720"/>
+        </w:tabs>
+        <w:ind w:left="720" w:hanging="360"/>
+      </w:pPr>
+    </w:lvl>
+    <w:lvl w:ilvl="1" w:tentative="1">
+      <w:start w:val="1"/>
+      <w:numFmt w:val="decimal"/>
+      <w:lvlText w:val="%2."/>
+      <w:lvlJc w:val="left"/>
+      <w:pPr>
+        <w:tabs>
+          <w:tab w:val="num" w:pos="1440"/>
+        </w:tabs>
+        <w:ind w:left="1440" w:hanging="360"/>
+      </w:pPr>
+    </w:lvl>
+    <w:lvl w:ilvl="2" w:tentative="1">
+      <w:start w:val="1"/>
+      <w:numFmt w:val="decimal"/>
+      <w:lvlText w:val="%3."/>
+      <w:lvlJc w:val="left"/>
+      <w:pPr>
+        <w:tabs>
+          <w:tab w:val="num" w:pos="2160"/>
+        </w:tabs>
+        <w:ind w:left="2160" w:hanging="360"/>
+      </w:pPr>
+    </w:lvl>
+    <w:lvl w:ilvl="3" w:tentative="1">
+      <w:start w:val="1"/>
+      <w:numFmt w:val="decimal"/>
+      <w:lvlText w:val="%4."/>
+      <w:lvlJc w:val="left"/>
+      <w:pPr>
+        <w:tabs>
+          <w:tab w:val="num" w:pos="2880"/>
+        </w:tabs>
+        <w:ind w:left="2880" w:hanging="360"/>
+      </w:pPr>
+    </w:lvl>
+    <w:lvl w:ilvl="4" w:tentative="1">
+      <w:start w:val="1"/>
+      <w:numFmt w:val="decimal"/>
+      <w:lvlText w:val="%5."/>
+      <w:lvlJc w:val="left"/>
+      <w:pPr>
+        <w:tabs>
+          <w:tab w:val="num" w:pos="3600"/>
+        </w:tabs>
+        <w:ind w:left="3600" w:hanging="360"/>
+      </w:pPr>
+    </w:lvl>
+    <w:lvl w:ilvl="5" w:tentative="1">
+      <w:start w:val="1"/>
+      <w:numFmt w:val="decimal"/>
+      <w:lvlText w:val="%6."/>
+      <w:lvlJc w:val="left"/>
+      <w:pPr>
+        <w:tabs>
+          <w:tab w:val="num" w:pos="4320"/>
+        </w:tabs>
+        <w:ind w:left="4320" w:hanging="360"/>
+      </w:pPr>
+    </w:lvl>
+    <w:lvl w:ilvl="6" w:tentative="1">
+      <w:start w:val="1"/>
+      <w:numFmt w:val="decimal"/>
+      <w:lvlText w:val="%7."/>
+      <w:lvlJc w:val="left"/>
+      <w:pPr>
+        <w:tabs>
+          <w:tab w:val="num" w:pos="5040"/>
+        </w:tabs>
+        <w:ind w:left="5040" w:hanging="360"/>
+      </w:pPr>
+    </w:lvl>
+    <w:lvl w:ilvl="7" w:tentative="1">
+      <w:start w:val="1"/>
+      <w:numFmt w:val="decimal"/>
+      <w:lvlText w:val="%8."/>
+      <w:lvlJc w:val="left"/>
+      <w:pPr>
+        <w:tabs>
+          <w:tab w:val="num" w:pos="5760"/>
+        </w:tabs>
+        <w:ind w:left="5760" w:hanging="360"/>
+      </w:pPr>
+    </w:lvl>
+    <w:lvl w:ilvl="8" w:tentative="1">
+      <w:start w:val="1"/>
+      <w:numFmt w:val="decimal"/>
+      <w:lvlText w:val="%9."/>
+      <w:lvlJc w:val="left"/>
+      <w:pPr>
+        <w:tabs>
+          <w:tab w:val="num" w:pos="6480"/>
+        </w:tabs>
+        <w:ind w:left="6480" w:hanging="360"/>
+      </w:pPr>
+    </w:lvl>
+  </w:abstractNum>
+  <w:abstractNum w:abstractNumId="23" w15:restartNumberingAfterBreak="0">
     <w:nsid w:val="4AB13DA4"/>
     <w:multiLevelType w:val="multilevel"/>
     <w:tmpl w:val="0FA69454"/>
@@ -10685,7 +12415,7 @@
       </w:rPr>
     </w:lvl>
   </w:abstractNum>
-  <w:abstractNum w:abstractNumId="20" w15:restartNumberingAfterBreak="0">
+  <w:abstractNum w:abstractNumId="24" w15:restartNumberingAfterBreak="0">
     <w:nsid w:val="4E0B3438"/>
     <w:multiLevelType w:val="multilevel"/>
     <w:tmpl w:val="04E2C06E"/>
@@ -10834,7 +12564,120 @@
       </w:rPr>
     </w:lvl>
   </w:abstractNum>
-  <w:abstractNum w:abstractNumId="21" w15:restartNumberingAfterBreak="0">
+  <w:abstractNum w:abstractNumId="25" w15:restartNumberingAfterBreak="0">
+    <w:nsid w:val="50465396"/>
+    <w:multiLevelType w:val="multilevel"/>
+    <w:tmpl w:val="BB02C032"/>
+    <w:lvl w:ilvl="0">
+      <w:start w:val="1"/>
+      <w:numFmt w:val="decimal"/>
+      <w:lvlText w:val="%1."/>
+      <w:lvlJc w:val="left"/>
+      <w:pPr>
+        <w:tabs>
+          <w:tab w:val="num" w:pos="720"/>
+        </w:tabs>
+        <w:ind w:left="720" w:hanging="360"/>
+      </w:pPr>
+    </w:lvl>
+    <w:lvl w:ilvl="1" w:tentative="1">
+      <w:start w:val="1"/>
+      <w:numFmt w:val="decimal"/>
+      <w:lvlText w:val="%2."/>
+      <w:lvlJc w:val="left"/>
+      <w:pPr>
+        <w:tabs>
+          <w:tab w:val="num" w:pos="1440"/>
+        </w:tabs>
+        <w:ind w:left="1440" w:hanging="360"/>
+      </w:pPr>
+    </w:lvl>
+    <w:lvl w:ilvl="2" w:tentative="1">
+      <w:start w:val="1"/>
+      <w:numFmt w:val="decimal"/>
+      <w:lvlText w:val="%3."/>
+      <w:lvlJc w:val="left"/>
+      <w:pPr>
+        <w:tabs>
+          <w:tab w:val="num" w:pos="2160"/>
+        </w:tabs>
+        <w:ind w:left="2160" w:hanging="360"/>
+      </w:pPr>
+    </w:lvl>
+    <w:lvl w:ilvl="3" w:tentative="1">
+      <w:start w:val="1"/>
+      <w:numFmt w:val="decimal"/>
+      <w:lvlText w:val="%4."/>
+      <w:lvlJc w:val="left"/>
+      <w:pPr>
+        <w:tabs>
+          <w:tab w:val="num" w:pos="2880"/>
+        </w:tabs>
+        <w:ind w:left="2880" w:hanging="360"/>
+      </w:pPr>
+    </w:lvl>
+    <w:lvl w:ilvl="4" w:tentative="1">
+      <w:start w:val="1"/>
+      <w:numFmt w:val="decimal"/>
+      <w:lvlText w:val="%5."/>
+      <w:lvlJc w:val="left"/>
+      <w:pPr>
+        <w:tabs>
+          <w:tab w:val="num" w:pos="3600"/>
+        </w:tabs>
+        <w:ind w:left="3600" w:hanging="360"/>
+      </w:pPr>
+    </w:lvl>
+    <w:lvl w:ilvl="5" w:tentative="1">
+      <w:start w:val="1"/>
+      <w:numFmt w:val="decimal"/>
+      <w:lvlText w:val="%6."/>
+      <w:lvlJc w:val="left"/>
+      <w:pPr>
+        <w:tabs>
+          <w:tab w:val="num" w:pos="4320"/>
+        </w:tabs>
+        <w:ind w:left="4320" w:hanging="360"/>
+      </w:pPr>
+    </w:lvl>
+    <w:lvl w:ilvl="6" w:tentative="1">
+      <w:start w:val="1"/>
+      <w:numFmt w:val="decimal"/>
+      <w:lvlText w:val="%7."/>
+      <w:lvlJc w:val="left"/>
+      <w:pPr>
+        <w:tabs>
+          <w:tab w:val="num" w:pos="5040"/>
+        </w:tabs>
+        <w:ind w:left="5040" w:hanging="360"/>
+      </w:pPr>
+    </w:lvl>
+    <w:lvl w:ilvl="7" w:tentative="1">
+      <w:start w:val="1"/>
+      <w:numFmt w:val="decimal"/>
+      <w:lvlText w:val="%8."/>
+      <w:lvlJc w:val="left"/>
+      <w:pPr>
+        <w:tabs>
+          <w:tab w:val="num" w:pos="5760"/>
+        </w:tabs>
+        <w:ind w:left="5760" w:hanging="360"/>
+      </w:pPr>
+    </w:lvl>
+    <w:lvl w:ilvl="8" w:tentative="1">
+      <w:start w:val="1"/>
+      <w:numFmt w:val="decimal"/>
+      <w:lvlText w:val="%9."/>
+      <w:lvlJc w:val="left"/>
+      <w:pPr>
+        <w:tabs>
+          <w:tab w:val="num" w:pos="6480"/>
+        </w:tabs>
+        <w:ind w:left="6480" w:hanging="360"/>
+      </w:pPr>
+    </w:lvl>
+  </w:abstractNum>
+  <w:abstractNum w:abstractNumId="26" w15:restartNumberingAfterBreak="0">
     <w:nsid w:val="58E76910"/>
     <w:multiLevelType w:val="multilevel"/>
     <w:tmpl w:val="96D4D970"/>
@@ -10983,7 +12826,156 @@
       </w:rPr>
     </w:lvl>
   </w:abstractNum>
-  <w:abstractNum w:abstractNumId="22" w15:restartNumberingAfterBreak="0">
+  <w:abstractNum w:abstractNumId="27" w15:restartNumberingAfterBreak="0">
+    <w:nsid w:val="5B1463D8"/>
+    <w:multiLevelType w:val="multilevel"/>
+    <w:tmpl w:val="3E9443AE"/>
+    <w:lvl w:ilvl="0">
+      <w:start w:val="1"/>
+      <w:numFmt w:val="bullet"/>
+      <w:lvlText w:val=""/>
+      <w:lvlJc w:val="left"/>
+      <w:pPr>
+        <w:tabs>
+          <w:tab w:val="num" w:pos="720"/>
+        </w:tabs>
+        <w:ind w:left="720" w:hanging="360"/>
+      </w:pPr>
+      <w:rPr>
+        <w:rFonts w:ascii="Symbol" w:hAnsi="Symbol" w:hint="default"/>
+        <w:sz w:val="20"/>
+      </w:rPr>
+    </w:lvl>
+    <w:lvl w:ilvl="1" w:tentative="1">
+      <w:start w:val="1"/>
+      <w:numFmt w:val="bullet"/>
+      <w:lvlText w:val="o"/>
+      <w:lvlJc w:val="left"/>
+      <w:pPr>
+        <w:tabs>
+          <w:tab w:val="num" w:pos="1440"/>
+        </w:tabs>
+        <w:ind w:left="1440" w:hanging="360"/>
+      </w:pPr>
+      <w:rPr>
+        <w:rFonts w:ascii="Courier New" w:hAnsi="Courier New" w:hint="default"/>
+        <w:sz w:val="20"/>
+      </w:rPr>
+    </w:lvl>
+    <w:lvl w:ilvl="2" w:tentative="1">
+      <w:start w:val="1"/>
+      <w:numFmt w:val="bullet"/>
+      <w:lvlText w:val=""/>
+      <w:lvlJc w:val="left"/>
+      <w:pPr>
+        <w:tabs>
+          <w:tab w:val="num" w:pos="2160"/>
+        </w:tabs>
+        <w:ind w:left="2160" w:hanging="360"/>
+      </w:pPr>
+      <w:rPr>
+        <w:rFonts w:ascii="Wingdings" w:hAnsi="Wingdings" w:hint="default"/>
+        <w:sz w:val="20"/>
+      </w:rPr>
+    </w:lvl>
+    <w:lvl w:ilvl="3" w:tentative="1">
+      <w:start w:val="1"/>
+      <w:numFmt w:val="bullet"/>
+      <w:lvlText w:val=""/>
+      <w:lvlJc w:val="left"/>
+      <w:pPr>
+        <w:tabs>
+          <w:tab w:val="num" w:pos="2880"/>
+        </w:tabs>
+        <w:ind w:left="2880" w:hanging="360"/>
+      </w:pPr>
+      <w:rPr>
+        <w:rFonts w:ascii="Wingdings" w:hAnsi="Wingdings" w:hint="default"/>
+        <w:sz w:val="20"/>
+      </w:rPr>
+    </w:lvl>
+    <w:lvl w:ilvl="4" w:tentative="1">
+      <w:start w:val="1"/>
+      <w:numFmt w:val="bullet"/>
+      <w:lvlText w:val=""/>
+      <w:lvlJc w:val="left"/>
+      <w:pPr>
+        <w:tabs>
+          <w:tab w:val="num" w:pos="3600"/>
+        </w:tabs>
+        <w:ind w:left="3600" w:hanging="360"/>
+      </w:pPr>
+      <w:rPr>
+        <w:rFonts w:ascii="Wingdings" w:hAnsi="Wingdings" w:hint="default"/>
+        <w:sz w:val="20"/>
+      </w:rPr>
+    </w:lvl>
+    <w:lvl w:ilvl="5" w:tentative="1">
+      <w:start w:val="1"/>
+      <w:numFmt w:val="bullet"/>
+      <w:lvlText w:val=""/>
+      <w:lvlJc w:val="left"/>
+      <w:pPr>
+        <w:tabs>
+          <w:tab w:val="num" w:pos="4320"/>
+        </w:tabs>
+        <w:ind w:left="4320" w:hanging="360"/>
+      </w:pPr>
+      <w:rPr>
+        <w:rFonts w:ascii="Wingdings" w:hAnsi="Wingdings" w:hint="default"/>
+        <w:sz w:val="20"/>
+      </w:rPr>
+    </w:lvl>
+    <w:lvl w:ilvl="6" w:tentative="1">
+      <w:start w:val="1"/>
+      <w:numFmt w:val="bullet"/>
+      <w:lvlText w:val=""/>
+      <w:lvlJc w:val="left"/>
+      <w:pPr>
+        <w:tabs>
+          <w:tab w:val="num" w:pos="5040"/>
+        </w:tabs>
+        <w:ind w:left="5040" w:hanging="360"/>
+      </w:pPr>
+      <w:rPr>
+        <w:rFonts w:ascii="Wingdings" w:hAnsi="Wingdings" w:hint="default"/>
+        <w:sz w:val="20"/>
+      </w:rPr>
+    </w:lvl>
+    <w:lvl w:ilvl="7" w:tentative="1">
+      <w:start w:val="1"/>
+      <w:numFmt w:val="bullet"/>
+      <w:lvlText w:val=""/>
+      <w:lvlJc w:val="left"/>
+      <w:pPr>
+        <w:tabs>
+          <w:tab w:val="num" w:pos="5760"/>
+        </w:tabs>
+        <w:ind w:left="5760" w:hanging="360"/>
+      </w:pPr>
+      <w:rPr>
+        <w:rFonts w:ascii="Wingdings" w:hAnsi="Wingdings" w:hint="default"/>
+        <w:sz w:val="20"/>
+      </w:rPr>
+    </w:lvl>
+    <w:lvl w:ilvl="8" w:tentative="1">
+      <w:start w:val="1"/>
+      <w:numFmt w:val="bullet"/>
+      <w:lvlText w:val=""/>
+      <w:lvlJc w:val="left"/>
+      <w:pPr>
+        <w:tabs>
+          <w:tab w:val="num" w:pos="6480"/>
+        </w:tabs>
+        <w:ind w:left="6480" w:hanging="360"/>
+      </w:pPr>
+      <w:rPr>
+        <w:rFonts w:ascii="Wingdings" w:hAnsi="Wingdings" w:hint="default"/>
+        <w:sz w:val="20"/>
+      </w:rPr>
+    </w:lvl>
+  </w:abstractNum>
+  <w:abstractNum w:abstractNumId="28" w15:restartNumberingAfterBreak="0">
     <w:nsid w:val="65025CAA"/>
     <w:multiLevelType w:val="multilevel"/>
     <w:tmpl w:val="4964E1AA"/>
@@ -11132,7 +13124,7 @@
       </w:rPr>
     </w:lvl>
   </w:abstractNum>
-  <w:abstractNum w:abstractNumId="23" w15:restartNumberingAfterBreak="0">
+  <w:abstractNum w:abstractNumId="29" w15:restartNumberingAfterBreak="0">
     <w:nsid w:val="66841DAA"/>
     <w:multiLevelType w:val="multilevel"/>
     <w:tmpl w:val="546C3614"/>
@@ -11281,7 +13273,7 @@
       </w:rPr>
     </w:lvl>
   </w:abstractNum>
-  <w:abstractNum w:abstractNumId="24" w15:restartNumberingAfterBreak="0">
+  <w:abstractNum w:abstractNumId="30" w15:restartNumberingAfterBreak="0">
     <w:nsid w:val="6FE62A81"/>
     <w:multiLevelType w:val="multilevel"/>
     <w:tmpl w:val="B8AE6C00"/>
@@ -11394,7 +13386,7 @@
       </w:pPr>
     </w:lvl>
   </w:abstractNum>
-  <w:abstractNum w:abstractNumId="25" w15:restartNumberingAfterBreak="0">
+  <w:abstractNum w:abstractNumId="31" w15:restartNumberingAfterBreak="0">
     <w:nsid w:val="72AA35BF"/>
     <w:multiLevelType w:val="multilevel"/>
     <w:tmpl w:val="5C965086"/>
@@ -11544,82 +13536,100 @@
     </w:lvl>
   </w:abstractNum>
   <w:num w:numId="1" w16cid:durableId="431248552">
-    <w:abstractNumId w:val="14"/>
+    <w:abstractNumId w:val="16"/>
   </w:num>
   <w:num w:numId="2" w16cid:durableId="1486580539">
+    <w:abstractNumId w:val="4"/>
+  </w:num>
+  <w:num w:numId="3" w16cid:durableId="1608192328">
+    <w:abstractNumId w:val="24"/>
+  </w:num>
+  <w:num w:numId="4" w16cid:durableId="1639069128">
+    <w:abstractNumId w:val="23"/>
+  </w:num>
+  <w:num w:numId="5" w16cid:durableId="1048797234">
     <w:abstractNumId w:val="3"/>
   </w:num>
-  <w:num w:numId="3" w16cid:durableId="1608192328">
-    <w:abstractNumId w:val="20"/>
+  <w:num w:numId="6" w16cid:durableId="93021018">
+    <w:abstractNumId w:val="29"/>
   </w:num>
-  <w:num w:numId="4" w16cid:durableId="1639069128">
+  <w:num w:numId="7" w16cid:durableId="1104881592">
     <w:abstractNumId w:val="19"/>
   </w:num>
-  <w:num w:numId="5" w16cid:durableId="1048797234">
-    <w:abstractNumId w:val="2"/>
-  </w:num>
-  <w:num w:numId="6" w16cid:durableId="93021018">
-    <w:abstractNumId w:val="23"/>
-  </w:num>
-  <w:num w:numId="7" w16cid:durableId="1104881592">
-    <w:abstractNumId w:val="17"/>
-  </w:num>
   <w:num w:numId="8" w16cid:durableId="384303804">
-    <w:abstractNumId w:val="5"/>
+    <w:abstractNumId w:val="6"/>
   </w:num>
   <w:num w:numId="9" w16cid:durableId="1174033075">
-    <w:abstractNumId w:val="6"/>
+    <w:abstractNumId w:val="7"/>
   </w:num>
   <w:num w:numId="10" w16cid:durableId="716900506">
     <w:abstractNumId w:val="1"/>
   </w:num>
   <w:num w:numId="11" w16cid:durableId="845359796">
-    <w:abstractNumId w:val="7"/>
+    <w:abstractNumId w:val="8"/>
   </w:num>
   <w:num w:numId="12" w16cid:durableId="205413393">
-    <w:abstractNumId w:val="12"/>
+    <w:abstractNumId w:val="14"/>
   </w:num>
   <w:num w:numId="13" w16cid:durableId="516045932">
+    <w:abstractNumId w:val="21"/>
+  </w:num>
+  <w:num w:numId="14" w16cid:durableId="1040476145">
+    <w:abstractNumId w:val="17"/>
+  </w:num>
+  <w:num w:numId="15" w16cid:durableId="1228688926">
     <w:abstractNumId w:val="18"/>
   </w:num>
-  <w:num w:numId="14" w16cid:durableId="1040476145">
+  <w:num w:numId="16" w16cid:durableId="1881165064">
+    <w:abstractNumId w:val="9"/>
+  </w:num>
+  <w:num w:numId="17" w16cid:durableId="1856462126">
+    <w:abstractNumId w:val="30"/>
+  </w:num>
+  <w:num w:numId="18" w16cid:durableId="2003119084">
+    <w:abstractNumId w:val="28"/>
+  </w:num>
+  <w:num w:numId="19" w16cid:durableId="2035107415">
+    <w:abstractNumId w:val="13"/>
+  </w:num>
+  <w:num w:numId="20" w16cid:durableId="865145293">
     <w:abstractNumId w:val="15"/>
   </w:num>
-  <w:num w:numId="15" w16cid:durableId="1228688926">
-    <w:abstractNumId w:val="16"/>
-  </w:num>
-  <w:num w:numId="16" w16cid:durableId="1881165064">
-    <w:abstractNumId w:val="8"/>
-  </w:num>
-  <w:num w:numId="17" w16cid:durableId="1856462126">
-    <w:abstractNumId w:val="24"/>
-  </w:num>
-  <w:num w:numId="18" w16cid:durableId="2003119084">
-    <w:abstractNumId w:val="22"/>
-  </w:num>
-  <w:num w:numId="19" w16cid:durableId="2035107415">
-    <w:abstractNumId w:val="11"/>
-  </w:num>
-  <w:num w:numId="20" w16cid:durableId="865145293">
-    <w:abstractNumId w:val="13"/>
-  </w:num>
   <w:num w:numId="21" w16cid:durableId="233129795">
-    <w:abstractNumId w:val="4"/>
+    <w:abstractNumId w:val="5"/>
   </w:num>
   <w:num w:numId="22" w16cid:durableId="1506286140">
-    <w:abstractNumId w:val="10"/>
+    <w:abstractNumId w:val="11"/>
   </w:num>
   <w:num w:numId="23" w16cid:durableId="2075466915">
     <w:abstractNumId w:val="0"/>
   </w:num>
   <w:num w:numId="24" w16cid:durableId="403340664">
-    <w:abstractNumId w:val="21"/>
+    <w:abstractNumId w:val="26"/>
   </w:num>
   <w:num w:numId="25" w16cid:durableId="1688671282">
-    <w:abstractNumId w:val="9"/>
+    <w:abstractNumId w:val="10"/>
   </w:num>
   <w:num w:numId="26" w16cid:durableId="1380322845">
+    <w:abstractNumId w:val="31"/>
+  </w:num>
+  <w:num w:numId="27" w16cid:durableId="1266645919">
+    <w:abstractNumId w:val="20"/>
+  </w:num>
+  <w:num w:numId="28" w16cid:durableId="2069067946">
+    <w:abstractNumId w:val="27"/>
+  </w:num>
+  <w:num w:numId="29" w16cid:durableId="1784492303">
+    <w:abstractNumId w:val="12"/>
+  </w:num>
+  <w:num w:numId="30" w16cid:durableId="1474979399">
     <w:abstractNumId w:val="25"/>
+  </w:num>
+  <w:num w:numId="31" w16cid:durableId="443623990">
+    <w:abstractNumId w:val="22"/>
+  </w:num>
+  <w:num w:numId="32" w16cid:durableId="1330324495">
+    <w:abstractNumId w:val="2"/>
   </w:num>
 </w:numbering>
 </file>

</xml_diff>

<commit_message>
feat: Implemented JWT Authentication, Admin Login UI, and Protected Routes
</commit_message>
<xml_diff>
--- a/documents/The Complete Step-by-Step Implementation logic.docx
+++ b/documents/The Complete Step-by-Step Implementation logic.docx
@@ -8896,6 +8896,746 @@
         <w:pStyle w:val="NormalWeb"/>
         <w:rPr>
           <w:rFonts w:ascii="Aptos" w:hAnsi="Aptos"/>
+          <w:b/>
+          <w:bCs/>
+          <w:color w:val="4472C4" w:themeColor="accent1"/>
+          <w:sz w:val="36"/>
+          <w:szCs w:val="36"/>
+          <w:u w:val="single"/>
+        </w:rPr>
+      </w:pPr>
+      <w:r>
+        <w:rPr>
+          <w:rFonts w:ascii="Segoe UI Emoji" w:hAnsi="Segoe UI Emoji" w:cs="Segoe UI Emoji"/>
+          <w:b/>
+          <w:bCs/>
+          <w:color w:val="4472C4" w:themeColor="accent1"/>
+          <w:sz w:val="36"/>
+          <w:szCs w:val="36"/>
+          <w:u w:val="single"/>
+        </w:rPr>
+        <w:t>🚀</w:t>
+      </w:r>
+      <w:r>
+        <w:rPr>
+          <w:rFonts w:ascii="Aptos" w:hAnsi="Aptos"/>
+          <w:b/>
+          <w:bCs/>
+          <w:color w:val="4472C4" w:themeColor="accent1"/>
+          <w:sz w:val="36"/>
+          <w:szCs w:val="36"/>
+          <w:u w:val="single"/>
+        </w:rPr>
+        <w:t xml:space="preserve"> Recent Architecture &amp; UI Upgrades (v2.0)</w:t>
+      </w:r>
+    </w:p>
+    <w:p>
+      <w:pPr>
+        <w:pStyle w:val="NormalWeb"/>
+        <w:rPr>
+          <w:rFonts w:ascii="Aptos" w:hAnsi="Aptos"/>
+          <w:b/>
+          <w:bCs/>
+        </w:rPr>
+      </w:pPr>
+      <w:r>
+        <w:rPr>
+          <w:rFonts w:ascii="Aptos" w:hAnsi="Aptos"/>
+          <w:b/>
+          <w:bCs/>
+        </w:rPr>
+        <w:t>1. The Boot-Up Terminal (Cybernetic Welcome Sequence)</w:t>
+      </w:r>
+    </w:p>
+    <w:p>
+      <w:pPr>
+        <w:pStyle w:val="NormalWeb"/>
+        <w:numPr>
+          <w:ilvl w:val="0"/>
+          <w:numId w:val="33"/>
+        </w:numPr>
+        <w:rPr>
+          <w:rFonts w:ascii="Aptos" w:hAnsi="Aptos"/>
+        </w:rPr>
+      </w:pPr>
+      <w:r>
+        <w:rPr>
+          <w:rFonts w:ascii="Aptos" w:hAnsi="Aptos"/>
+          <w:b/>
+          <w:bCs/>
+        </w:rPr>
+        <w:t>Feature:</w:t>
+      </w:r>
+      <w:r>
+        <w:rPr>
+          <w:rFonts w:ascii="Aptos" w:hAnsi="Aptos"/>
+        </w:rPr>
+        <w:t xml:space="preserve"> Upon initializing the dashboard, users are greeted with a dark-mode, animated terminal that types out the system boot sequence, establishing the context of the autonomous grid.</w:t>
+      </w:r>
+    </w:p>
+    <w:p>
+      <w:pPr>
+        <w:pStyle w:val="NormalWeb"/>
+        <w:numPr>
+          <w:ilvl w:val="0"/>
+          <w:numId w:val="33"/>
+        </w:numPr>
+        <w:rPr>
+          <w:rFonts w:ascii="Aptos" w:hAnsi="Aptos"/>
+        </w:rPr>
+      </w:pPr>
+      <w:r>
+        <w:rPr>
+          <w:rFonts w:ascii="Aptos" w:hAnsi="Aptos"/>
+          <w:b/>
+          <w:bCs/>
+        </w:rPr>
+        <w:lastRenderedPageBreak/>
+        <w:t>Under the Hood (Logic):</w:t>
+      </w:r>
+      <w:r>
+        <w:rPr>
+          <w:rFonts w:ascii="Aptos" w:hAnsi="Aptos"/>
+        </w:rPr>
+        <w:t xml:space="preserve"> This is powered by a custom React </w:t>
+      </w:r>
+      <w:proofErr w:type="spellStart"/>
+      <w:r>
+        <w:rPr>
+          <w:rFonts w:ascii="Aptos" w:hAnsi="Aptos"/>
+        </w:rPr>
+        <w:t>useEffect</w:t>
+      </w:r>
+      <w:proofErr w:type="spellEnd"/>
+      <w:r>
+        <w:rPr>
+          <w:rFonts w:ascii="Aptos" w:hAnsi="Aptos"/>
+        </w:rPr>
+        <w:t xml:space="preserve"> hook paired with a </w:t>
+      </w:r>
+      <w:proofErr w:type="spellStart"/>
+      <w:r>
+        <w:rPr>
+          <w:rFonts w:ascii="Aptos" w:hAnsi="Aptos"/>
+        </w:rPr>
+        <w:t>setInterval</w:t>
+      </w:r>
+      <w:proofErr w:type="spellEnd"/>
+      <w:r>
+        <w:rPr>
+          <w:rFonts w:ascii="Aptos" w:hAnsi="Aptos"/>
+        </w:rPr>
+        <w:t xml:space="preserve"> timer. Instead of a static block of text, the component actively slices a master string and appends it to the DOM character-by-character every 30 milliseconds. It is bound to a </w:t>
+      </w:r>
+      <w:proofErr w:type="spellStart"/>
+      <w:r>
+        <w:rPr>
+          <w:rFonts w:ascii="Aptos" w:hAnsi="Aptos"/>
+        </w:rPr>
+        <w:t>showTerminal</w:t>
+      </w:r>
+      <w:proofErr w:type="spellEnd"/>
+      <w:r>
+        <w:rPr>
+          <w:rFonts w:ascii="Aptos" w:hAnsi="Aptos"/>
+        </w:rPr>
+        <w:t xml:space="preserve"> state, allowing the user to unmount and permanently dismiss the component from the DOM to reclaim screen space once initialized.</w:t>
+      </w:r>
+    </w:p>
+    <w:p>
+      <w:pPr>
+        <w:pStyle w:val="NormalWeb"/>
+        <w:rPr>
+          <w:rFonts w:ascii="Aptos" w:hAnsi="Aptos"/>
+          <w:b/>
+          <w:bCs/>
+        </w:rPr>
+      </w:pPr>
+      <w:r>
+        <w:rPr>
+          <w:rFonts w:ascii="Aptos" w:hAnsi="Aptos"/>
+          <w:b/>
+          <w:bCs/>
+        </w:rPr>
+        <w:t>2. Live System Blueprint (Data Flow Animation)</w:t>
+      </w:r>
+    </w:p>
+    <w:p>
+      <w:pPr>
+        <w:pStyle w:val="NormalWeb"/>
+        <w:numPr>
+          <w:ilvl w:val="0"/>
+          <w:numId w:val="34"/>
+        </w:numPr>
+        <w:rPr>
+          <w:rFonts w:ascii="Aptos" w:hAnsi="Aptos"/>
+        </w:rPr>
+      </w:pPr>
+      <w:r>
+        <w:rPr>
+          <w:rFonts w:ascii="Aptos" w:hAnsi="Aptos"/>
+          <w:b/>
+          <w:bCs/>
+        </w:rPr>
+        <w:t>Feature:</w:t>
+      </w:r>
+      <w:r>
+        <w:rPr>
+          <w:rFonts w:ascii="Aptos" w:hAnsi="Aptos"/>
+        </w:rPr>
+        <w:t xml:space="preserve"> A real-time, glowing schematic that visually traces the flow of telemetry from the physical </w:t>
+      </w:r>
+      <w:r>
+        <w:rPr>
+          <w:rFonts w:ascii="Aptos" w:hAnsi="Aptos"/>
+          <w:b/>
+          <w:bCs/>
+        </w:rPr>
+        <w:t>IoT Sensors</w:t>
+      </w:r>
+      <w:r>
+        <w:rPr>
+          <w:rFonts w:ascii="Aptos" w:hAnsi="Aptos"/>
+        </w:rPr>
+        <w:t xml:space="preserve">, into the </w:t>
+      </w:r>
+      <w:r>
+        <w:rPr>
+          <w:rFonts w:ascii="Aptos" w:hAnsi="Aptos"/>
+          <w:b/>
+          <w:bCs/>
+        </w:rPr>
+        <w:t>PostgreSQL Vault</w:t>
+      </w:r>
+      <w:r>
+        <w:rPr>
+          <w:rFonts w:ascii="Aptos" w:hAnsi="Aptos"/>
+        </w:rPr>
+        <w:t xml:space="preserve">, through the </w:t>
+      </w:r>
+      <w:r>
+        <w:rPr>
+          <w:rFonts w:ascii="Aptos" w:hAnsi="Aptos"/>
+          <w:b/>
+          <w:bCs/>
+        </w:rPr>
+        <w:t>Python AI Engine</w:t>
+      </w:r>
+      <w:r>
+        <w:rPr>
+          <w:rFonts w:ascii="Aptos" w:hAnsi="Aptos"/>
+        </w:rPr>
+        <w:t xml:space="preserve">, and finally to the </w:t>
+      </w:r>
+      <w:r>
+        <w:rPr>
+          <w:rFonts w:ascii="Aptos" w:hAnsi="Aptos"/>
+          <w:b/>
+          <w:bCs/>
+        </w:rPr>
+        <w:t>Smart Valve Actuator</w:t>
+      </w:r>
+      <w:r>
+        <w:rPr>
+          <w:rFonts w:ascii="Aptos" w:hAnsi="Aptos"/>
+        </w:rPr>
+        <w:t>.</w:t>
+      </w:r>
+    </w:p>
+    <w:p>
+      <w:pPr>
+        <w:pStyle w:val="NormalWeb"/>
+        <w:numPr>
+          <w:ilvl w:val="0"/>
+          <w:numId w:val="34"/>
+        </w:numPr>
+        <w:rPr>
+          <w:rFonts w:ascii="Aptos" w:hAnsi="Aptos"/>
+        </w:rPr>
+      </w:pPr>
+      <w:r>
+        <w:rPr>
+          <w:rFonts w:ascii="Aptos" w:hAnsi="Aptos"/>
+          <w:b/>
+          <w:bCs/>
+        </w:rPr>
+        <w:t>Under the Hood (Logic):</w:t>
+      </w:r>
+      <w:r>
+        <w:rPr>
+          <w:rFonts w:ascii="Aptos" w:hAnsi="Aptos"/>
+        </w:rPr>
+        <w:t xml:space="preserve"> This avoids heavy, laggy JavaScript canvas libraries. Instead, it utilizes hardware-accelerated CSS Keyframe animations. Absolute-positioned div elements (representing data packets) are animated using transform: translate and opacity fading. By staggering the animation-delay on multiple packets, it creates a continuous, infinite data-flow visual that requires zero backend processing power.</w:t>
+      </w:r>
+    </w:p>
+    <w:p>
+      <w:pPr>
+        <w:pStyle w:val="NormalWeb"/>
+        <w:rPr>
+          <w:rFonts w:ascii="Aptos" w:hAnsi="Aptos"/>
+          <w:b/>
+          <w:bCs/>
+        </w:rPr>
+      </w:pPr>
+      <w:r>
+        <w:rPr>
+          <w:rFonts w:ascii="Aptos" w:hAnsi="Aptos"/>
+          <w:b/>
+          <w:bCs/>
+        </w:rPr>
+        <w:t>3. "Digital Twin" Cyber-Physical Simulation</w:t>
+      </w:r>
+    </w:p>
+    <w:p>
+      <w:pPr>
+        <w:pStyle w:val="NormalWeb"/>
+        <w:numPr>
+          <w:ilvl w:val="0"/>
+          <w:numId w:val="35"/>
+        </w:numPr>
+        <w:rPr>
+          <w:rFonts w:ascii="Aptos" w:hAnsi="Aptos"/>
+        </w:rPr>
+      </w:pPr>
+      <w:r>
+        <w:rPr>
+          <w:rFonts w:ascii="Aptos" w:hAnsi="Aptos"/>
+          <w:b/>
+          <w:bCs/>
+        </w:rPr>
+        <w:t>Feature:</w:t>
+      </w:r>
+      <w:r>
+        <w:rPr>
+          <w:rFonts w:ascii="Aptos" w:hAnsi="Aptos"/>
+        </w:rPr>
+        <w:t xml:space="preserve"> A live, animated cross-section of the water pipeline that dynamically reacts to the AI's predictions.</w:t>
+      </w:r>
+    </w:p>
+    <w:p>
+      <w:pPr>
+        <w:pStyle w:val="NormalWeb"/>
+        <w:numPr>
+          <w:ilvl w:val="0"/>
+          <w:numId w:val="35"/>
+        </w:numPr>
+        <w:rPr>
+          <w:rFonts w:ascii="Aptos" w:hAnsi="Aptos"/>
+        </w:rPr>
+      </w:pPr>
+      <w:r>
+        <w:rPr>
+          <w:rFonts w:ascii="Aptos" w:hAnsi="Aptos"/>
+          <w:b/>
+          <w:bCs/>
+        </w:rPr>
+        <w:t>Under the Hood (Logic):</w:t>
+      </w:r>
+      <w:r>
+        <w:rPr>
+          <w:rFonts w:ascii="Aptos" w:hAnsi="Aptos"/>
+        </w:rPr>
+        <w:t xml:space="preserve"> The component constantly monitors the </w:t>
+      </w:r>
+      <w:proofErr w:type="spellStart"/>
+      <w:r>
+        <w:rPr>
+          <w:rFonts w:ascii="Aptos" w:hAnsi="Aptos"/>
+        </w:rPr>
+        <w:t>latestReading</w:t>
+      </w:r>
+      <w:proofErr w:type="spellEnd"/>
+      <w:r>
+        <w:rPr>
+          <w:rFonts w:ascii="Aptos" w:hAnsi="Aptos"/>
+        </w:rPr>
+        <w:t xml:space="preserve"> object from the derived state.</w:t>
+      </w:r>
+    </w:p>
+    <w:p>
+      <w:pPr>
+        <w:pStyle w:val="NormalWeb"/>
+        <w:numPr>
+          <w:ilvl w:val="1"/>
+          <w:numId w:val="35"/>
+        </w:numPr>
+        <w:rPr>
+          <w:rFonts w:ascii="Aptos" w:hAnsi="Aptos"/>
+        </w:rPr>
+      </w:pPr>
+      <w:r>
+        <w:rPr>
+          <w:rFonts w:ascii="Aptos" w:hAnsi="Aptos"/>
+          <w:b/>
+          <w:bCs/>
+        </w:rPr>
+        <w:t>Safe State:</w:t>
+      </w:r>
+      <w:r>
+        <w:rPr>
+          <w:rFonts w:ascii="Aptos" w:hAnsi="Aptos"/>
+        </w:rPr>
+        <w:t xml:space="preserve"> It applies an infinite CSS background-position animation over a blue linear gradient, simulating flowing water.</w:t>
+      </w:r>
+    </w:p>
+    <w:p>
+      <w:pPr>
+        <w:pStyle w:val="NormalWeb"/>
+        <w:numPr>
+          <w:ilvl w:val="1"/>
+          <w:numId w:val="35"/>
+        </w:numPr>
+        <w:rPr>
+          <w:rFonts w:ascii="Aptos" w:hAnsi="Aptos"/>
+        </w:rPr>
+      </w:pPr>
+      <w:r>
+        <w:rPr>
+          <w:rFonts w:ascii="Aptos" w:hAnsi="Aptos"/>
+          <w:b/>
+          <w:bCs/>
+        </w:rPr>
+        <w:t>Critical State:</w:t>
+      </w:r>
+      <w:r>
+        <w:rPr>
+          <w:rFonts w:ascii="Aptos" w:hAnsi="Aptos"/>
+        </w:rPr>
+        <w:t xml:space="preserve"> If the AI flags an anomaly, React triggers a conditional class swap. The gradient turns toxic red, the flow animation halts, and a CSS transition smoothly translates the Y-axis of the metal valve div downward, visually simulating the physical lockdown of the municipal supply.</w:t>
+      </w:r>
+    </w:p>
+    <w:p>
+      <w:pPr>
+        <w:pStyle w:val="NormalWeb"/>
+        <w:rPr>
+          <w:rFonts w:ascii="Aptos" w:hAnsi="Aptos"/>
+          <w:b/>
+          <w:bCs/>
+        </w:rPr>
+      </w:pPr>
+      <w:r>
+        <w:rPr>
+          <w:rFonts w:ascii="Aptos" w:hAnsi="Aptos"/>
+          <w:b/>
+          <w:bCs/>
+        </w:rPr>
+        <w:t>4. IoT Fleet Diagnostics (Hardware Simulation)</w:t>
+      </w:r>
+    </w:p>
+    <w:p>
+      <w:pPr>
+        <w:pStyle w:val="NormalWeb"/>
+        <w:numPr>
+          <w:ilvl w:val="0"/>
+          <w:numId w:val="36"/>
+        </w:numPr>
+        <w:rPr>
+          <w:rFonts w:ascii="Aptos" w:hAnsi="Aptos"/>
+        </w:rPr>
+      </w:pPr>
+      <w:r>
+        <w:rPr>
+          <w:rFonts w:ascii="Aptos" w:hAnsi="Aptos"/>
+          <w:b/>
+          <w:bCs/>
+        </w:rPr>
+        <w:t>Feature:</w:t>
+      </w:r>
+      <w:r>
+        <w:rPr>
+          <w:rFonts w:ascii="Aptos" w:hAnsi="Aptos"/>
+        </w:rPr>
+        <w:t xml:space="preserve"> A horizontally scrolling dashboard tracking the physical health of the sensor fleet, including Battery Life, Wi-Fi Telemetry Signal, and Calibration Drift for every unique location.</w:t>
+      </w:r>
+    </w:p>
+    <w:p>
+      <w:pPr>
+        <w:pStyle w:val="NormalWeb"/>
+        <w:numPr>
+          <w:ilvl w:val="0"/>
+          <w:numId w:val="36"/>
+        </w:numPr>
+        <w:rPr>
+          <w:rFonts w:ascii="Aptos" w:hAnsi="Aptos"/>
+        </w:rPr>
+      </w:pPr>
+      <w:r>
+        <w:rPr>
+          <w:rFonts w:ascii="Aptos" w:hAnsi="Aptos"/>
+          <w:b/>
+          <w:bCs/>
+        </w:rPr>
+        <w:t>Under the Hood (Logic - Deterministic Hashing):</w:t>
+      </w:r>
+      <w:r>
+        <w:rPr>
+          <w:rFonts w:ascii="Aptos" w:hAnsi="Aptos"/>
+        </w:rPr>
+        <w:t xml:space="preserve"> To simulate persistent hardware states without building complex new database tables, a custom string-hashing algorithm was engineered. The function takes the string name of the location (e.g., "Construction Runoff"), converts its characters into ASCII values, and processes them through bitwise operations. This guarantees that "Construction Runoff" will calculate the </w:t>
+      </w:r>
+      <w:r>
+        <w:rPr>
+          <w:rFonts w:ascii="Aptos" w:hAnsi="Aptos"/>
+          <w:i/>
+          <w:iCs/>
+        </w:rPr>
+        <w:t>exact same</w:t>
+      </w:r>
+      <w:r>
+        <w:rPr>
+          <w:rFonts w:ascii="Aptos" w:hAnsi="Aptos"/>
+        </w:rPr>
+        <w:t xml:space="preserve"> battery percentage (e.g., 84%) on every single page render, creating a stable, reliable simulation of hardware degradation.</w:t>
+      </w:r>
+    </w:p>
+    <w:p>
+      <w:pPr>
+        <w:pStyle w:val="NormalWeb"/>
+        <w:rPr>
+          <w:rFonts w:ascii="Aptos" w:hAnsi="Aptos"/>
+          <w:b/>
+          <w:bCs/>
+        </w:rPr>
+      </w:pPr>
+      <w:r>
+        <w:rPr>
+          <w:rFonts w:ascii="Aptos" w:hAnsi="Aptos"/>
+          <w:b/>
+          <w:bCs/>
+        </w:rPr>
+        <w:lastRenderedPageBreak/>
+        <w:t>5. Global State Slicer &amp; UI Synchronization</w:t>
+      </w:r>
+    </w:p>
+    <w:p>
+      <w:pPr>
+        <w:pStyle w:val="NormalWeb"/>
+        <w:numPr>
+          <w:ilvl w:val="0"/>
+          <w:numId w:val="37"/>
+        </w:numPr>
+        <w:rPr>
+          <w:rFonts w:ascii="Aptos" w:hAnsi="Aptos"/>
+        </w:rPr>
+      </w:pPr>
+      <w:r>
+        <w:rPr>
+          <w:rFonts w:ascii="Aptos" w:hAnsi="Aptos"/>
+          <w:b/>
+          <w:bCs/>
+        </w:rPr>
+        <w:t>Feature:</w:t>
+      </w:r>
+      <w:r>
+        <w:rPr>
+          <w:rFonts w:ascii="Aptos" w:hAnsi="Aptos"/>
+        </w:rPr>
+        <w:t xml:space="preserve"> A master dropdown filter that instantly isolates a specific sensor location.</w:t>
+      </w:r>
+    </w:p>
+    <w:p>
+      <w:pPr>
+        <w:pStyle w:val="NormalWeb"/>
+        <w:numPr>
+          <w:ilvl w:val="0"/>
+          <w:numId w:val="37"/>
+        </w:numPr>
+        <w:rPr>
+          <w:rFonts w:ascii="Aptos" w:hAnsi="Aptos"/>
+        </w:rPr>
+      </w:pPr>
+      <w:r>
+        <w:rPr>
+          <w:rFonts w:ascii="Aptos" w:hAnsi="Aptos"/>
+          <w:b/>
+          <w:bCs/>
+        </w:rPr>
+        <w:t>Under the Hood (Logic):</w:t>
+      </w:r>
+      <w:r>
+        <w:rPr>
+          <w:rFonts w:ascii="Aptos" w:hAnsi="Aptos"/>
+        </w:rPr>
+        <w:t xml:space="preserve"> This implements advanced React "Derived State" patterns. The raw PostgreSQL database fetch is stored in memory. When the user changes the dropdown, an </w:t>
+      </w:r>
+      <w:proofErr w:type="spellStart"/>
+      <w:r>
+        <w:rPr>
+          <w:rFonts w:ascii="Aptos" w:hAnsi="Aptos"/>
+        </w:rPr>
+        <w:t>Array.filter</w:t>
+      </w:r>
+      <w:proofErr w:type="spellEnd"/>
+      <w:r>
+        <w:rPr>
+          <w:rFonts w:ascii="Aptos" w:hAnsi="Aptos"/>
+        </w:rPr>
+        <w:t>() creates a new subset of data. The Top KPI Cards, the Recharts Area Chart, the Digital Twin, and the Intelligence Log table are all strictly bound to this derived array. This ensures 100% data synchronization across all UI components simultaneously without needing to make redundant API calls to the backend.</w:t>
+      </w:r>
+    </w:p>
+    <w:p>
+      <w:pPr>
+        <w:pStyle w:val="NormalWeb"/>
+        <w:numPr>
+          <w:ilvl w:val="1"/>
+          <w:numId w:val="37"/>
+        </w:numPr>
+        <w:rPr>
+          <w:rFonts w:ascii="Aptos" w:hAnsi="Aptos"/>
+        </w:rPr>
+      </w:pPr>
+      <w:r>
+        <w:rPr>
+          <w:rFonts w:ascii="Aptos" w:hAnsi="Aptos"/>
+          <w:i/>
+          <w:iCs/>
+        </w:rPr>
+        <w:t>Edge Case Mitigation:</w:t>
+      </w:r>
+      <w:r>
+        <w:rPr>
+          <w:rFonts w:ascii="Aptos" w:hAnsi="Aptos"/>
+        </w:rPr>
+        <w:t xml:space="preserve"> If a location only has a single database entry, a "Frontend Padding" algorithm dynamically clones the data point in memory. This provides the Area Chart with the required two points to render a flat trendline, without writing false data to the permanent database.</w:t>
+      </w:r>
+    </w:p>
+    <w:p>
+      <w:pPr>
+        <w:pStyle w:val="NormalWeb"/>
+        <w:rPr>
+          <w:rFonts w:ascii="Aptos" w:hAnsi="Aptos"/>
+          <w:b/>
+          <w:bCs/>
+        </w:rPr>
+      </w:pPr>
+      <w:r>
+        <w:rPr>
+          <w:rFonts w:ascii="Aptos" w:hAnsi="Aptos"/>
+          <w:b/>
+          <w:bCs/>
+        </w:rPr>
+        <w:t xml:space="preserve">6. </w:t>
+      </w:r>
+      <w:proofErr w:type="spellStart"/>
+      <w:r>
+        <w:rPr>
+          <w:rFonts w:ascii="Aptos" w:hAnsi="Aptos"/>
+          <w:b/>
+          <w:bCs/>
+        </w:rPr>
+        <w:t>Timezone</w:t>
+      </w:r>
+      <w:proofErr w:type="spellEnd"/>
+      <w:r>
+        <w:rPr>
+          <w:rFonts w:ascii="Aptos" w:hAnsi="Aptos"/>
+          <w:b/>
+          <w:bCs/>
+        </w:rPr>
+        <w:t xml:space="preserve"> Offset &amp; Data Integrity Protocols</w:t>
+      </w:r>
+    </w:p>
+    <w:p>
+      <w:pPr>
+        <w:pStyle w:val="NormalWeb"/>
+        <w:numPr>
+          <w:ilvl w:val="0"/>
+          <w:numId w:val="38"/>
+        </w:numPr>
+        <w:rPr>
+          <w:rFonts w:ascii="Aptos" w:hAnsi="Aptos"/>
+        </w:rPr>
+      </w:pPr>
+      <w:r>
+        <w:rPr>
+          <w:rFonts w:ascii="Aptos" w:hAnsi="Aptos"/>
+          <w:b/>
+          <w:bCs/>
+        </w:rPr>
+        <w:t>Feature:</w:t>
+      </w:r>
+      <w:r>
+        <w:rPr>
+          <w:rFonts w:ascii="Aptos" w:hAnsi="Aptos"/>
+        </w:rPr>
+        <w:t xml:space="preserve"> Perfect synchronization between the user's local clock, the React frontend, and the Java/PostgreSQL backend timestamps.</w:t>
+      </w:r>
+    </w:p>
+    <w:p>
+      <w:pPr>
+        <w:pStyle w:val="NormalWeb"/>
+        <w:numPr>
+          <w:ilvl w:val="0"/>
+          <w:numId w:val="38"/>
+        </w:numPr>
+        <w:rPr>
+          <w:rFonts w:ascii="Aptos" w:hAnsi="Aptos"/>
+        </w:rPr>
+      </w:pPr>
+      <w:r>
+        <w:rPr>
+          <w:rFonts w:ascii="Aptos" w:hAnsi="Aptos"/>
+          <w:b/>
+          <w:bCs/>
+        </w:rPr>
+        <w:t>Under the Hood (Logic):</w:t>
+      </w:r>
+      <w:r>
+        <w:rPr>
+          <w:rFonts w:ascii="Aptos" w:hAnsi="Aptos"/>
+        </w:rPr>
+        <w:t xml:space="preserve"> Standard </w:t>
+      </w:r>
+      <w:proofErr w:type="gramStart"/>
+      <w:r>
+        <w:rPr>
+          <w:rFonts w:ascii="Aptos" w:hAnsi="Aptos"/>
+        </w:rPr>
+        <w:t>JavaScript .</w:t>
+      </w:r>
+      <w:proofErr w:type="spellStart"/>
+      <w:r>
+        <w:rPr>
+          <w:rFonts w:ascii="Aptos" w:hAnsi="Aptos"/>
+        </w:rPr>
+        <w:t>toISOString</w:t>
+      </w:r>
+      <w:proofErr w:type="spellEnd"/>
+      <w:proofErr w:type="gramEnd"/>
+      <w:r>
+        <w:rPr>
+          <w:rFonts w:ascii="Aptos" w:hAnsi="Aptos"/>
+        </w:rPr>
+        <w:t xml:space="preserve">() functions force local time into Universal Coordinated Time (UTC), causing a 5.5-hour drift when saved to the database. The dispatch payload logic was re-engineered to actively calculate the user's local </w:t>
+      </w:r>
+      <w:proofErr w:type="spellStart"/>
+      <w:proofErr w:type="gramStart"/>
+      <w:r>
+        <w:rPr>
+          <w:rFonts w:ascii="Aptos" w:hAnsi="Aptos"/>
+        </w:rPr>
+        <w:t>getTimezoneOffset</w:t>
+      </w:r>
+      <w:proofErr w:type="spellEnd"/>
+      <w:r>
+        <w:rPr>
+          <w:rFonts w:ascii="Aptos" w:hAnsi="Aptos"/>
+        </w:rPr>
+        <w:t>(</w:t>
+      </w:r>
+      <w:proofErr w:type="gramEnd"/>
+      <w:r>
+        <w:rPr>
+          <w:rFonts w:ascii="Aptos" w:hAnsi="Aptos"/>
+        </w:rPr>
+        <w:t>), subtract the difference, and enforce the exact local time string before executing the POST/PUT HTTP requests. Furthermore, AI threat labels were standardized strictly to "ANOMALY" to ensure older alert-filtering logic remained unbroken.</w:t>
+      </w:r>
+    </w:p>
+    <w:p>
+      <w:pPr>
+        <w:pStyle w:val="NormalWeb"/>
+        <w:rPr>
+          <w:rFonts w:ascii="Aptos" w:hAnsi="Aptos"/>
         </w:rPr>
       </w:pPr>
     </w:p>
@@ -11630,6 +12370,304 @@
     </w:lvl>
   </w:abstractNum>
   <w:abstractNum w:abstractNumId="18" w15:restartNumberingAfterBreak="0">
+    <w:nsid w:val="3EB15C8A"/>
+    <w:multiLevelType w:val="multilevel"/>
+    <w:tmpl w:val="E16EE49A"/>
+    <w:lvl w:ilvl="0">
+      <w:start w:val="1"/>
+      <w:numFmt w:val="bullet"/>
+      <w:lvlText w:val=""/>
+      <w:lvlJc w:val="left"/>
+      <w:pPr>
+        <w:tabs>
+          <w:tab w:val="num" w:pos="720"/>
+        </w:tabs>
+        <w:ind w:left="720" w:hanging="360"/>
+      </w:pPr>
+      <w:rPr>
+        <w:rFonts w:ascii="Symbol" w:hAnsi="Symbol" w:hint="default"/>
+        <w:sz w:val="20"/>
+      </w:rPr>
+    </w:lvl>
+    <w:lvl w:ilvl="1" w:tentative="1">
+      <w:start w:val="1"/>
+      <w:numFmt w:val="bullet"/>
+      <w:lvlText w:val="o"/>
+      <w:lvlJc w:val="left"/>
+      <w:pPr>
+        <w:tabs>
+          <w:tab w:val="num" w:pos="1440"/>
+        </w:tabs>
+        <w:ind w:left="1440" w:hanging="360"/>
+      </w:pPr>
+      <w:rPr>
+        <w:rFonts w:ascii="Courier New" w:hAnsi="Courier New" w:hint="default"/>
+        <w:sz w:val="20"/>
+      </w:rPr>
+    </w:lvl>
+    <w:lvl w:ilvl="2" w:tentative="1">
+      <w:start w:val="1"/>
+      <w:numFmt w:val="bullet"/>
+      <w:lvlText w:val=""/>
+      <w:lvlJc w:val="left"/>
+      <w:pPr>
+        <w:tabs>
+          <w:tab w:val="num" w:pos="2160"/>
+        </w:tabs>
+        <w:ind w:left="2160" w:hanging="360"/>
+      </w:pPr>
+      <w:rPr>
+        <w:rFonts w:ascii="Wingdings" w:hAnsi="Wingdings" w:hint="default"/>
+        <w:sz w:val="20"/>
+      </w:rPr>
+    </w:lvl>
+    <w:lvl w:ilvl="3" w:tentative="1">
+      <w:start w:val="1"/>
+      <w:numFmt w:val="bullet"/>
+      <w:lvlText w:val=""/>
+      <w:lvlJc w:val="left"/>
+      <w:pPr>
+        <w:tabs>
+          <w:tab w:val="num" w:pos="2880"/>
+        </w:tabs>
+        <w:ind w:left="2880" w:hanging="360"/>
+      </w:pPr>
+      <w:rPr>
+        <w:rFonts w:ascii="Wingdings" w:hAnsi="Wingdings" w:hint="default"/>
+        <w:sz w:val="20"/>
+      </w:rPr>
+    </w:lvl>
+    <w:lvl w:ilvl="4" w:tentative="1">
+      <w:start w:val="1"/>
+      <w:numFmt w:val="bullet"/>
+      <w:lvlText w:val=""/>
+      <w:lvlJc w:val="left"/>
+      <w:pPr>
+        <w:tabs>
+          <w:tab w:val="num" w:pos="3600"/>
+        </w:tabs>
+        <w:ind w:left="3600" w:hanging="360"/>
+      </w:pPr>
+      <w:rPr>
+        <w:rFonts w:ascii="Wingdings" w:hAnsi="Wingdings" w:hint="default"/>
+        <w:sz w:val="20"/>
+      </w:rPr>
+    </w:lvl>
+    <w:lvl w:ilvl="5" w:tentative="1">
+      <w:start w:val="1"/>
+      <w:numFmt w:val="bullet"/>
+      <w:lvlText w:val=""/>
+      <w:lvlJc w:val="left"/>
+      <w:pPr>
+        <w:tabs>
+          <w:tab w:val="num" w:pos="4320"/>
+        </w:tabs>
+        <w:ind w:left="4320" w:hanging="360"/>
+      </w:pPr>
+      <w:rPr>
+        <w:rFonts w:ascii="Wingdings" w:hAnsi="Wingdings" w:hint="default"/>
+        <w:sz w:val="20"/>
+      </w:rPr>
+    </w:lvl>
+    <w:lvl w:ilvl="6" w:tentative="1">
+      <w:start w:val="1"/>
+      <w:numFmt w:val="bullet"/>
+      <w:lvlText w:val=""/>
+      <w:lvlJc w:val="left"/>
+      <w:pPr>
+        <w:tabs>
+          <w:tab w:val="num" w:pos="5040"/>
+        </w:tabs>
+        <w:ind w:left="5040" w:hanging="360"/>
+      </w:pPr>
+      <w:rPr>
+        <w:rFonts w:ascii="Wingdings" w:hAnsi="Wingdings" w:hint="default"/>
+        <w:sz w:val="20"/>
+      </w:rPr>
+    </w:lvl>
+    <w:lvl w:ilvl="7" w:tentative="1">
+      <w:start w:val="1"/>
+      <w:numFmt w:val="bullet"/>
+      <w:lvlText w:val=""/>
+      <w:lvlJc w:val="left"/>
+      <w:pPr>
+        <w:tabs>
+          <w:tab w:val="num" w:pos="5760"/>
+        </w:tabs>
+        <w:ind w:left="5760" w:hanging="360"/>
+      </w:pPr>
+      <w:rPr>
+        <w:rFonts w:ascii="Wingdings" w:hAnsi="Wingdings" w:hint="default"/>
+        <w:sz w:val="20"/>
+      </w:rPr>
+    </w:lvl>
+    <w:lvl w:ilvl="8" w:tentative="1">
+      <w:start w:val="1"/>
+      <w:numFmt w:val="bullet"/>
+      <w:lvlText w:val=""/>
+      <w:lvlJc w:val="left"/>
+      <w:pPr>
+        <w:tabs>
+          <w:tab w:val="num" w:pos="6480"/>
+        </w:tabs>
+        <w:ind w:left="6480" w:hanging="360"/>
+      </w:pPr>
+      <w:rPr>
+        <w:rFonts w:ascii="Wingdings" w:hAnsi="Wingdings" w:hint="default"/>
+        <w:sz w:val="20"/>
+      </w:rPr>
+    </w:lvl>
+  </w:abstractNum>
+  <w:abstractNum w:abstractNumId="19" w15:restartNumberingAfterBreak="0">
+    <w:nsid w:val="3FA55C86"/>
+    <w:multiLevelType w:val="multilevel"/>
+    <w:tmpl w:val="6FEAED50"/>
+    <w:lvl w:ilvl="0">
+      <w:start w:val="1"/>
+      <w:numFmt w:val="bullet"/>
+      <w:lvlText w:val=""/>
+      <w:lvlJc w:val="left"/>
+      <w:pPr>
+        <w:tabs>
+          <w:tab w:val="num" w:pos="720"/>
+        </w:tabs>
+        <w:ind w:left="720" w:hanging="360"/>
+      </w:pPr>
+      <w:rPr>
+        <w:rFonts w:ascii="Symbol" w:hAnsi="Symbol" w:hint="default"/>
+        <w:sz w:val="20"/>
+      </w:rPr>
+    </w:lvl>
+    <w:lvl w:ilvl="1">
+      <w:start w:val="1"/>
+      <w:numFmt w:val="bullet"/>
+      <w:lvlText w:val="o"/>
+      <w:lvlJc w:val="left"/>
+      <w:pPr>
+        <w:tabs>
+          <w:tab w:val="num" w:pos="1440"/>
+        </w:tabs>
+        <w:ind w:left="1440" w:hanging="360"/>
+      </w:pPr>
+      <w:rPr>
+        <w:rFonts w:ascii="Courier New" w:hAnsi="Courier New" w:hint="default"/>
+        <w:sz w:val="20"/>
+      </w:rPr>
+    </w:lvl>
+    <w:lvl w:ilvl="2" w:tentative="1">
+      <w:start w:val="1"/>
+      <w:numFmt w:val="bullet"/>
+      <w:lvlText w:val=""/>
+      <w:lvlJc w:val="left"/>
+      <w:pPr>
+        <w:tabs>
+          <w:tab w:val="num" w:pos="2160"/>
+        </w:tabs>
+        <w:ind w:left="2160" w:hanging="360"/>
+      </w:pPr>
+      <w:rPr>
+        <w:rFonts w:ascii="Wingdings" w:hAnsi="Wingdings" w:hint="default"/>
+        <w:sz w:val="20"/>
+      </w:rPr>
+    </w:lvl>
+    <w:lvl w:ilvl="3" w:tentative="1">
+      <w:start w:val="1"/>
+      <w:numFmt w:val="bullet"/>
+      <w:lvlText w:val=""/>
+      <w:lvlJc w:val="left"/>
+      <w:pPr>
+        <w:tabs>
+          <w:tab w:val="num" w:pos="2880"/>
+        </w:tabs>
+        <w:ind w:left="2880" w:hanging="360"/>
+      </w:pPr>
+      <w:rPr>
+        <w:rFonts w:ascii="Wingdings" w:hAnsi="Wingdings" w:hint="default"/>
+        <w:sz w:val="20"/>
+      </w:rPr>
+    </w:lvl>
+    <w:lvl w:ilvl="4" w:tentative="1">
+      <w:start w:val="1"/>
+      <w:numFmt w:val="bullet"/>
+      <w:lvlText w:val=""/>
+      <w:lvlJc w:val="left"/>
+      <w:pPr>
+        <w:tabs>
+          <w:tab w:val="num" w:pos="3600"/>
+        </w:tabs>
+        <w:ind w:left="3600" w:hanging="360"/>
+      </w:pPr>
+      <w:rPr>
+        <w:rFonts w:ascii="Wingdings" w:hAnsi="Wingdings" w:hint="default"/>
+        <w:sz w:val="20"/>
+      </w:rPr>
+    </w:lvl>
+    <w:lvl w:ilvl="5" w:tentative="1">
+      <w:start w:val="1"/>
+      <w:numFmt w:val="bullet"/>
+      <w:lvlText w:val=""/>
+      <w:lvlJc w:val="left"/>
+      <w:pPr>
+        <w:tabs>
+          <w:tab w:val="num" w:pos="4320"/>
+        </w:tabs>
+        <w:ind w:left="4320" w:hanging="360"/>
+      </w:pPr>
+      <w:rPr>
+        <w:rFonts w:ascii="Wingdings" w:hAnsi="Wingdings" w:hint="default"/>
+        <w:sz w:val="20"/>
+      </w:rPr>
+    </w:lvl>
+    <w:lvl w:ilvl="6" w:tentative="1">
+      <w:start w:val="1"/>
+      <w:numFmt w:val="bullet"/>
+      <w:lvlText w:val=""/>
+      <w:lvlJc w:val="left"/>
+      <w:pPr>
+        <w:tabs>
+          <w:tab w:val="num" w:pos="5040"/>
+        </w:tabs>
+        <w:ind w:left="5040" w:hanging="360"/>
+      </w:pPr>
+      <w:rPr>
+        <w:rFonts w:ascii="Wingdings" w:hAnsi="Wingdings" w:hint="default"/>
+        <w:sz w:val="20"/>
+      </w:rPr>
+    </w:lvl>
+    <w:lvl w:ilvl="7" w:tentative="1">
+      <w:start w:val="1"/>
+      <w:numFmt w:val="bullet"/>
+      <w:lvlText w:val=""/>
+      <w:lvlJc w:val="left"/>
+      <w:pPr>
+        <w:tabs>
+          <w:tab w:val="num" w:pos="5760"/>
+        </w:tabs>
+        <w:ind w:left="5760" w:hanging="360"/>
+      </w:pPr>
+      <w:rPr>
+        <w:rFonts w:ascii="Wingdings" w:hAnsi="Wingdings" w:hint="default"/>
+        <w:sz w:val="20"/>
+      </w:rPr>
+    </w:lvl>
+    <w:lvl w:ilvl="8" w:tentative="1">
+      <w:start w:val="1"/>
+      <w:numFmt w:val="bullet"/>
+      <w:lvlText w:val=""/>
+      <w:lvlJc w:val="left"/>
+      <w:pPr>
+        <w:tabs>
+          <w:tab w:val="num" w:pos="6480"/>
+        </w:tabs>
+        <w:ind w:left="6480" w:hanging="360"/>
+      </w:pPr>
+      <w:rPr>
+        <w:rFonts w:ascii="Wingdings" w:hAnsi="Wingdings" w:hint="default"/>
+        <w:sz w:val="20"/>
+      </w:rPr>
+    </w:lvl>
+  </w:abstractNum>
+  <w:abstractNum w:abstractNumId="20" w15:restartNumberingAfterBreak="0">
     <w:nsid w:val="46631489"/>
     <w:multiLevelType w:val="multilevel"/>
     <w:tmpl w:val="F16ECABE"/>
@@ -11778,7 +12816,7 @@
       </w:rPr>
     </w:lvl>
   </w:abstractNum>
-  <w:abstractNum w:abstractNumId="19" w15:restartNumberingAfterBreak="0">
+  <w:abstractNum w:abstractNumId="21" w15:restartNumberingAfterBreak="0">
     <w:nsid w:val="467819F7"/>
     <w:multiLevelType w:val="multilevel"/>
     <w:tmpl w:val="99340086"/>
@@ -11891,7 +12929,7 @@
       </w:pPr>
     </w:lvl>
   </w:abstractNum>
-  <w:abstractNum w:abstractNumId="20" w15:restartNumberingAfterBreak="0">
+  <w:abstractNum w:abstractNumId="22" w15:restartNumberingAfterBreak="0">
     <w:nsid w:val="478A29B5"/>
     <w:multiLevelType w:val="multilevel"/>
     <w:tmpl w:val="72362076"/>
@@ -12004,7 +13042,7 @@
       </w:pPr>
     </w:lvl>
   </w:abstractNum>
-  <w:abstractNum w:abstractNumId="21" w15:restartNumberingAfterBreak="0">
+  <w:abstractNum w:abstractNumId="23" w15:restartNumberingAfterBreak="0">
     <w:nsid w:val="49950FAF"/>
     <w:multiLevelType w:val="multilevel"/>
     <w:tmpl w:val="DDEC31FE"/>
@@ -12153,7 +13191,7 @@
       </w:rPr>
     </w:lvl>
   </w:abstractNum>
-  <w:abstractNum w:abstractNumId="22" w15:restartNumberingAfterBreak="0">
+  <w:abstractNum w:abstractNumId="24" w15:restartNumberingAfterBreak="0">
     <w:nsid w:val="4A1719BD"/>
     <w:multiLevelType w:val="multilevel"/>
     <w:tmpl w:val="2F007E20"/>
@@ -12266,7 +13304,7 @@
       </w:pPr>
     </w:lvl>
   </w:abstractNum>
-  <w:abstractNum w:abstractNumId="23" w15:restartNumberingAfterBreak="0">
+  <w:abstractNum w:abstractNumId="25" w15:restartNumberingAfterBreak="0">
     <w:nsid w:val="4AB13DA4"/>
     <w:multiLevelType w:val="multilevel"/>
     <w:tmpl w:val="0FA69454"/>
@@ -12415,7 +13453,7 @@
       </w:rPr>
     </w:lvl>
   </w:abstractNum>
-  <w:abstractNum w:abstractNumId="24" w15:restartNumberingAfterBreak="0">
+  <w:abstractNum w:abstractNumId="26" w15:restartNumberingAfterBreak="0">
     <w:nsid w:val="4E0B3438"/>
     <w:multiLevelType w:val="multilevel"/>
     <w:tmpl w:val="04E2C06E"/>
@@ -12564,7 +13602,7 @@
       </w:rPr>
     </w:lvl>
   </w:abstractNum>
-  <w:abstractNum w:abstractNumId="25" w15:restartNumberingAfterBreak="0">
+  <w:abstractNum w:abstractNumId="27" w15:restartNumberingAfterBreak="0">
     <w:nsid w:val="50465396"/>
     <w:multiLevelType w:val="multilevel"/>
     <w:tmpl w:val="BB02C032"/>
@@ -12677,7 +13715,7 @@
       </w:pPr>
     </w:lvl>
   </w:abstractNum>
-  <w:abstractNum w:abstractNumId="26" w15:restartNumberingAfterBreak="0">
+  <w:abstractNum w:abstractNumId="28" w15:restartNumberingAfterBreak="0">
     <w:nsid w:val="58E76910"/>
     <w:multiLevelType w:val="multilevel"/>
     <w:tmpl w:val="96D4D970"/>
@@ -12826,7 +13864,7 @@
       </w:rPr>
     </w:lvl>
   </w:abstractNum>
-  <w:abstractNum w:abstractNumId="27" w15:restartNumberingAfterBreak="0">
+  <w:abstractNum w:abstractNumId="29" w15:restartNumberingAfterBreak="0">
     <w:nsid w:val="5B1463D8"/>
     <w:multiLevelType w:val="multilevel"/>
     <w:tmpl w:val="3E9443AE"/>
@@ -12975,7 +14013,7 @@
       </w:rPr>
     </w:lvl>
   </w:abstractNum>
-  <w:abstractNum w:abstractNumId="28" w15:restartNumberingAfterBreak="0">
+  <w:abstractNum w:abstractNumId="30" w15:restartNumberingAfterBreak="0">
     <w:nsid w:val="65025CAA"/>
     <w:multiLevelType w:val="multilevel"/>
     <w:tmpl w:val="4964E1AA"/>
@@ -13124,7 +14162,7 @@
       </w:rPr>
     </w:lvl>
   </w:abstractNum>
-  <w:abstractNum w:abstractNumId="29" w15:restartNumberingAfterBreak="0">
+  <w:abstractNum w:abstractNumId="31" w15:restartNumberingAfterBreak="0">
     <w:nsid w:val="66841DAA"/>
     <w:multiLevelType w:val="multilevel"/>
     <w:tmpl w:val="546C3614"/>
@@ -13273,7 +14311,156 @@
       </w:rPr>
     </w:lvl>
   </w:abstractNum>
-  <w:abstractNum w:abstractNumId="30" w15:restartNumberingAfterBreak="0">
+  <w:abstractNum w:abstractNumId="32" w15:restartNumberingAfterBreak="0">
+    <w:nsid w:val="67FD3361"/>
+    <w:multiLevelType w:val="multilevel"/>
+    <w:tmpl w:val="BE08E866"/>
+    <w:lvl w:ilvl="0">
+      <w:start w:val="1"/>
+      <w:numFmt w:val="bullet"/>
+      <w:lvlText w:val=""/>
+      <w:lvlJc w:val="left"/>
+      <w:pPr>
+        <w:tabs>
+          <w:tab w:val="num" w:pos="720"/>
+        </w:tabs>
+        <w:ind w:left="720" w:hanging="360"/>
+      </w:pPr>
+      <w:rPr>
+        <w:rFonts w:ascii="Symbol" w:hAnsi="Symbol" w:hint="default"/>
+        <w:sz w:val="20"/>
+      </w:rPr>
+    </w:lvl>
+    <w:lvl w:ilvl="1" w:tentative="1">
+      <w:start w:val="1"/>
+      <w:numFmt w:val="bullet"/>
+      <w:lvlText w:val="o"/>
+      <w:lvlJc w:val="left"/>
+      <w:pPr>
+        <w:tabs>
+          <w:tab w:val="num" w:pos="1440"/>
+        </w:tabs>
+        <w:ind w:left="1440" w:hanging="360"/>
+      </w:pPr>
+      <w:rPr>
+        <w:rFonts w:ascii="Courier New" w:hAnsi="Courier New" w:hint="default"/>
+        <w:sz w:val="20"/>
+      </w:rPr>
+    </w:lvl>
+    <w:lvl w:ilvl="2" w:tentative="1">
+      <w:start w:val="1"/>
+      <w:numFmt w:val="bullet"/>
+      <w:lvlText w:val=""/>
+      <w:lvlJc w:val="left"/>
+      <w:pPr>
+        <w:tabs>
+          <w:tab w:val="num" w:pos="2160"/>
+        </w:tabs>
+        <w:ind w:left="2160" w:hanging="360"/>
+      </w:pPr>
+      <w:rPr>
+        <w:rFonts w:ascii="Wingdings" w:hAnsi="Wingdings" w:hint="default"/>
+        <w:sz w:val="20"/>
+      </w:rPr>
+    </w:lvl>
+    <w:lvl w:ilvl="3" w:tentative="1">
+      <w:start w:val="1"/>
+      <w:numFmt w:val="bullet"/>
+      <w:lvlText w:val=""/>
+      <w:lvlJc w:val="left"/>
+      <w:pPr>
+        <w:tabs>
+          <w:tab w:val="num" w:pos="2880"/>
+        </w:tabs>
+        <w:ind w:left="2880" w:hanging="360"/>
+      </w:pPr>
+      <w:rPr>
+        <w:rFonts w:ascii="Wingdings" w:hAnsi="Wingdings" w:hint="default"/>
+        <w:sz w:val="20"/>
+      </w:rPr>
+    </w:lvl>
+    <w:lvl w:ilvl="4" w:tentative="1">
+      <w:start w:val="1"/>
+      <w:numFmt w:val="bullet"/>
+      <w:lvlText w:val=""/>
+      <w:lvlJc w:val="left"/>
+      <w:pPr>
+        <w:tabs>
+          <w:tab w:val="num" w:pos="3600"/>
+        </w:tabs>
+        <w:ind w:left="3600" w:hanging="360"/>
+      </w:pPr>
+      <w:rPr>
+        <w:rFonts w:ascii="Wingdings" w:hAnsi="Wingdings" w:hint="default"/>
+        <w:sz w:val="20"/>
+      </w:rPr>
+    </w:lvl>
+    <w:lvl w:ilvl="5" w:tentative="1">
+      <w:start w:val="1"/>
+      <w:numFmt w:val="bullet"/>
+      <w:lvlText w:val=""/>
+      <w:lvlJc w:val="left"/>
+      <w:pPr>
+        <w:tabs>
+          <w:tab w:val="num" w:pos="4320"/>
+        </w:tabs>
+        <w:ind w:left="4320" w:hanging="360"/>
+      </w:pPr>
+      <w:rPr>
+        <w:rFonts w:ascii="Wingdings" w:hAnsi="Wingdings" w:hint="default"/>
+        <w:sz w:val="20"/>
+      </w:rPr>
+    </w:lvl>
+    <w:lvl w:ilvl="6" w:tentative="1">
+      <w:start w:val="1"/>
+      <w:numFmt w:val="bullet"/>
+      <w:lvlText w:val=""/>
+      <w:lvlJc w:val="left"/>
+      <w:pPr>
+        <w:tabs>
+          <w:tab w:val="num" w:pos="5040"/>
+        </w:tabs>
+        <w:ind w:left="5040" w:hanging="360"/>
+      </w:pPr>
+      <w:rPr>
+        <w:rFonts w:ascii="Wingdings" w:hAnsi="Wingdings" w:hint="default"/>
+        <w:sz w:val="20"/>
+      </w:rPr>
+    </w:lvl>
+    <w:lvl w:ilvl="7" w:tentative="1">
+      <w:start w:val="1"/>
+      <w:numFmt w:val="bullet"/>
+      <w:lvlText w:val=""/>
+      <w:lvlJc w:val="left"/>
+      <w:pPr>
+        <w:tabs>
+          <w:tab w:val="num" w:pos="5760"/>
+        </w:tabs>
+        <w:ind w:left="5760" w:hanging="360"/>
+      </w:pPr>
+      <w:rPr>
+        <w:rFonts w:ascii="Wingdings" w:hAnsi="Wingdings" w:hint="default"/>
+        <w:sz w:val="20"/>
+      </w:rPr>
+    </w:lvl>
+    <w:lvl w:ilvl="8" w:tentative="1">
+      <w:start w:val="1"/>
+      <w:numFmt w:val="bullet"/>
+      <w:lvlText w:val=""/>
+      <w:lvlJc w:val="left"/>
+      <w:pPr>
+        <w:tabs>
+          <w:tab w:val="num" w:pos="6480"/>
+        </w:tabs>
+        <w:ind w:left="6480" w:hanging="360"/>
+      </w:pPr>
+      <w:rPr>
+        <w:rFonts w:ascii="Wingdings" w:hAnsi="Wingdings" w:hint="default"/>
+        <w:sz w:val="20"/>
+      </w:rPr>
+    </w:lvl>
+  </w:abstractNum>
+  <w:abstractNum w:abstractNumId="33" w15:restartNumberingAfterBreak="0">
     <w:nsid w:val="6FE62A81"/>
     <w:multiLevelType w:val="multilevel"/>
     <w:tmpl w:val="B8AE6C00"/>
@@ -13386,10 +14573,457 @@
       </w:pPr>
     </w:lvl>
   </w:abstractNum>
-  <w:abstractNum w:abstractNumId="31" w15:restartNumberingAfterBreak="0">
+  <w:abstractNum w:abstractNumId="34" w15:restartNumberingAfterBreak="0">
+    <w:nsid w:val="70583D99"/>
+    <w:multiLevelType w:val="multilevel"/>
+    <w:tmpl w:val="8ED02912"/>
+    <w:lvl w:ilvl="0">
+      <w:start w:val="1"/>
+      <w:numFmt w:val="bullet"/>
+      <w:lvlText w:val=""/>
+      <w:lvlJc w:val="left"/>
+      <w:pPr>
+        <w:tabs>
+          <w:tab w:val="num" w:pos="720"/>
+        </w:tabs>
+        <w:ind w:left="720" w:hanging="360"/>
+      </w:pPr>
+      <w:rPr>
+        <w:rFonts w:ascii="Symbol" w:hAnsi="Symbol" w:hint="default"/>
+        <w:sz w:val="20"/>
+      </w:rPr>
+    </w:lvl>
+    <w:lvl w:ilvl="1" w:tentative="1">
+      <w:start w:val="1"/>
+      <w:numFmt w:val="bullet"/>
+      <w:lvlText w:val="o"/>
+      <w:lvlJc w:val="left"/>
+      <w:pPr>
+        <w:tabs>
+          <w:tab w:val="num" w:pos="1440"/>
+        </w:tabs>
+        <w:ind w:left="1440" w:hanging="360"/>
+      </w:pPr>
+      <w:rPr>
+        <w:rFonts w:ascii="Courier New" w:hAnsi="Courier New" w:hint="default"/>
+        <w:sz w:val="20"/>
+      </w:rPr>
+    </w:lvl>
+    <w:lvl w:ilvl="2" w:tentative="1">
+      <w:start w:val="1"/>
+      <w:numFmt w:val="bullet"/>
+      <w:lvlText w:val=""/>
+      <w:lvlJc w:val="left"/>
+      <w:pPr>
+        <w:tabs>
+          <w:tab w:val="num" w:pos="2160"/>
+        </w:tabs>
+        <w:ind w:left="2160" w:hanging="360"/>
+      </w:pPr>
+      <w:rPr>
+        <w:rFonts w:ascii="Wingdings" w:hAnsi="Wingdings" w:hint="default"/>
+        <w:sz w:val="20"/>
+      </w:rPr>
+    </w:lvl>
+    <w:lvl w:ilvl="3" w:tentative="1">
+      <w:start w:val="1"/>
+      <w:numFmt w:val="bullet"/>
+      <w:lvlText w:val=""/>
+      <w:lvlJc w:val="left"/>
+      <w:pPr>
+        <w:tabs>
+          <w:tab w:val="num" w:pos="2880"/>
+        </w:tabs>
+        <w:ind w:left="2880" w:hanging="360"/>
+      </w:pPr>
+      <w:rPr>
+        <w:rFonts w:ascii="Wingdings" w:hAnsi="Wingdings" w:hint="default"/>
+        <w:sz w:val="20"/>
+      </w:rPr>
+    </w:lvl>
+    <w:lvl w:ilvl="4" w:tentative="1">
+      <w:start w:val="1"/>
+      <w:numFmt w:val="bullet"/>
+      <w:lvlText w:val=""/>
+      <w:lvlJc w:val="left"/>
+      <w:pPr>
+        <w:tabs>
+          <w:tab w:val="num" w:pos="3600"/>
+        </w:tabs>
+        <w:ind w:left="3600" w:hanging="360"/>
+      </w:pPr>
+      <w:rPr>
+        <w:rFonts w:ascii="Wingdings" w:hAnsi="Wingdings" w:hint="default"/>
+        <w:sz w:val="20"/>
+      </w:rPr>
+    </w:lvl>
+    <w:lvl w:ilvl="5" w:tentative="1">
+      <w:start w:val="1"/>
+      <w:numFmt w:val="bullet"/>
+      <w:lvlText w:val=""/>
+      <w:lvlJc w:val="left"/>
+      <w:pPr>
+        <w:tabs>
+          <w:tab w:val="num" w:pos="4320"/>
+        </w:tabs>
+        <w:ind w:left="4320" w:hanging="360"/>
+      </w:pPr>
+      <w:rPr>
+        <w:rFonts w:ascii="Wingdings" w:hAnsi="Wingdings" w:hint="default"/>
+        <w:sz w:val="20"/>
+      </w:rPr>
+    </w:lvl>
+    <w:lvl w:ilvl="6" w:tentative="1">
+      <w:start w:val="1"/>
+      <w:numFmt w:val="bullet"/>
+      <w:lvlText w:val=""/>
+      <w:lvlJc w:val="left"/>
+      <w:pPr>
+        <w:tabs>
+          <w:tab w:val="num" w:pos="5040"/>
+        </w:tabs>
+        <w:ind w:left="5040" w:hanging="360"/>
+      </w:pPr>
+      <w:rPr>
+        <w:rFonts w:ascii="Wingdings" w:hAnsi="Wingdings" w:hint="default"/>
+        <w:sz w:val="20"/>
+      </w:rPr>
+    </w:lvl>
+    <w:lvl w:ilvl="7" w:tentative="1">
+      <w:start w:val="1"/>
+      <w:numFmt w:val="bullet"/>
+      <w:lvlText w:val=""/>
+      <w:lvlJc w:val="left"/>
+      <w:pPr>
+        <w:tabs>
+          <w:tab w:val="num" w:pos="5760"/>
+        </w:tabs>
+        <w:ind w:left="5760" w:hanging="360"/>
+      </w:pPr>
+      <w:rPr>
+        <w:rFonts w:ascii="Wingdings" w:hAnsi="Wingdings" w:hint="default"/>
+        <w:sz w:val="20"/>
+      </w:rPr>
+    </w:lvl>
+    <w:lvl w:ilvl="8" w:tentative="1">
+      <w:start w:val="1"/>
+      <w:numFmt w:val="bullet"/>
+      <w:lvlText w:val=""/>
+      <w:lvlJc w:val="left"/>
+      <w:pPr>
+        <w:tabs>
+          <w:tab w:val="num" w:pos="6480"/>
+        </w:tabs>
+        <w:ind w:left="6480" w:hanging="360"/>
+      </w:pPr>
+      <w:rPr>
+        <w:rFonts w:ascii="Wingdings" w:hAnsi="Wingdings" w:hint="default"/>
+        <w:sz w:val="20"/>
+      </w:rPr>
+    </w:lvl>
+  </w:abstractNum>
+  <w:abstractNum w:abstractNumId="35" w15:restartNumberingAfterBreak="0">
     <w:nsid w:val="72AA35BF"/>
     <w:multiLevelType w:val="multilevel"/>
     <w:tmpl w:val="5C965086"/>
+    <w:lvl w:ilvl="0">
+      <w:start w:val="1"/>
+      <w:numFmt w:val="bullet"/>
+      <w:lvlText w:val=""/>
+      <w:lvlJc w:val="left"/>
+      <w:pPr>
+        <w:tabs>
+          <w:tab w:val="num" w:pos="720"/>
+        </w:tabs>
+        <w:ind w:left="720" w:hanging="360"/>
+      </w:pPr>
+      <w:rPr>
+        <w:rFonts w:ascii="Symbol" w:hAnsi="Symbol" w:hint="default"/>
+        <w:sz w:val="20"/>
+      </w:rPr>
+    </w:lvl>
+    <w:lvl w:ilvl="1" w:tentative="1">
+      <w:start w:val="1"/>
+      <w:numFmt w:val="bullet"/>
+      <w:lvlText w:val="o"/>
+      <w:lvlJc w:val="left"/>
+      <w:pPr>
+        <w:tabs>
+          <w:tab w:val="num" w:pos="1440"/>
+        </w:tabs>
+        <w:ind w:left="1440" w:hanging="360"/>
+      </w:pPr>
+      <w:rPr>
+        <w:rFonts w:ascii="Courier New" w:hAnsi="Courier New" w:hint="default"/>
+        <w:sz w:val="20"/>
+      </w:rPr>
+    </w:lvl>
+    <w:lvl w:ilvl="2" w:tentative="1">
+      <w:start w:val="1"/>
+      <w:numFmt w:val="bullet"/>
+      <w:lvlText w:val=""/>
+      <w:lvlJc w:val="left"/>
+      <w:pPr>
+        <w:tabs>
+          <w:tab w:val="num" w:pos="2160"/>
+        </w:tabs>
+        <w:ind w:left="2160" w:hanging="360"/>
+      </w:pPr>
+      <w:rPr>
+        <w:rFonts w:ascii="Wingdings" w:hAnsi="Wingdings" w:hint="default"/>
+        <w:sz w:val="20"/>
+      </w:rPr>
+    </w:lvl>
+    <w:lvl w:ilvl="3" w:tentative="1">
+      <w:start w:val="1"/>
+      <w:numFmt w:val="bullet"/>
+      <w:lvlText w:val=""/>
+      <w:lvlJc w:val="left"/>
+      <w:pPr>
+        <w:tabs>
+          <w:tab w:val="num" w:pos="2880"/>
+        </w:tabs>
+        <w:ind w:left="2880" w:hanging="360"/>
+      </w:pPr>
+      <w:rPr>
+        <w:rFonts w:ascii="Wingdings" w:hAnsi="Wingdings" w:hint="default"/>
+        <w:sz w:val="20"/>
+      </w:rPr>
+    </w:lvl>
+    <w:lvl w:ilvl="4" w:tentative="1">
+      <w:start w:val="1"/>
+      <w:numFmt w:val="bullet"/>
+      <w:lvlText w:val=""/>
+      <w:lvlJc w:val="left"/>
+      <w:pPr>
+        <w:tabs>
+          <w:tab w:val="num" w:pos="3600"/>
+        </w:tabs>
+        <w:ind w:left="3600" w:hanging="360"/>
+      </w:pPr>
+      <w:rPr>
+        <w:rFonts w:ascii="Wingdings" w:hAnsi="Wingdings" w:hint="default"/>
+        <w:sz w:val="20"/>
+      </w:rPr>
+    </w:lvl>
+    <w:lvl w:ilvl="5" w:tentative="1">
+      <w:start w:val="1"/>
+      <w:numFmt w:val="bullet"/>
+      <w:lvlText w:val=""/>
+      <w:lvlJc w:val="left"/>
+      <w:pPr>
+        <w:tabs>
+          <w:tab w:val="num" w:pos="4320"/>
+        </w:tabs>
+        <w:ind w:left="4320" w:hanging="360"/>
+      </w:pPr>
+      <w:rPr>
+        <w:rFonts w:ascii="Wingdings" w:hAnsi="Wingdings" w:hint="default"/>
+        <w:sz w:val="20"/>
+      </w:rPr>
+    </w:lvl>
+    <w:lvl w:ilvl="6" w:tentative="1">
+      <w:start w:val="1"/>
+      <w:numFmt w:val="bullet"/>
+      <w:lvlText w:val=""/>
+      <w:lvlJc w:val="left"/>
+      <w:pPr>
+        <w:tabs>
+          <w:tab w:val="num" w:pos="5040"/>
+        </w:tabs>
+        <w:ind w:left="5040" w:hanging="360"/>
+      </w:pPr>
+      <w:rPr>
+        <w:rFonts w:ascii="Wingdings" w:hAnsi="Wingdings" w:hint="default"/>
+        <w:sz w:val="20"/>
+      </w:rPr>
+    </w:lvl>
+    <w:lvl w:ilvl="7" w:tentative="1">
+      <w:start w:val="1"/>
+      <w:numFmt w:val="bullet"/>
+      <w:lvlText w:val=""/>
+      <w:lvlJc w:val="left"/>
+      <w:pPr>
+        <w:tabs>
+          <w:tab w:val="num" w:pos="5760"/>
+        </w:tabs>
+        <w:ind w:left="5760" w:hanging="360"/>
+      </w:pPr>
+      <w:rPr>
+        <w:rFonts w:ascii="Wingdings" w:hAnsi="Wingdings" w:hint="default"/>
+        <w:sz w:val="20"/>
+      </w:rPr>
+    </w:lvl>
+    <w:lvl w:ilvl="8" w:tentative="1">
+      <w:start w:val="1"/>
+      <w:numFmt w:val="bullet"/>
+      <w:lvlText w:val=""/>
+      <w:lvlJc w:val="left"/>
+      <w:pPr>
+        <w:tabs>
+          <w:tab w:val="num" w:pos="6480"/>
+        </w:tabs>
+        <w:ind w:left="6480" w:hanging="360"/>
+      </w:pPr>
+      <w:rPr>
+        <w:rFonts w:ascii="Wingdings" w:hAnsi="Wingdings" w:hint="default"/>
+        <w:sz w:val="20"/>
+      </w:rPr>
+    </w:lvl>
+  </w:abstractNum>
+  <w:abstractNum w:abstractNumId="36" w15:restartNumberingAfterBreak="0">
+    <w:nsid w:val="768B77BF"/>
+    <w:multiLevelType w:val="multilevel"/>
+    <w:tmpl w:val="6DC0D75A"/>
+    <w:lvl w:ilvl="0">
+      <w:start w:val="1"/>
+      <w:numFmt w:val="bullet"/>
+      <w:lvlText w:val=""/>
+      <w:lvlJc w:val="left"/>
+      <w:pPr>
+        <w:tabs>
+          <w:tab w:val="num" w:pos="720"/>
+        </w:tabs>
+        <w:ind w:left="720" w:hanging="360"/>
+      </w:pPr>
+      <w:rPr>
+        <w:rFonts w:ascii="Symbol" w:hAnsi="Symbol" w:hint="default"/>
+        <w:sz w:val="20"/>
+      </w:rPr>
+    </w:lvl>
+    <w:lvl w:ilvl="1">
+      <w:start w:val="1"/>
+      <w:numFmt w:val="bullet"/>
+      <w:lvlText w:val="o"/>
+      <w:lvlJc w:val="left"/>
+      <w:pPr>
+        <w:tabs>
+          <w:tab w:val="num" w:pos="1440"/>
+        </w:tabs>
+        <w:ind w:left="1440" w:hanging="360"/>
+      </w:pPr>
+      <w:rPr>
+        <w:rFonts w:ascii="Courier New" w:hAnsi="Courier New" w:hint="default"/>
+        <w:sz w:val="20"/>
+      </w:rPr>
+    </w:lvl>
+    <w:lvl w:ilvl="2" w:tentative="1">
+      <w:start w:val="1"/>
+      <w:numFmt w:val="bullet"/>
+      <w:lvlText w:val=""/>
+      <w:lvlJc w:val="left"/>
+      <w:pPr>
+        <w:tabs>
+          <w:tab w:val="num" w:pos="2160"/>
+        </w:tabs>
+        <w:ind w:left="2160" w:hanging="360"/>
+      </w:pPr>
+      <w:rPr>
+        <w:rFonts w:ascii="Wingdings" w:hAnsi="Wingdings" w:hint="default"/>
+        <w:sz w:val="20"/>
+      </w:rPr>
+    </w:lvl>
+    <w:lvl w:ilvl="3" w:tentative="1">
+      <w:start w:val="1"/>
+      <w:numFmt w:val="bullet"/>
+      <w:lvlText w:val=""/>
+      <w:lvlJc w:val="left"/>
+      <w:pPr>
+        <w:tabs>
+          <w:tab w:val="num" w:pos="2880"/>
+        </w:tabs>
+        <w:ind w:left="2880" w:hanging="360"/>
+      </w:pPr>
+      <w:rPr>
+        <w:rFonts w:ascii="Wingdings" w:hAnsi="Wingdings" w:hint="default"/>
+        <w:sz w:val="20"/>
+      </w:rPr>
+    </w:lvl>
+    <w:lvl w:ilvl="4" w:tentative="1">
+      <w:start w:val="1"/>
+      <w:numFmt w:val="bullet"/>
+      <w:lvlText w:val=""/>
+      <w:lvlJc w:val="left"/>
+      <w:pPr>
+        <w:tabs>
+          <w:tab w:val="num" w:pos="3600"/>
+        </w:tabs>
+        <w:ind w:left="3600" w:hanging="360"/>
+      </w:pPr>
+      <w:rPr>
+        <w:rFonts w:ascii="Wingdings" w:hAnsi="Wingdings" w:hint="default"/>
+        <w:sz w:val="20"/>
+      </w:rPr>
+    </w:lvl>
+    <w:lvl w:ilvl="5" w:tentative="1">
+      <w:start w:val="1"/>
+      <w:numFmt w:val="bullet"/>
+      <w:lvlText w:val=""/>
+      <w:lvlJc w:val="left"/>
+      <w:pPr>
+        <w:tabs>
+          <w:tab w:val="num" w:pos="4320"/>
+        </w:tabs>
+        <w:ind w:left="4320" w:hanging="360"/>
+      </w:pPr>
+      <w:rPr>
+        <w:rFonts w:ascii="Wingdings" w:hAnsi="Wingdings" w:hint="default"/>
+        <w:sz w:val="20"/>
+      </w:rPr>
+    </w:lvl>
+    <w:lvl w:ilvl="6" w:tentative="1">
+      <w:start w:val="1"/>
+      <w:numFmt w:val="bullet"/>
+      <w:lvlText w:val=""/>
+      <w:lvlJc w:val="left"/>
+      <w:pPr>
+        <w:tabs>
+          <w:tab w:val="num" w:pos="5040"/>
+        </w:tabs>
+        <w:ind w:left="5040" w:hanging="360"/>
+      </w:pPr>
+      <w:rPr>
+        <w:rFonts w:ascii="Wingdings" w:hAnsi="Wingdings" w:hint="default"/>
+        <w:sz w:val="20"/>
+      </w:rPr>
+    </w:lvl>
+    <w:lvl w:ilvl="7" w:tentative="1">
+      <w:start w:val="1"/>
+      <w:numFmt w:val="bullet"/>
+      <w:lvlText w:val=""/>
+      <w:lvlJc w:val="left"/>
+      <w:pPr>
+        <w:tabs>
+          <w:tab w:val="num" w:pos="5760"/>
+        </w:tabs>
+        <w:ind w:left="5760" w:hanging="360"/>
+      </w:pPr>
+      <w:rPr>
+        <w:rFonts w:ascii="Wingdings" w:hAnsi="Wingdings" w:hint="default"/>
+        <w:sz w:val="20"/>
+      </w:rPr>
+    </w:lvl>
+    <w:lvl w:ilvl="8" w:tentative="1">
+      <w:start w:val="1"/>
+      <w:numFmt w:val="bullet"/>
+      <w:lvlText w:val=""/>
+      <w:lvlJc w:val="left"/>
+      <w:pPr>
+        <w:tabs>
+          <w:tab w:val="num" w:pos="6480"/>
+        </w:tabs>
+        <w:ind w:left="6480" w:hanging="360"/>
+      </w:pPr>
+      <w:rPr>
+        <w:rFonts w:ascii="Wingdings" w:hAnsi="Wingdings" w:hint="default"/>
+        <w:sz w:val="20"/>
+      </w:rPr>
+    </w:lvl>
+  </w:abstractNum>
+  <w:abstractNum w:abstractNumId="37" w15:restartNumberingAfterBreak="0">
+    <w:nsid w:val="7DBD12D9"/>
+    <w:multiLevelType w:val="multilevel"/>
+    <w:tmpl w:val="A8289DD0"/>
     <w:lvl w:ilvl="0">
       <w:start w:val="1"/>
       <w:numFmt w:val="bullet"/>
@@ -13542,19 +15176,19 @@
     <w:abstractNumId w:val="4"/>
   </w:num>
   <w:num w:numId="3" w16cid:durableId="1608192328">
-    <w:abstractNumId w:val="24"/>
+    <w:abstractNumId w:val="26"/>
   </w:num>
   <w:num w:numId="4" w16cid:durableId="1639069128">
-    <w:abstractNumId w:val="23"/>
+    <w:abstractNumId w:val="25"/>
   </w:num>
   <w:num w:numId="5" w16cid:durableId="1048797234">
     <w:abstractNumId w:val="3"/>
   </w:num>
   <w:num w:numId="6" w16cid:durableId="93021018">
-    <w:abstractNumId w:val="29"/>
+    <w:abstractNumId w:val="31"/>
   </w:num>
   <w:num w:numId="7" w16cid:durableId="1104881592">
-    <w:abstractNumId w:val="19"/>
+    <w:abstractNumId w:val="21"/>
   </w:num>
   <w:num w:numId="8" w16cid:durableId="384303804">
     <w:abstractNumId w:val="6"/>
@@ -13572,22 +15206,22 @@
     <w:abstractNumId w:val="14"/>
   </w:num>
   <w:num w:numId="13" w16cid:durableId="516045932">
-    <w:abstractNumId w:val="21"/>
+    <w:abstractNumId w:val="23"/>
   </w:num>
   <w:num w:numId="14" w16cid:durableId="1040476145">
     <w:abstractNumId w:val="17"/>
   </w:num>
   <w:num w:numId="15" w16cid:durableId="1228688926">
-    <w:abstractNumId w:val="18"/>
+    <w:abstractNumId w:val="20"/>
   </w:num>
   <w:num w:numId="16" w16cid:durableId="1881165064">
     <w:abstractNumId w:val="9"/>
   </w:num>
   <w:num w:numId="17" w16cid:durableId="1856462126">
-    <w:abstractNumId w:val="30"/>
+    <w:abstractNumId w:val="33"/>
   </w:num>
   <w:num w:numId="18" w16cid:durableId="2003119084">
-    <w:abstractNumId w:val="28"/>
+    <w:abstractNumId w:val="30"/>
   </w:num>
   <w:num w:numId="19" w16cid:durableId="2035107415">
     <w:abstractNumId w:val="13"/>
@@ -13605,31 +15239,49 @@
     <w:abstractNumId w:val="0"/>
   </w:num>
   <w:num w:numId="24" w16cid:durableId="403340664">
-    <w:abstractNumId w:val="26"/>
+    <w:abstractNumId w:val="28"/>
   </w:num>
   <w:num w:numId="25" w16cid:durableId="1688671282">
     <w:abstractNumId w:val="10"/>
   </w:num>
   <w:num w:numId="26" w16cid:durableId="1380322845">
-    <w:abstractNumId w:val="31"/>
+    <w:abstractNumId w:val="35"/>
   </w:num>
   <w:num w:numId="27" w16cid:durableId="1266645919">
-    <w:abstractNumId w:val="20"/>
+    <w:abstractNumId w:val="22"/>
   </w:num>
   <w:num w:numId="28" w16cid:durableId="2069067946">
-    <w:abstractNumId w:val="27"/>
+    <w:abstractNumId w:val="29"/>
   </w:num>
   <w:num w:numId="29" w16cid:durableId="1784492303">
     <w:abstractNumId w:val="12"/>
   </w:num>
   <w:num w:numId="30" w16cid:durableId="1474979399">
-    <w:abstractNumId w:val="25"/>
+    <w:abstractNumId w:val="27"/>
   </w:num>
   <w:num w:numId="31" w16cid:durableId="443623990">
-    <w:abstractNumId w:val="22"/>
+    <w:abstractNumId w:val="24"/>
   </w:num>
   <w:num w:numId="32" w16cid:durableId="1330324495">
     <w:abstractNumId w:val="2"/>
+  </w:num>
+  <w:num w:numId="33" w16cid:durableId="1522360055">
+    <w:abstractNumId w:val="37"/>
+  </w:num>
+  <w:num w:numId="34" w16cid:durableId="94640338">
+    <w:abstractNumId w:val="34"/>
+  </w:num>
+  <w:num w:numId="35" w16cid:durableId="379205706">
+    <w:abstractNumId w:val="36"/>
+  </w:num>
+  <w:num w:numId="36" w16cid:durableId="1008285891">
+    <w:abstractNumId w:val="18"/>
+  </w:num>
+  <w:num w:numId="37" w16cid:durableId="1651785557">
+    <w:abstractNumId w:val="19"/>
+  </w:num>
+  <w:num w:numId="38" w16cid:durableId="248537717">
+    <w:abstractNumId w:val="32"/>
   </w:num>
 </w:numbering>
 </file>

</xml_diff>